<commit_message>
Reviewed reports: Dublin (all sections), Berkeley and Cork (Environment)
24 Dublin errors fixed (5 by code, 19 by review) plus 5 more found; 9 in
Berkeley Environment; 2 form defects in Cork Environment. Word/PDF/HTML
re-rendered without the LLM; 45/45 sampled figures still match the CSV.
Corrections were proposed by Claude Code and are to be validated by Wiem.
</commit_message>
<xml_diff>
--- a/outputs/berkeley/rapport_berkeley.docx
+++ b/outputs/berkeley/rapport_berkeley.docx
@@ -18,7 +18,7 @@
         <w:rPr>
           <w:i/>
         </w:rPr>
-        <w:t>Établi en référence aux normes GRI · généré le 2026-10-05 · données AASHE STARS 3.0</w:t>
+        <w:t>Établi en référence aux normes GRI · généré le 2026-10-06 · données AASHE STARS 3.0</w:t>
       </w:r>
     </w:p>
     <w:p>
@@ -2202,22 +2202,6 @@
     </w:p>
     <w:p>
       <w:pPr>
-        <w:pStyle w:val="Heading2"/>
-      </w:pPr>
-      <w:r>
-        <w:rPr>
-          <w:color w:val="2F6F5E"/>
-        </w:rPr>
-        <w:t>Limites et omissions</w:t>
-      </w:r>
-    </w:p>
-    <w:p>
-      <w:r>
-        <w:t>Ce rapport ne couvre pas les informations sur les fournisseurs de l'université, les groupes vulnérables ou la méthode d'identification des parties prenantes.</w:t>
-      </w:r>
-    </w:p>
-    <w:p>
-      <w:pPr>
         <w:pStyle w:val="Heading1"/>
       </w:pPr>
       <w:r>
@@ -3108,7 +3092,7 @@
     </w:p>
     <w:p>
       <w:r>
-        <w:t>L'université obtient 6,87 points STARS sur 10 au crédit OP-5, niveau intermédiaire. Le campus utilise une partie de l'énergie renouvelable via le programme UC Clean Power, qui inclut des sources d'électricité certifiées et non certifiées.</w:t>
+        <w:t>L'université obtient 6,87 points STARS sur 10 au crédit OP-5, niveau intermédiaire. Une partie de l'électricité du campus provient du programme UC Clean Power : sa part solaire est déclarée comme électricité renouvelable hors site certifiée, et sa part de grande hydraulique comme électricité renouvelable hors site non certifiée.</w:t>
       </w:r>
     </w:p>
     <w:p>
@@ -3124,7 +3108,7 @@
     </w:p>
     <w:p>
       <w:r>
-        <w:t>L'université obtient 8,01 points STARS sur 16 au crédit OP-6, niveau intermédiaire. Les émissions de gaz à effet de serre sont compensées par des instruments de retraitement des émissions, issus de projets forestiers américains.</w:t>
+        <w:t>L'université obtient 8,01 points STARS sur 16 au crédit OP-6, niveau intermédiaire. Dans le cadre du programme Cap and Trade, des crédits de compensation sont répartis chaque année entre les campus selon leurs émissions ; cette année, les instruments de conformité retirés proviennent de projets forestiers aux États-Unis.</w:t>
       </w:r>
     </w:p>
     <w:p>
@@ -3156,7 +3140,7 @@
     </w:p>
     <w:p>
       <w:r>
-        <w:t>L'université obtient 3,27 points STARS sur 5 au crédit OP-12, niveau intermédiaire. Le campus a mis en place un système de compostage industriel.</w:t>
+        <w:t>L'université obtient 3,27 points STARS sur 5 au crédit OP-12, niveau intermédiaire.</w:t>
       </w:r>
     </w:p>
     <w:p>
@@ -3172,7 +3156,7 @@
     </w:p>
     <w:p>
       <w:r>
-        <w:t>L'université obtient 3,75 points STARS sur 4 au crédit OP-11, niveau élevé. Le campus a mis en place un système de gestion des matériaux, notamment via l'intégration de la collecte séparée des déchets.</w:t>
+        <w:t>L'université obtient 3,75 points STARS sur 4 au crédit OP-11, niveau élevé. Le compostage est intégré à tous les circuits de collecte du campus, et les déchets compostables sont envoyés vers une installation de compostage industriel.</w:t>
       </w:r>
     </w:p>
     <w:p>
@@ -3188,7 +3172,7 @@
     </w:p>
     <w:p>
       <w:r>
-        <w:t>L'université obtient 7 points STARS sur 7 au crédit OP-9, niveau maximal. Le campus a mis en place un système de réduction des émissions de carbone dans la chaîne d'approvisionnement.</w:t>
+        <w:t>L'université obtient 7 points STARS sur 7 au crédit OP-9, niveau maximal. Tous les appels d'offres intègrent des critères de durabilité ; l'université évalue ses fournisseurs avec EcoVadis, et ses lignes directrices d'achats durables visent notamment à réduire les émissions et les impacts carbone de la chaîne d'approvisionnement.</w:t>
       </w:r>
     </w:p>
     <w:p>
@@ -3204,7 +3188,7 @@
     </w:p>
     <w:p>
       <w:r>
-        <w:t>L'université obtient 2,91 points STARS sur 3 au crédit OP-1, niveau élevé. Le campus a mis en place des bâtiments répondant aux normes LEED-EBOM.</w:t>
+        <w:t>L'université obtient 2,91 points STARS sur 3 au crédit OP-1, niveau élevé.</w:t>
       </w:r>
     </w:p>
     <w:p>
@@ -3220,7 +3204,7 @@
     </w:p>
     <w:p>
       <w:r>
-        <w:t>L'université obtient 4 points STARS sur 5 au crédit OP-2, niveau élevé.</w:t>
+        <w:t>L'université obtient 4 points STARS sur 5 au crédit OP-2, niveau élevé. De nombreux bâtiments du campus respectent la norme LEED-EBOM (exploitation et maintenance des bâtiments existants), qui met l'accent sur le nettoyage écologique, les matériaux durables, la qualité de l'air et la réduction des déchets.</w:t>
       </w:r>
     </w:p>
     <w:p>
@@ -3236,7 +3220,7 @@
     </w:p>
     <w:p>
       <w:r>
-        <w:t>L'université obtient 0,28 point STARS sur 2 au crédit OP-13, niveau faible. Le campus a mis en place une flotte de véhicules, dont une partie est considérée comme verte.</w:t>
+        <w:t>L'université obtient 0,28 point STARS sur 2 au crédit OP-13, niveau faible. Plus de 35 % de la flotte du campus est considérée comme verte, véhicules à carburant modulable compris ; les voiturettes électriques non immatriculées ne sont pas comptées dans la flotte.</w:t>
       </w:r>
     </w:p>
     <w:p>
@@ -3252,7 +3236,7 @@
     </w:p>
     <w:p>
       <w:r>
-        <w:t>L'université obtient 4,89 points STARS sur 6 au crédit OP-14, niveau élevé. Le campus a mis en place des modes de déplacement durables.</w:t>
+        <w:t>L'université obtient 4,89 points STARS sur 6 au crédit OP-14, niveau élevé. La répartition des modes de déplacement provient d'une enquête annuelle sur les transports, diffusée par courriel à tout le campus ou à un échantillon représentatif.</w:t>
       </w:r>
     </w:p>
     <w:p>
@@ -3300,23 +3284,7 @@
     </w:p>
     <w:p>
       <w:r>
-        <w:t>L'université obtient 1 point STARS sur 1 au crédit IL-24, niveau maximal. Le campus a mis en place une évaluation de la biodiversité, notamment via le plan de gestion des feux de végétation.</w:t>
-      </w:r>
-    </w:p>
-    <w:p>
-      <w:pPr>
-        <w:pStyle w:val="Heading3"/>
-      </w:pPr>
-      <w:r>
-        <w:rPr>
-          <w:color w:val="2F6F5E"/>
-        </w:rPr>
-        <w:t>Pourcentage de la flotte de véhicules considérée comme verte</w:t>
-      </w:r>
-    </w:p>
-    <w:p>
-      <w:r>
-        <w:t>Le campus a mis en place une flotte de véhicules, dont plus de 35 % est considérée comme verte.</w:t>
+        <w:t>L'université obtient 1 point STARS sur 1 au crédit IL-24, niveau maximal. Le projet de rapport d'impact environnemental (Draft EIR) du plan de gestion de la végétation combustible des espaces naturels (Wildland Vegetative Fuel Management Plan) décrit les zones importantes pour la biodiversité.</w:t>
       </w:r>
     </w:p>
     <w:p>
@@ -18738,6 +18706,44 @@
     <w:p>
       <w:r>
         <w:t>2 violation(s) signalée(s) par le juge ont été écartées car contredites par le contrôle déterministe (par exemple une « revendication de conformité GRI » absente du texte) : le juge 8B se trompe parfois, le code tranche sur ce qu'il sait vérifier.</w:t>
+      </w:r>
+    </w:p>
+    <w:p>
+      <w:r>
+        <w:rPr>
+          <w:b/>
+        </w:rPr>
+        <w:t>Relecture hors pipeline</w:t>
+      </w:r>
+      <w:r>
+        <w:t xml:space="preserve"> (6 octobre 2026) : 11 correction(s) dans 1 section(s). Phrases supprimées ou reformulées à partir des textes STARS uniquement, sans chiffre tapé à la main. Les corrections ont été proposées par l'assistant Claude Code (IA) à la demande de Wiem Ben Hassine, chacune avec sa source STARS ; elles deviennent une relecture humaine une fois validées par elle. Liste détaillée : </w:t>
+      </w:r>
+      <w:r>
+        <w:rPr>
+          <w:rFonts w:ascii="Consolas" w:hAnsi="Consolas"/>
+        </w:rPr>
+        <w:t>relecture/berkeley.yaml</w:t>
+      </w:r>
+      <w:r>
+        <w:t xml:space="preserve"> et </w:t>
+      </w:r>
+      <w:r>
+        <w:rPr>
+          <w:rFonts w:ascii="Consolas" w:hAnsi="Consolas"/>
+        </w:rPr>
+        <w:t>outputs/relecture_humaine.md</w:t>
+      </w:r>
+      <w:r>
+        <w:t xml:space="preserve">. Le texte écrit par le modèle reste consultable dans </w:t>
+      </w:r>
+      <w:r>
+        <w:rPr>
+          <w:rFonts w:ascii="Consolas" w:hAnsi="Consolas"/>
+        </w:rPr>
+        <w:t>outputs/cache/</w:t>
+      </w:r>
+      <w:r>
+        <w:t>.</w:t>
       </w:r>
     </w:p>
     <w:p>

</xml_diff>

<commit_message>
Regenerated Cork Environment section and re-rendered reviewed reports
Cork Environment now has real text (third seed, judge 4/5) instead of a
list of scores, reviewed (4 errors). Word/PDF/HTML re-rendered without the
LLM; 45/45 sampled figures still match the CSV. BILAN_TESTS section 10.
</commit_message>
<xml_diff>
--- a/outputs/berkeley/rapport_berkeley.docx
+++ b/outputs/berkeley/rapport_berkeley.docx
@@ -783,12 +783,7 @@
     </w:p>
     <w:p>
       <w:r>
-        <w:t>L'université de Californie, Berkeley, est une institution universitaire située dans la ville de Berkeley, en Californie. Elle est membre de l'Université de Californie, qui regroupe plusieurs établissements dans le même périmètre d'activité.</w:t>
-      </w:r>
-    </w:p>
-    <w:p>
-      <w:r>
-        <w:t>Le périmètre d'activité de l'université de Californie, Berkeley, est défini en fonction de ses besoins opérationnels.</w:t>
+        <w:t>L'université de Californie, Berkeley, est une institution universitaire située dans la ville de Berkeley, en Californie. Elle fait partie du système de l'Université de Californie, dont le conseil des régents (Board of Regents) gouverne l'ensemble des campus.</w:t>
       </w:r>
     </w:p>
     <w:p>
@@ -812,16 +807,6 @@
       </w:r>
     </w:p>
     <w:p>
-      <w:r>
-        <w:t>(GRI 2-3)</w:t>
-      </w:r>
-    </w:p>
-    <w:p>
-      <w:r>
-        <w:t>(GRI 2-3)</w:t>
-      </w:r>
-    </w:p>
-    <w:p>
       <w:pPr>
         <w:pStyle w:val="Heading2"/>
       </w:pPr>
@@ -840,16 +825,6 @@
     <w:p>
       <w:r>
         <w:t>(GRI 2-1)</w:t>
-      </w:r>
-    </w:p>
-    <w:p>
-      <w:r>
-        <w:t>Ce rapport ne peut pas établir les entités incluses dans le périmètre d'activité de l'université de Californie, Berkeley, car les ratios par personne ou par m² ne sont pas comparables tels quels.</w:t>
-      </w:r>
-    </w:p>
-    <w:p>
-      <w:r>
-        <w:t>(GRI 2-2)</w:t>
       </w:r>
     </w:p>
     <w:p>
@@ -1051,12 +1026,12 @@
     </w:p>
     <w:p>
       <w:r>
-        <w:t>L'université a adopté un plan stratégique pour la durabilité qui inclut des objectifs mesurables, tels que l'expansion de l'accès et des opportunités de formation co-curriculaires et le développement de voies institutionnelles pour les clubs et les groupes étudiants pour accroître leur engagement intersectionnel avec le Centre de ressources environnementales (SERC). Le plan stratégique comprend également des objectifs stratégiques sous le but de renforcer les programmes et les ressources pour approfondir l'engagement dans la communauté de la durabilité.</w:t>
+        <w:t>Le Student Environmental Resource Center (SERC) de l'université a adopté un plan stratégique 2017-2022 qui inclut des objectifs mesurables, tels que l'expansion de l'accès et des opportunités de formation co-curriculaires et le développement de voies institutionnelles pour les clubs et les groupes étudiants pour accroître leur engagement intersectionnel avec le Centre de ressources environnementales (SERC). Le plan stratégique comprend également des objectifs stratégiques sous le but de renforcer les programmes et les ressources pour approfondir l'engagement dans la communauté de la durabilité.</w:t>
       </w:r>
     </w:p>
     <w:p>
       <w:r>
-        <w:t>L'université suit également la politique de pratiques durables du système UC, qui inclut des objectifs tels que la réduction des émissions de gaz à effet de serre de manière à atteindre un campus à zéro carbone.</w:t>
+        <w:t>L'université a aussi publié un plan de durabilité (Sustainability Plan), avec des objectifs pour l'énergie, l'eau, les déchets, l'alimentation durable et la biodiversité, et un plan d'action climat (Climate Action Plan). Elle suit la politique de pratiques durables (Sustainable Practices Policy) du système UC, qui demande à tous les sites UC de réduire toutes leurs émissions d'au moins 90 % d'ici 2045 et d'éliminer les émissions restantes par des crédits de captage et de stockage du carbone.</w:t>
       </w:r>
     </w:p>
     <w:p>
@@ -1380,12 +1355,12 @@
     </w:p>
     <w:p>
       <w:r>
-        <w:t>L'université de Californie à Berkeley a plusieurs officiers de durabilité dans le Bureau de la durabilité, la Haas et le SERC. L'université de Californie à Berkeley inclut des représentants étudiants dans son organe de décision le plus élevé, le conseil des régents de l'université de Californie. Bien que le conseil des régents gouverne l'ensemble du système de l'université de Californie et non seulement le campus de Berkeley, il exerce l'autorité ultime sur les politiques, les finances et la planification stratégique de l'université de Californie, y compris le campus de Berkeley.</w:t>
+        <w:t>L'université de Californie à Berkeley a plusieurs responsables de la durabilité (Sustainability Officers) au Bureau de la durabilité, à Haas et au SERC. L'université de Californie à Berkeley inclut des représentants étudiants dans son organe de décision le plus élevé, le conseil des régents de l'université de Californie. Bien que le conseil des régents gouverne l'ensemble du système de l'université de Californie et non seulement le campus de Berkeley, il exerce l'autorité ultime sur les politiques, les finances et la planification stratégique de l'université de Californie, y compris le campus de Berkeley.</w:t>
       </w:r>
     </w:p>
     <w:p>
       <w:r>
-        <w:t>L'université de Californie à Berkeley a plusieurs organes en cours qui permettent aux membres du personnel académique de participer à la gouvernance de l'institution. Le principal organe est la division de Berkeley de l'Académie de la durabilité, qui fait partie du Sénat académique de l'université de Californie. Ce Sénat fournit aux membres du personnel académique un moyen structuré et démocratique de participer à la gouvernance du campus et à la prise de décision.</w:t>
+        <w:t>L'université de Californie à Berkeley a plusieurs organes permanents qui permettent au personnel académique de participer à la gouvernance de l'institution. Le principal est la division de Berkeley du Sénat académique, qui fait partie du Sénat académique de l'ensemble du système de l'université de Californie. Ce Sénat fournit aux membres du personnel académique un moyen structuré et démocratique de participer à la gouvernance du campus et à la prise de décision.</w:t>
       </w:r>
     </w:p>
     <w:p>
@@ -1416,7 +1391,7 @@
     </w:p>
     <w:p>
       <w:r>
-        <w:t>Ce rapport ne peut pas établir la structure et la composition de la gouvernance de l'université de Californie à Berkeley, en particulier les catégories GRI 2-10 à GRI 2-21, qui ne sont pas couvertes par STARS.</w:t>
+        <w:t>Ce rapport ne peut pas établir la composition détaillée de l'organe de gouvernance (GRI 2-9), ni les publications GRI 2-10 à GRI 2-21, que STARS ne couvre pas ou seulement en partie (GRI 2-13 et GRI 2-14).</w:t>
       </w:r>
     </w:p>
     <w:p>
@@ -1796,7 +1771,7 @@
     </w:p>
     <w:p>
       <w:r>
-        <w:t>L'Université de Californie à Berkeley (UC Berkeley) a adopté une stratégie de développement durable qui vise à renforcer les programmes et les ressources pour approfondir l'engagement dans la communauté de la durabilité. Cette stratégie est définie dans le plan stratégique du Student Environmental Resource Center (SERC) qui inclut des objectifs mesurables tels que l'expansion des opportunités de formation co-curriculaire et le développement de voies institutionnelles pour les clubs et les groupes étudiants pour accroître l'engagement intersectionnel avec le SERC.</w:t>
+        <w:t>L'Université de Californie à Berkeley (UC Berkeley) a publié un plan de durabilité (Sustainability Plan) et un plan d'action climat (Climate Action Plan). Son centre étudiant, le Student Environmental Resource Center (SERC), a adopté un plan stratégique qui vise à renforcer les programmes et les ressources pour approfondir l'engagement dans la communauté de la durabilité, et qui inclut des objectifs mesurables tels que l'expansion des opportunités de formation co-curriculaire et le développement de voies institutionnelles pour les clubs et les groupes étudiants pour accroître l'engagement intersectionnel avec le SERC.</w:t>
       </w:r>
     </w:p>
     <w:p>
@@ -2166,12 +2141,12 @@
     </w:p>
     <w:p>
       <w:r>
-        <w:t>L'université a également établi des comités consultatifs pour la gouvernance, qui impliquent des membres de la communauté locale et des étudiants. Ces comités fournissent aux organisations communautaires un forum pour donner leur avis sur les politiques et les initiatives de l'université qui affectent la population locale.</w:t>
+        <w:t>Ces instances donnent aux organisations communautaires un forum pour donner leur avis sur les politiques et les initiatives de l'université qui touchent la population locale. Les étudiants sont représentés au CACS, où plusieurs organisations étudiantes et services ont chacun un siège et une voix, et le personnel non académique participe à la gouvernance par des comités consultatifs comme le Chancellor's Staff Advisory Committee (CSAC).</w:t>
       </w:r>
     </w:p>
     <w:p>
       <w:r>
-        <w:t>L'université a également mis en place des partenariats avec la communauté, tels que le programme College Corps, qui a permis à des étudiants de la faculté de participer à des partenariats communautaires dans le domaine de la justice climatique et alimentaire.</w:t>
+        <w:t>L'université a également mis en place des partenariats avec la communauté, tels que le programme College Corps, partenariat de l'État de Californie financé par California Volunteers, par lequel le Public Service Center a placé des étudiants de premier cycle dans des partenariats de justice climatique ou alimentaire avec des organisations locales.</w:t>
       </w:r>
     </w:p>
     <w:p>
@@ -3832,42 +3807,42 @@
     </w:p>
     <w:p>
       <w:r>
-        <w:t>L'université de Californie à Berkeley a obtenu 4,34 points STARS sur 5 au crédit PA-13, niveau élevé, pour sa politique de salaire décent. Le salaire minimum local est de 42,8 % de la valeur actuelle. L'heure de travail doit être au moins de 42,8 % de la valeur actuelle, en tenant compte du taux de bénéfices combinés des employés.</w:t>
+        <w:t>L'université de Californie à Berkeley a obtenu 4,34 points STARS sur 5 au crédit PA-13, niveau élevé, pour sa politique de salaire décent. Le salaire décent de référence est calculé avec le calculateur du Massachusetts Institute of Technology (MIT) ; le seuil horaire retenu pour le personnel tient compte du taux composite des avantages sociaux (CBR), actuellement de 42,8 %.</w:t>
       </w:r>
     </w:p>
     <w:p>
       <w:r>
-        <w:t>L'université a également obtenu 2,5 points STARS sur 3 au crédit PA-12, niveau élevé, pour ses droits des salariés. Les employés doivent satisfaire aux exigences de la politique de congé parental. Le site web des ressources humaines de l'université présente des politiques sur les droits des employés, notamment le traitement équitable, les procédures de réclamation et l'équilibre travail-vie.</w:t>
+        <w:t>L'université a également obtenu 2,5 points STARS sur 3 au crédit PA-12, niveau élevé, pour ses droits des salariés. Les employés doivent remplir les conditions de la politique de congé familial et médical (Family and Medical Leave Policy). Le site web des ressources humaines de l'université présente des politiques sur les droits des employés, notamment le traitement équitable, les procédures de réclamation et l'équilibre travail-vie.</w:t>
       </w:r>
     </w:p>
     <w:p>
       <w:r>
-        <w:t>L'université a obtenu 3 points STARS sur 3 au crédit PA-11, niveau maximal, pour sa santé, sécurité et bien-être. Le système de gestion de la santé et de la sécurité au travail n'est pas décrit.</w:t>
+        <w:t>L'université a obtenu 3 points STARS sur 3 au crédit PA-11, niveau maximal, pour sa santé, sécurité et bien-être. Le campus propose des ateliers de bien-être (série Mind-Body-Spirit) et applique une politique de campus sans fumée ni tabac, mise à jour par les services de santé universitaires (University Health Services).</w:t>
       </w:r>
     </w:p>
     <w:p>
       <w:r>
-        <w:t>L'université a obtenu 1,67 point STARS sur 2 au crédit PA-8, niveau élevé, pour la parité femmes-hommes. Le directeur de la diversité, de l'équité, de l'inclusion et de l'appartenance est Lasana Hotep.</w:t>
+        <w:t>L'université a obtenu 1,67 point STARS sur 2 au crédit PA-8, niveau élevé, pour la parité femmes-hommes.</w:t>
       </w:r>
     </w:p>
     <w:p>
       <w:r>
-        <w:t>L'université a obtenu 1,59 point STARS sur 3 au crédit PA-7, niveau intermédiaire, pour la représentation ethnique et raciale. Les initiatives de données sur l'équité sont menées par l'équipe de l'équité et de l'inclusion.</w:t>
+        <w:t>L'université a obtenu 1,59 point STARS sur 3 au crédit PA-7, niveau intermédiaire, pour la représentation ethnique et raciale.</w:t>
       </w:r>
     </w:p>
     <w:p>
       <w:r>
-        <w:t>L'université a obtenu 2,5 points STARS sur 3 au crédit PA-9, niveau élevé, pour l'accès et l'accessibilité financière. La proportion de tous les étudiants de premier cycle recevant des subventions Pell pour l'année universitaire 2021 est de 2021.</w:t>
+        <w:t>L'université a obtenu 2,5 points STARS sur 3 au crédit PA-9, niveau élevé, pour l'accès et l'accessibilité financière. Les données viennent de l'IPEDS : part des étudiants de premier cycle bénéficiant d'une bourse Pell, pour l'année universitaire débutant en 2021 (la plus récente disponible).</w:t>
       </w:r>
     </w:p>
     <w:p>
       <w:r>
-        <w:t>L'université a obtenu 3 points STARS sur 3 au crédit PA-6, niveau maximal, pour le climat institutionnel. Les organisations basées sur la race et l'éthnicité des employés comprennent Alianza, Asian Pacific American Systemwide Alliance, Black Staff &amp; Faculty Organization, MENASA et Native &amp; Indigenous Council.</w:t>
+        <w:t>L'université a obtenu 3 points STARS sur 3 au crédit PA-6, niveau maximal, pour le climat institutionnel. Les organisations basées sur la race et l'ethnicité des employés comprennent Alianza, Asian Pacific American Systemwide Alliance, Black Staff &amp; Faculty Organization, MENASA et Native &amp; Indigenous Council.</w:t>
       </w:r>
     </w:p>
     <w:p>
       <w:r>
-        <w:t>L'université a obtenu 2,8 points STARS sur 3 au crédit PA-10, niveau élevé, pour la réussite étudiante. Le directeur exécutif de l'Office of Planning and Analysis est Sereeta Alexander.</w:t>
+        <w:t>L'université a obtenu 2,8 points STARS sur 3 au crédit PA-10, niveau élevé, pour la réussite étudiante.</w:t>
       </w:r>
     </w:p>
     <w:p>
@@ -4567,12 +4542,12 @@
     </w:p>
     <w:p>
       <w:r>
-        <w:t>L'université obtient 10,22 points STARS sur 15 au crédit AC-2, niveau intermédiaire. Les programmes de premier cycle de l'Université de Californie à Berkeley incluent une exigence de cours axée sur la durabilité.</w:t>
+        <w:t>L'université obtient 10,22 points STARS sur 15 au crédit AC-2, niveau intermédiaire. Une partie des programmes de premier cycle comporte l'obligation de suivre au moins un cours axé sur la durabilité (liste fournie dans le rapport STARS).</w:t>
       </w:r>
     </w:p>
     <w:p>
       <w:r>
-        <w:t>L'université obtient 8 points STARS sur 8 au crédit AC-3, niveau maximal. Les programmes de cycles supérieurs de l'Université de Californie à Berkeley incluent des cours axés sur la durabilité.</w:t>
+        <w:t>L'université obtient 8 points STARS sur 8 au crédit AC-3, niveau maximal. Une partie des programmes de cycles supérieurs comporte un apprentissage axé sur la durabilité (liste fournie dans le rapport STARS).</w:t>
       </w:r>
     </w:p>
     <w:p>
@@ -4587,7 +4562,7 @@
     </w:p>
     <w:p>
       <w:r>
-        <w:t>L'université obtient 5 points STARS sur 5 au crédit EN-1, niveau maximal. L'Université de Californie à Berkeley a un centre de recherche en durabilité.</w:t>
+        <w:t>L'université obtient 5 points STARS sur 5 au crédit EN-1, niveau maximal. Les nouveaux étudiants rencontrent les services liés à la durabilité lors de l'orientation (Golden Bear Orientation), le nouveau personnel reçoit une présentation lors de son accueil, et le campus publie des tableaux de bord (émissions, énergie, eau) et des rapports de durabilité.</w:t>
       </w:r>
     </w:p>
     <w:p>
@@ -4597,7 +4572,7 @@
     </w:p>
     <w:p>
       <w:r>
-        <w:t>L'université obtient 8 points STARS sur 8 au crédit EN-3, niveau maximal. L'Office de la durabilité, le SERC, le gouvernement et les relations communautaires de l'Université de Californie à Berkeley.</w:t>
+        <w:t>L'université obtient 8 points STARS sur 8 au crédit EN-3, niveau maximal. Le Bureau de la durabilité a créé une formation à la durabilité pour le personnel (UC Berkeley Sustainability Staff Training), composée de modules que chacun suit à son rythme.</w:t>
       </w:r>
     </w:p>
     <w:p>
@@ -18716,7 +18691,7 @@
         <w:t>Relecture hors pipeline</w:t>
       </w:r>
       <w:r>
-        <w:t xml:space="preserve"> (6 octobre 2026) : 11 correction(s) dans 1 section(s). Phrases supprimées ou reformulées à partir des textes STARS uniquement, sans chiffre tapé à la main. Les corrections ont été proposées par l'assistant Claude Code (IA) à la demande de Wiem Ben Hassine, chacune avec sa source STARS ; elles deviennent une relecture humaine une fois validées par elle. Liste détaillée : </w:t>
+        <w:t xml:space="preserve"> (6 octobre 2026) : 35 correction(s) dans 8 section(s). Phrases supprimées ou reformulées à partir des textes STARS uniquement, sans chiffre tapé à la main. Les corrections ont été proposées par l'assistant Claude Code (IA) à la demande de Wiem Ben Hassine, chacune avec sa source STARS ; elles deviennent une relecture humaine une fois validées par elle. Liste détaillée : </w:t>
       </w:r>
       <w:r>
         <w:rPr>

</xml_diff>

<commit_message>
Re-render reports with the form fixes (no LLM run)
</commit_message>
<xml_diff>
--- a/outputs/berkeley/rapport_berkeley.docx
+++ b/outputs/berkeley/rapport_berkeley.docx
@@ -783,12 +783,12 @@
     </w:p>
     <w:p>
       <w:r>
-        <w:t>L'université de Californie, Berkeley, est une institution universitaire située dans la ville de Berkeley, en Californie. Elle fait partie du système de l'Université de Californie, dont le conseil des régents (Board of Regents) gouverne l'ensemble des campus.</w:t>
+        <w:t>University of California, Berkeley (UC Berkeley) est une institution universitaire située dans la ville de Berkeley, en Californie. Elle fait partie du système de l'Université de Californie, dont le conseil des régents (Board of Regents) gouverne l'ensemble des campus.</w:t>
       </w:r>
     </w:p>
     <w:p>
       <w:r>
-        <w:t>L'université de Californie, Berkeley, a déclaré que son périmètre d'activité est celui pour lequel elle conserve le contrôle opérationnel.</w:t>
+        <w:t>UC Berkeley a déclaré que son périmètre d'activité est celui pour lequel elle conserve le contrôle opérationnel.</w:t>
       </w:r>
     </w:p>
     <w:p>
@@ -798,7 +798,7 @@
     </w:p>
     <w:p>
       <w:r>
-        <w:t>L'université de Californie, Berkeley, a déclaré que son périmètre d'activité comprend les entités suivantes : le campus principal, le Hill campus, le Richmond Field Station et les réserves opérées par l'université.</w:t>
+        <w:t>UC Berkeley a déclaré que son périmètre d'activité comprend les entités suivantes : le campus principal, le Hill campus, le Richmond Field Station et les réserves opérées par l'université.</w:t>
       </w:r>
     </w:p>
     <w:p>
@@ -819,7 +819,7 @@
     </w:p>
     <w:p>
       <w:r>
-        <w:t>Ce rapport ne peut pas établir les détails sur la dénomination légale, le siège et les pays d'activité de l'université de Californie, Berkeley, car ces informations ne sont pas collectées par STARS.</w:t>
+        <w:t>Ce rapport ne peut pas établir les détails sur la dénomination légale, le siège et les pays d'activité de UC Berkeley, car ces informations ne sont pas collectées par STARS.</w:t>
       </w:r>
     </w:p>
     <w:p>
@@ -829,7 +829,7 @@
     </w:p>
     <w:p>
       <w:r>
-        <w:t>Ce rapport ne peut pas établir la période de reporting, la fréquence et le point de contact de l'université de Californie, Berkeley, car ces informations ne sont pas collectées par STARS.</w:t>
+        <w:t>Ce rapport ne peut pas établir la période de reporting, la fréquence et le point de contact de UC Berkeley, car ces informations ne sont pas collectées par STARS.</w:t>
       </w:r>
     </w:p>
     <w:p>
@@ -839,7 +839,7 @@
     </w:p>
     <w:p>
       <w:r>
-        <w:t>Ce rapport ne peut pas établir la vérification externe de l'université de Californie, Berkeley, car les informations sur la norme d'assurance, le niveau d'assurance et la relation avec le vérificateur ne sont pas collectées par STARS.</w:t>
+        <w:t>Ce rapport ne peut pas établir la vérification externe de UC Berkeley, car les informations sur la norme d'assurance, le niveau d'assurance et la relation avec le vérificateur ne sont pas collectées par STARS.</w:t>
       </w:r>
     </w:p>
     <w:p>
@@ -849,7 +849,7 @@
     </w:p>
     <w:p>
       <w:r>
-        <w:t>Ce rapport ne peut pas établir les activités, la chaîne de valeur et les relations d'affaires de l'université de Californie, Berkeley, car ces informations ne sont pas collectées par STARS.</w:t>
+        <w:t>Ce rapport ne peut pas établir les activités, la chaîne de valeur et les relations d'affaires de UC Berkeley, car ces informations ne sont pas collectées par STARS.</w:t>
       </w:r>
     </w:p>
     <w:p>
@@ -1355,27 +1355,27 @@
     </w:p>
     <w:p>
       <w:r>
-        <w:t>L'université de Californie à Berkeley a plusieurs responsables de la durabilité (Sustainability Officers) au Bureau de la durabilité, à Haas et au SERC. L'université de Californie à Berkeley inclut des représentants étudiants dans son organe de décision le plus élevé, le conseil des régents de l'université de Californie. Bien que le conseil des régents gouverne l'ensemble du système de l'université de Californie et non seulement le campus de Berkeley, il exerce l'autorité ultime sur les politiques, les finances et la planification stratégique de l'université de Californie, y compris le campus de Berkeley.</w:t>
+        <w:t>University of California, Berkeley (UC Berkeley) a plusieurs responsables de la durabilité (Sustainability Officers) au Bureau de la durabilité, à Haas et au SERC. UC Berkeley inclut des représentants étudiants dans son organe de décision le plus élevé, le conseil des régents de l'université de Californie. Bien que le conseil des régents gouverne l'ensemble du système de l'université de Californie et non seulement le campus de Berkeley, il exerce l'autorité ultime sur les politiques, les finances et la planification stratégique de l'université de Californie, y compris le campus de Berkeley.</w:t>
       </w:r>
     </w:p>
     <w:p>
       <w:r>
-        <w:t>L'université de Californie à Berkeley a plusieurs organes permanents qui permettent au personnel académique de participer à la gouvernance de l'institution. Le principal est la division de Berkeley du Sénat académique, qui fait partie du Sénat académique de l'ensemble du système de l'université de Californie. Ce Sénat fournit aux membres du personnel académique un moyen structuré et démocratique de participer à la gouvernance du campus et à la prise de décision.</w:t>
+        <w:t>UC Berkeley a plusieurs organes permanents qui permettent au personnel académique de participer à la gouvernance de l'institution. Le principal est la division de Berkeley du Sénat académique, qui fait partie du Sénat académique de l'ensemble du système de l'université de Californie. Ce Sénat fournit aux membres du personnel académique un moyen structuré et démocratique de participer à la gouvernance du campus et à la prise de décision.</w:t>
       </w:r>
     </w:p>
     <w:p>
       <w:r>
-        <w:t>L'université de Californie à Berkeley obtient 3,5 points STARS sur 4 au crédit PA-3, niveau élevé.</w:t>
+        <w:t>UC Berkeley obtient 3,5 points STARS sur 4 au crédit PA-3, niveau élevé.</w:t>
       </w:r>
     </w:p>
     <w:p>
       <w:r>
-        <w:t>L'université de Californie à Berkeley obtient 4 points STARS sur 4 au crédit PA-4, niveau maximal.</w:t>
+        <w:t>UC Berkeley obtient 4 points STARS sur 4 au crédit PA-4, niveau maximal.</w:t>
       </w:r>
     </w:p>
     <w:p>
       <w:r>
-        <w:t>L'université de Californie à Berkeley obtient 2,51 points STARS sur 6 au crédit PA-5, niveau intermédiaire.</w:t>
+        <w:t>UC Berkeley obtient 2,51 points STARS sur 6 au crédit PA-5, niveau intermédiaire.</w:t>
       </w:r>
     </w:p>
     <w:p>
@@ -1771,22 +1771,22 @@
     </w:p>
     <w:p>
       <w:r>
-        <w:t>L'Université de Californie à Berkeley (UC Berkeley) a publié un plan de durabilité (Sustainability Plan) et un plan d'action climat (Climate Action Plan). Son centre étudiant, le Student Environmental Resource Center (SERC), a adopté un plan stratégique qui vise à renforcer les programmes et les ressources pour approfondir l'engagement dans la communauté de la durabilité, et qui inclut des objectifs mesurables tels que l'expansion des opportunités de formation co-curriculaire et le développement de voies institutionnelles pour les clubs et les groupes étudiants pour accroître l'engagement intersectionnel avec le SERC.</w:t>
+        <w:t>University of California, Berkeley (UC Berkeley) a publié un plan de durabilité (Sustainability Plan) et un plan d'action climat (Climate Action Plan). Son centre étudiant, le Student Environmental Resource Center (SERC), a adopté un plan stratégique qui vise à renforcer les programmes et les ressources pour approfondir l'engagement dans la communauté de la durabilité, et qui inclut des objectifs mesurables tels que l'expansion des opportunités de formation co-curriculaire et le développement de voies institutionnelles pour les clubs et les groupes étudiants pour accroître l'engagement intersectionnel avec le SERC.</w:t>
       </w:r>
     </w:p>
     <w:p>
       <w:r>
-        <w:t>L'UC Berkeley est signataire du Climate Leadership Commitments de Second Nature, qui inclut le Carbon Commitment. Cette déclaration externe renforce l'engagement de l'université à réduire les émissions de carbone et à renforcer la résilience face au changement climatique.</w:t>
+        <w:t>UC Berkeley est signataire du Climate Leadership Commitments de Second Nature, qui inclut le Carbon Commitment. Cette déclaration externe renforce l'engagement de l'université à réduire les émissions de carbone et à renforcer la résilience face au changement climatique.</w:t>
       </w:r>
     </w:p>
     <w:p>
       <w:r>
-        <w:t>L'Office de la durabilité de l'UC Berkeley est dirigé par une équipe dédiée qui se consacre à avancer les objectifs de durabilité de l'université et à satisfaire ses engagements climatiques. Cette équipe, dirigée par le responsable de la durabilité et des solutions au carbone, collabore avec les départements et les parties prenantes de l'UC Berkeley pour développer des stratégies qui réduisent les émissions de gaz à effet de serre, améliorent l'achat durable et favorisent la responsabilité environnementale dans les opérations quotidiennes.</w:t>
+        <w:t>L'Office de la durabilité de UC Berkeley est dirigé par une équipe dédiée qui se consacre à avancer les objectifs de durabilité de l'université et à satisfaire ses engagements climatiques. Cette équipe, dirigée par le responsable de la durabilité et des solutions au carbone, collabore avec les départements et les parties prenantes de UC Berkeley pour développer des stratégies qui réduisent les émissions de gaz à effet de serre, améliorent l'achat durable et favorisent la responsabilité environnementale dans les opérations quotidiennes.</w:t>
       </w:r>
     </w:p>
     <w:p>
       <w:r>
-        <w:t>L'UC Berkeley a une section dédiée sur son site web des ressources humaines qui expose les politiques liées aux droits des salariés, notamment le traitement équitable, les procédures de réclamation et l'équilibre vie professionnelle. Ces politiques couvrent des domaines tels que la lutte contre les discriminations, la protection des lanceurs d'alerte et les avantages pour les salariés, offrant ainsi une vue transparente des droits et du soutien offerts aux salariés.</w:t>
+        <w:t>UC Berkeley a une section dédiée sur son site web des ressources humaines qui expose les politiques liées aux droits des salariés, notamment le traitement équitable, les procédures de réclamation et l'équilibre vie professionnelle. Ces politiques couvrent des domaines tels que la lutte contre les discriminations, la protection des lanceurs d'alerte et les avantages pour les salariés, offrant ainsi une vue transparente des droits et du soutien offerts aux salariés.</w:t>
       </w:r>
     </w:p>
     <w:p>
@@ -1807,7 +1807,7 @@
     </w:p>
     <w:p>
       <w:r>
-        <w:t>Ce rapport ne peut pas établir les engagements politiques de l'UC Berkeley en ce qui concerne les droits humains et le devoir de vigilance, car STARS ne couvre pas ces aspects. De plus, STARS ne collecte pas les informations sur les mécanismes de demande de conseil et de signalement pour les personnes en relation d'affaires, ce qui constitue également un domaine non couvert par le rapport.</w:t>
+        <w:t>Ce rapport ne peut pas établir les engagements politiques de UC Berkeley en ce qui concerne les droits humains et le devoir de vigilance, car STARS ne couvre pas ces aspects. De plus, STARS ne collecte pas les informations sur les mécanismes de demande de conseil et de signalement pour les personnes en relation d'affaires, ce qui constitue également un domaine non couvert par le rapport.</w:t>
       </w:r>
     </w:p>
     <w:p>
@@ -2136,7 +2136,7 @@
     </w:p>
     <w:p>
       <w:r>
-        <w:t>L'engagement des parties prenantes est un aspect clé de la stratégie de l'University of California, Berkeley. Le rapport STARS indique que l'université a mis en place des comités consultatifs pour l'engagement communautaire, qui impliquent des membres de la communauté locale, notamment dans les domaines de la santé publique, de la durabilité et de la justice sociale.</w:t>
+        <w:t>L'engagement des parties prenantes est un aspect clé de la stratégie de University of California, Berkeley (UC Berkeley). Le rapport STARS indique que l'université a mis en place des comités consultatifs pour l'engagement communautaire, qui impliquent des membres de la communauté locale, notamment dans les domaines de la santé publique, de la durabilité et de la justice sociale.</w:t>
       </w:r>
     </w:p>
     <w:p>
@@ -3807,7 +3807,7 @@
     </w:p>
     <w:p>
       <w:r>
-        <w:t>L'université de Californie à Berkeley a obtenu 4,34 points STARS sur 5 au crédit PA-13, niveau élevé, pour sa politique de salaire décent. Le salaire décent de référence est calculé avec le calculateur du Massachusetts Institute of Technology (MIT) ; le seuil horaire retenu pour le personnel tient compte du taux composite des avantages sociaux (CBR), actuellement de 42,8 %.</w:t>
+        <w:t>University of California, Berkeley (UC Berkeley) a obtenu 4,34 points STARS sur 5 au crédit PA-13, niveau élevé, pour sa politique de salaire décent. Le salaire décent de référence est calculé avec le calculateur du Massachusetts Institute of Technology (MIT) ; le seuil horaire retenu pour le personnel tient compte du taux composite des avantages sociaux (CBR), actuellement de 42,8 %.</w:t>
       </w:r>
     </w:p>
     <w:p>
@@ -4537,7 +4537,7 @@
     </w:p>
     <w:p>
       <w:r>
-        <w:t>L'université obtient 13,01 points STARS sur 14 au crédit AC-1, niveau élevé. L'information pour les offres de cours en durabilité a été collectée via un inventaire des cours de l'Université de Californie à Berkeley de 2021 à 2024, en filtrant les éléments qui se qualifient comme des cours axés sur la durabilité ou liés à la durabilité. Les cours qui se qualifient ont été comptabilisés comme des offres de cours en durabilité.</w:t>
+        <w:t>L'université obtient 13,01 points STARS sur 14 au crédit AC-1, niveau élevé. L'information pour les offres de cours en durabilité a été collectée via un inventaire des cours de University of California, Berkeley (UC Berkeley) de 2021 à 2024, en filtrant les éléments qui se qualifient comme des cours axés sur la durabilité ou liés à la durabilité. Les cours qui se qualifient ont été comptabilisés comme des offres de cours en durabilité.</w:t>
       </w:r>
     </w:p>
     <w:p>
@@ -4557,7 +4557,7 @@
     </w:p>
     <w:p>
       <w:r>
-        <w:t>L'université obtient 6 points STARS sur 6 au crédit AC-7, niveau maximal. L'Université de Californie à Berkeley compte plusieurs centres engagés dans des sujets liés à la durabilité, notamment le Sutardja Center for Entrepreneurship and Technology qui abrite le Alternative Meats X Lab.</w:t>
+        <w:t>L'université obtient 6 points STARS sur 6 au crédit AC-7, niveau maximal. UC Berkeley compte plusieurs centres engagés dans des sujets liés à la durabilité, notamment le Sutardja Center for Entrepreneurship and Technology qui abrite le Alternative Meats X Lab.</w:t>
       </w:r>
     </w:p>
     <w:p>
@@ -4567,7 +4567,7 @@
     </w:p>
     <w:p>
       <w:r>
-        <w:t>L'université obtient 9 points STARS sur 9 au crédit EN-2, niveau maximal. Le centre étudiant de ressources environnementales (SERC) de l'Université de Californie à Berkeley organise de nombreux événements axés sur la durabilité sur le campus, notamment la semaine de la justice climatique et la semaine de la Terre, une série de carrières environnementales, des formations à la justice environnementale et des événements d'éducation en plein air.</w:t>
+        <w:t>L'université obtient 9 points STARS sur 9 au crédit EN-2, niveau maximal. Le centre étudiant de ressources environnementales (SERC) de UC Berkeley organise de nombreux événements axés sur la durabilité sur le campus, notamment la semaine de la justice climatique et la semaine de la Terre, une série de carrières environnementales, des formations à la justice environnementale et des événements d'éducation en plein air.</w:t>
       </w:r>
     </w:p>
     <w:p>
@@ -4682,80 +4682,6 @@
                 <w:sz w:val="17"/>
               </w:rPr>
               <w:t>Non évalué</w:t>
-            </w:r>
-          </w:p>
-        </w:tc>
-      </w:tr>
-      <w:tr>
-        <w:tc>
-          <w:tcPr>
-            <w:tcW w:type="dxa" w:w="2160"/>
-          </w:tcPr>
-          <w:p>
-            <w:r>
-              <w:rPr>
-                <w:sz w:val="17"/>
-              </w:rPr>
-            </w:r>
-            <w:r>
-              <w:rPr>
-                <w:sz w:val="17"/>
-              </w:rPr>
-              <w:t>:-:</w:t>
-            </w:r>
-          </w:p>
-        </w:tc>
-        <w:tc>
-          <w:tcPr>
-            <w:tcW w:type="dxa" w:w="2160"/>
-          </w:tcPr>
-          <w:p>
-            <w:r>
-              <w:rPr>
-                <w:sz w:val="17"/>
-              </w:rPr>
-            </w:r>
-            <w:r>
-              <w:rPr>
-                <w:sz w:val="17"/>
-              </w:rPr>
-              <w:t>:-:</w:t>
-            </w:r>
-          </w:p>
-        </w:tc>
-        <w:tc>
-          <w:tcPr>
-            <w:tcW w:type="dxa" w:w="2160"/>
-          </w:tcPr>
-          <w:p>
-            <w:r>
-              <w:rPr>
-                <w:sz w:val="17"/>
-              </w:rPr>
-            </w:r>
-            <w:r>
-              <w:rPr>
-                <w:sz w:val="17"/>
-              </w:rPr>
-              <w:t>:-:</w:t>
-            </w:r>
-          </w:p>
-        </w:tc>
-        <w:tc>
-          <w:tcPr>
-            <w:tcW w:type="dxa" w:w="2160"/>
-          </w:tcPr>
-          <w:p>
-            <w:r>
-              <w:rPr>
-                <w:sz w:val="17"/>
-              </w:rPr>
-            </w:r>
-            <w:r>
-              <w:rPr>
-                <w:sz w:val="17"/>
-              </w:rPr>
-              <w:t>:-:</w:t>
             </w:r>
           </w:p>
         </w:tc>

</xml_diff>

<commit_message>
Re-render the three reports with the quality changes (no LLM run)
</commit_message>
<xml_diff>
--- a/outputs/berkeley/rapport_berkeley.docx
+++ b/outputs/berkeley/rapport_berkeley.docx
@@ -18,7 +18,7 @@
         <w:rPr>
           <w:i/>
         </w:rPr>
-        <w:t>Établi en référence aux normes GRI · généré le 2026-10-06 · données AASHE STARS 3.0</w:t>
+        <w:t>Établi en référence aux normes GRI · généré le 2026-10-07 · données AASHE STARS 3.0</w:t>
       </w:r>
     </w:p>
     <w:p>
@@ -859,6 +859,67 @@
     </w:p>
     <w:p>
       <w:pPr>
+        <w:pStyle w:val="Heading3"/>
+      </w:pPr>
+      <w:r>
+        <w:rPr>
+          <w:color w:val="2F6F5E"/>
+        </w:rPr>
+        <w:t>Points forts et points à améliorer</w:t>
+      </w:r>
+    </w:p>
+    <w:p>
+      <w:r>
+        <w:rPr>
+          <w:i/>
+        </w:rPr>
+        <w:t>Calculé par le code à partir des scores STARS de la section, sans texte du modèle (point fort : 75 % des points ou plus ; à améliorer : moins de 40 % ; entre les deux : partiellement atteint).</w:t>
+      </w:r>
+    </w:p>
+    <w:p>
+      <w:pPr>
+        <w:pStyle w:val="ListBullet"/>
+      </w:pPr>
+      <w:r>
+        <w:rPr>
+          <w:b/>
+        </w:rPr>
+        <w:t>Points forts</w:t>
+      </w:r>
+      <w:r>
+        <w:t xml:space="preserve"> : PA-12 Droits des salariés (2,5 sur 3).</w:t>
+      </w:r>
+    </w:p>
+    <w:p>
+      <w:pPr>
+        <w:pStyle w:val="ListBullet"/>
+      </w:pPr>
+      <w:r>
+        <w:rPr>
+          <w:b/>
+        </w:rPr>
+        <w:t>Partiellement atteints</w:t>
+      </w:r>
+      <w:r>
+        <w:t xml:space="preserve"> : aucun.</w:t>
+      </w:r>
+    </w:p>
+    <w:p>
+      <w:pPr>
+        <w:pStyle w:val="ListBullet"/>
+      </w:pPr>
+      <w:r>
+        <w:rPr>
+          <w:b/>
+        </w:rPr>
+        <w:t>À améliorer</w:t>
+      </w:r>
+      <w:r>
+        <w:t xml:space="preserve"> : aucun.</w:t>
+      </w:r>
+    </w:p>
+    <w:p>
+      <w:pPr>
         <w:pStyle w:val="Heading1"/>
       </w:pPr>
       <w:r>
@@ -1032,6 +1093,67 @@
     <w:p>
       <w:r>
         <w:t>L'université a aussi publié un plan de durabilité (Sustainability Plan), avec des objectifs pour l'énergie, l'eau, les déchets, l'alimentation durable et la biodiversité, et un plan d'action climat (Climate Action Plan). Elle suit la politique de pratiques durables (Sustainable Practices Policy) du système UC, qui demande à tous les sites UC de réduire toutes leurs émissions d'au moins 90 % d'ici 2045 et d'éliminer les émissions restantes par des crédits de captage et de stockage du carbone.</w:t>
+      </w:r>
+    </w:p>
+    <w:p>
+      <w:pPr>
+        <w:pStyle w:val="Heading3"/>
+      </w:pPr>
+      <w:r>
+        <w:rPr>
+          <w:color w:val="2F6F5E"/>
+        </w:rPr>
+        <w:t>Points forts et points à améliorer</w:t>
+      </w:r>
+    </w:p>
+    <w:p>
+      <w:r>
+        <w:rPr>
+          <w:i/>
+        </w:rPr>
+        <w:t>Calculé par le code à partir des scores STARS de la section, sans texte du modèle (point fort : 75 % des points ou plus ; à améliorer : moins de 40 % ; entre les deux : partiellement atteint).</w:t>
+      </w:r>
+    </w:p>
+    <w:p>
+      <w:pPr>
+        <w:pStyle w:val="ListBullet"/>
+      </w:pPr>
+      <w:r>
+        <w:rPr>
+          <w:b/>
+        </w:rPr>
+        <w:t>Points forts</w:t>
+      </w:r>
+      <w:r>
+        <w:t xml:space="preserve"> : PA-2 Engagements et planification (6 sur 6).</w:t>
+      </w:r>
+    </w:p>
+    <w:p>
+      <w:pPr>
+        <w:pStyle w:val="ListBullet"/>
+      </w:pPr>
+      <w:r>
+        <w:rPr>
+          <w:b/>
+        </w:rPr>
+        <w:t>Partiellement atteints</w:t>
+      </w:r>
+      <w:r>
+        <w:t xml:space="preserve"> : aucun.</w:t>
+      </w:r>
+    </w:p>
+    <w:p>
+      <w:pPr>
+        <w:pStyle w:val="ListBullet"/>
+      </w:pPr>
+      <w:r>
+        <w:rPr>
+          <w:b/>
+        </w:rPr>
+        <w:t>À améliorer</w:t>
+      </w:r>
+      <w:r>
+        <w:t xml:space="preserve"> : aucun.</w:t>
       </w:r>
     </w:p>
     <w:p>
@@ -1392,6 +1514,67 @@
     <w:p>
       <w:r>
         <w:t>Ce rapport ne peut pas établir la composition détaillée de l'organe de gouvernance (GRI 2-9), ni les publications GRI 2-10 à GRI 2-21, que STARS ne couvre pas ou seulement en partie (GRI 2-13 et GRI 2-14).</w:t>
+      </w:r>
+    </w:p>
+    <w:p>
+      <w:pPr>
+        <w:pStyle w:val="Heading3"/>
+      </w:pPr>
+      <w:r>
+        <w:rPr>
+          <w:color w:val="2F6F5E"/>
+        </w:rPr>
+        <w:t>Points forts et points à améliorer</w:t>
+      </w:r>
+    </w:p>
+    <w:p>
+      <w:r>
+        <w:rPr>
+          <w:i/>
+        </w:rPr>
+        <w:t>Calculé par le code à partir des scores STARS de la section, sans texte du modèle (point fort : 75 % des points ou plus ; à améliorer : moins de 40 % ; entre les deux : partiellement atteint).</w:t>
+      </w:r>
+    </w:p>
+    <w:p>
+      <w:pPr>
+        <w:pStyle w:val="ListBullet"/>
+      </w:pPr>
+      <w:r>
+        <w:rPr>
+          <w:b/>
+        </w:rPr>
+        <w:t>Points forts</w:t>
+      </w:r>
+      <w:r>
+        <w:t xml:space="preserve"> : PA-1 Coordination de la durabilité (1 sur 1) ; PA-4 Programme d'investissement durable (4 sur 4) ; PA-3 Gouvernance de l'établissement (3,5 sur 4).</w:t>
+      </w:r>
+    </w:p>
+    <w:p>
+      <w:pPr>
+        <w:pStyle w:val="ListBullet"/>
+      </w:pPr>
+      <w:r>
+        <w:rPr>
+          <w:b/>
+        </w:rPr>
+        <w:t>Partiellement atteints</w:t>
+      </w:r>
+      <w:r>
+        <w:t xml:space="preserve"> : PA-5 Portefeuille d'investissements (2,51 sur 6).</w:t>
+      </w:r>
+    </w:p>
+    <w:p>
+      <w:pPr>
+        <w:pStyle w:val="ListBullet"/>
+      </w:pPr>
+      <w:r>
+        <w:rPr>
+          <w:b/>
+        </w:rPr>
+        <w:t>À améliorer</w:t>
+      </w:r>
+      <w:r>
+        <w:t xml:space="preserve"> : aucun.</w:t>
       </w:r>
     </w:p>
     <w:p>
@@ -1817,6 +2000,67 @@
     </w:p>
     <w:p>
       <w:pPr>
+        <w:pStyle w:val="Heading3"/>
+      </w:pPr>
+      <w:r>
+        <w:rPr>
+          <w:color w:val="2F6F5E"/>
+        </w:rPr>
+        <w:t>Points forts et points à améliorer</w:t>
+      </w:r>
+    </w:p>
+    <w:p>
+      <w:r>
+        <w:rPr>
+          <w:i/>
+        </w:rPr>
+        <w:t>Calculé par le code à partir des scores STARS de la section, sans texte du modèle (point fort : 75 % des points ou plus ; à améliorer : moins de 40 % ; entre les deux : partiellement atteint).</w:t>
+      </w:r>
+    </w:p>
+    <w:p>
+      <w:pPr>
+        <w:pStyle w:val="ListBullet"/>
+      </w:pPr>
+      <w:r>
+        <w:rPr>
+          <w:b/>
+        </w:rPr>
+        <w:t>Points forts</w:t>
+      </w:r>
+      <w:r>
+        <w:t xml:space="preserve"> : PA-2 Engagements et planification (6 sur 6) ; PA-1 Coordination de la durabilité (1 sur 1) ; OP-9 Système d'achats durables (7 sur 7) ; EN-3 Engagement et formation du personnel (8 sur 8) ; PA-12 Droits des salariés (2,5 sur 3).</w:t>
+      </w:r>
+    </w:p>
+    <w:p>
+      <w:pPr>
+        <w:pStyle w:val="ListBullet"/>
+      </w:pPr>
+      <w:r>
+        <w:rPr>
+          <w:b/>
+        </w:rPr>
+        <w:t>Partiellement atteints</w:t>
+      </w:r>
+      <w:r>
+        <w:t xml:space="preserve"> : aucun.</w:t>
+      </w:r>
+    </w:p>
+    <w:p>
+      <w:pPr>
+        <w:pStyle w:val="ListBullet"/>
+      </w:pPr>
+      <w:r>
+        <w:rPr>
+          <w:b/>
+        </w:rPr>
+        <w:t>À améliorer</w:t>
+      </w:r>
+      <w:r>
+        <w:t xml:space="preserve"> : aucun.</w:t>
+      </w:r>
+    </w:p>
+    <w:p>
+      <w:pPr>
         <w:pStyle w:val="Heading1"/>
       </w:pPr>
       <w:r>
@@ -2136,7 +2380,7 @@
     </w:p>
     <w:p>
       <w:r>
-        <w:t>L'engagement des parties prenantes est un aspect clé de la stratégie de University of California, Berkeley (UC Berkeley). Le rapport STARS indique que l'université a mis en place des comités consultatifs pour l'engagement communautaire, qui impliquent des membres de la communauté locale, notamment dans les domaines de la santé publique, de la durabilité et de la justice sociale.</w:t>
+        <w:t>Le rapport STARS indique que l'université a mis en place des comités consultatifs pour l'engagement communautaire, qui impliquent des membres de la communauté locale, notamment dans les domaines de la santé publique, de la durabilité et de la justice sociale.</w:t>
       </w:r>
     </w:p>
     <w:p>
@@ -2173,6 +2417,67 @@
     <w:p>
       <w:r>
         <w:t>Ce rapport ne peut pas établir les informations sur les fournisseurs de l'université, les groupes vulnérables ou la méthode d'identification des parties prenantes.</w:t>
+      </w:r>
+    </w:p>
+    <w:p>
+      <w:pPr>
+        <w:pStyle w:val="Heading3"/>
+      </w:pPr>
+      <w:r>
+        <w:rPr>
+          <w:color w:val="2F6F5E"/>
+        </w:rPr>
+        <w:t>Points forts et points à améliorer</w:t>
+      </w:r>
+    </w:p>
+    <w:p>
+      <w:r>
+        <w:rPr>
+          <w:i/>
+        </w:rPr>
+        <w:t>Calculé par le code à partir des scores STARS de la section, sans texte du modèle (point fort : 75 % des points ou plus ; à améliorer : moins de 40 % ; entre les deux : partiellement atteint).</w:t>
+      </w:r>
+    </w:p>
+    <w:p>
+      <w:pPr>
+        <w:pStyle w:val="ListBullet"/>
+      </w:pPr>
+      <w:r>
+        <w:rPr>
+          <w:b/>
+        </w:rPr>
+        <w:t>Points forts</w:t>
+      </w:r>
+      <w:r>
+        <w:t xml:space="preserve"> : EN-5 Engagement civique (8 sur 8) ; EN-6 Partenariats avec la communauté (9 sur 9) ; PA-3 Gouvernance de l'établissement (3,5 sur 4) ; PA-12 Droits des salariés (2,5 sur 3).</w:t>
+      </w:r>
+    </w:p>
+    <w:p>
+      <w:pPr>
+        <w:pStyle w:val="ListBullet"/>
+      </w:pPr>
+      <w:r>
+        <w:rPr>
+          <w:b/>
+        </w:rPr>
+        <w:t>Partiellement atteints</w:t>
+      </w:r>
+      <w:r>
+        <w:t xml:space="preserve"> : aucun.</w:t>
+      </w:r>
+    </w:p>
+    <w:p>
+      <w:pPr>
+        <w:pStyle w:val="ListBullet"/>
+      </w:pPr>
+      <w:r>
+        <w:rPr>
+          <w:b/>
+        </w:rPr>
+        <w:t>À améliorer</w:t>
+      </w:r>
+      <w:r>
+        <w:t xml:space="preserve"> : aucun.</w:t>
       </w:r>
     </w:p>
     <w:p>
@@ -3264,6 +3569,67 @@
     </w:p>
     <w:p>
       <w:pPr>
+        <w:pStyle w:val="Heading3"/>
+      </w:pPr>
+      <w:r>
+        <w:rPr>
+          <w:color w:val="2F6F5E"/>
+        </w:rPr>
+        <w:t>Points forts et points à améliorer</w:t>
+      </w:r>
+    </w:p>
+    <w:p>
+      <w:r>
+        <w:rPr>
+          <w:i/>
+        </w:rPr>
+        <w:t>Calculé par le code à partir des scores STARS de la section, sans texte du modèle (point fort : 75 % des points ou plus ; à améliorer : moins de 40 % ; entre les deux : partiellement atteint).</w:t>
+      </w:r>
+    </w:p>
+    <w:p>
+      <w:pPr>
+        <w:pStyle w:val="ListBullet"/>
+      </w:pPr>
+      <w:r>
+        <w:rPr>
+          <w:b/>
+        </w:rPr>
+        <w:t>Points forts</w:t>
+      </w:r>
+      <w:r>
+        <w:t xml:space="preserve"> : OP-9 Système d'achats durables (7 sur 7) ; OP-15 Voyages en avion (2 sur 2) ; OP-4 Gestion écologique des espaces verts (5 sur 5) ; IL-24 Évaluation de la biodiversité (1 sur 1) ; OP-1 Conception et construction des bâtiments (2,91 sur 3) ; OP-11 Gestion des matériaux (3,75 sur 4) ; OP-14 Modes de déplacement domicile-campus (4,89 sur 6) ; OP-2 Exploitation et maintenance des bâtiments (4 sur 5).</w:t>
+      </w:r>
+    </w:p>
+    <w:p>
+      <w:pPr>
+        <w:pStyle w:val="ListBullet"/>
+      </w:pPr>
+      <w:r>
+        <w:rPr>
+          <w:b/>
+        </w:rPr>
+        <w:t>Partiellement atteints</w:t>
+      </w:r>
+      <w:r>
+        <w:t xml:space="preserve"> : OP-10 Biens achetés (2,8 sur 4) ; OP-5 Consommation d'énergie (6,87 sur 10) ; OP-12 Production et valorisation des déchets (3,27 sur 5) ; OP-6 Émissions de gaz à effet de serre (8,01 sur 16).</w:t>
+      </w:r>
+    </w:p>
+    <w:p>
+      <w:pPr>
+        <w:pStyle w:val="ListBullet"/>
+      </w:pPr>
+      <w:r>
+        <w:rPr>
+          <w:b/>
+        </w:rPr>
+        <w:t>À améliorer</w:t>
+      </w:r>
+      <w:r>
+        <w:t xml:space="preserve"> : OP-13 Flotte de véhicules (0,28 sur 2) ; OP-3 Consommation d'eau (2,43 sur 7).</w:t>
+      </w:r>
+    </w:p>
+    <w:p>
+      <w:pPr>
         <w:pStyle w:val="Heading1"/>
       </w:pPr>
       <w:r>
@@ -3863,6 +4229,67 @@
     </w:p>
     <w:p>
       <w:pPr>
+        <w:pStyle w:val="Heading3"/>
+      </w:pPr>
+      <w:r>
+        <w:rPr>
+          <w:color w:val="2F6F5E"/>
+        </w:rPr>
+        <w:t>Points forts et points à améliorer</w:t>
+      </w:r>
+    </w:p>
+    <w:p>
+      <w:r>
+        <w:rPr>
+          <w:i/>
+        </w:rPr>
+        <w:t>Calculé par le code à partir des scores STARS de la section, sans texte du modèle (point fort : 75 % des points ou plus ; à améliorer : moins de 40 % ; entre les deux : partiellement atteint).</w:t>
+      </w:r>
+    </w:p>
+    <w:p>
+      <w:pPr>
+        <w:pStyle w:val="ListBullet"/>
+      </w:pPr>
+      <w:r>
+        <w:rPr>
+          <w:b/>
+        </w:rPr>
+        <w:t>Points forts</w:t>
+      </w:r>
+      <w:r>
+        <w:t xml:space="preserve"> : PA-11 Santé, sécurité et bien-être (3 sur 3) ; PA-6 Climat institutionnel (3 sur 3) ; PA-10 Réussite étudiante (2,8 sur 3) ; PA-13 Équité salariale et salaire décent (4,34 sur 5) ; PA-8 Parité femmes-hommes (1,67 sur 2) ; PA-12 Droits des salariés (2,5 sur 3) ; PA-9 Accessibilité financière et accès (2,5 sur 3).</w:t>
+      </w:r>
+    </w:p>
+    <w:p>
+      <w:pPr>
+        <w:pStyle w:val="ListBullet"/>
+      </w:pPr>
+      <w:r>
+        <w:rPr>
+          <w:b/>
+        </w:rPr>
+        <w:t>Partiellement atteints</w:t>
+      </w:r>
+      <w:r>
+        <w:t xml:space="preserve"> : PA-7 Représentation ethnique et raciale (1,59 sur 3).</w:t>
+      </w:r>
+    </w:p>
+    <w:p>
+      <w:pPr>
+        <w:pStyle w:val="ListBullet"/>
+      </w:pPr>
+      <w:r>
+        <w:rPr>
+          <w:b/>
+        </w:rPr>
+        <w:t>À améliorer</w:t>
+      </w:r>
+      <w:r>
+        <w:t xml:space="preserve"> : aucun.</w:t>
+      </w:r>
+    </w:p>
+    <w:p>
+      <w:pPr>
         <w:pStyle w:val="Heading1"/>
       </w:pPr>
       <w:r>
@@ -4582,6 +5009,67 @@
     </w:p>
     <w:p>
       <w:pPr>
+        <w:pStyle w:val="Heading3"/>
+      </w:pPr>
+      <w:r>
+        <w:rPr>
+          <w:color w:val="2F6F5E"/>
+        </w:rPr>
+        <w:t>Points forts et points à améliorer</w:t>
+      </w:r>
+    </w:p>
+    <w:p>
+      <w:r>
+        <w:rPr>
+          <w:i/>
+        </w:rPr>
+        <w:t>Calculé par le code à partir des scores STARS de la section, sans texte du modèle (point fort : 75 % des points ou plus ; à améliorer : moins de 40 % ; entre les deux : partiellement atteint).</w:t>
+      </w:r>
+    </w:p>
+    <w:p>
+      <w:pPr>
+        <w:pStyle w:val="ListBullet"/>
+      </w:pPr>
+      <w:r>
+        <w:rPr>
+          <w:b/>
+        </w:rPr>
+        <w:t>Points forts</w:t>
+      </w:r>
+      <w:r>
+        <w:t xml:space="preserve"> : AC-3 Programmes de cycles supérieurs (8 sur 8) ; AC-7 Centre de recherche en durabilité (6 sur 6) ; EN-1 Communication et sensibilisation (5 sur 5) ; EN-2 Activités parascolaires (9 sur 9) ; EN-3 Engagement et formation du personnel (8 sur 8) ; EN-5 Engagement civique (8 sur 8) ; EN-7 Formation continue (3 sur 3) ; AC-1 Offre de cours en durabilité (13,01 sur 14).</w:t>
+      </w:r>
+    </w:p>
+    <w:p>
+      <w:pPr>
+        <w:pStyle w:val="ListBullet"/>
+      </w:pPr>
+      <w:r>
+        <w:rPr>
+          <w:b/>
+        </w:rPr>
+        <w:t>Partiellement atteints</w:t>
+      </w:r>
+      <w:r>
+        <w:t xml:space="preserve"> : AC-6 Recherche en durabilité (7,35 sur 10) ; AC-2 Programmes de premier cycle (10,22 sur 15).</w:t>
+      </w:r>
+    </w:p>
+    <w:p>
+      <w:pPr>
+        <w:pStyle w:val="ListBullet"/>
+      </w:pPr>
+      <w:r>
+        <w:rPr>
+          <w:b/>
+        </w:rPr>
+        <w:t>À améliorer</w:t>
+      </w:r>
+      <w:r>
+        <w:t xml:space="preserve"> : aucun.</w:t>
+      </w:r>
+    </w:p>
+    <w:p>
+      <w:pPr>
         <w:pStyle w:val="Heading1"/>
       </w:pPr>
       <w:r>
@@ -17241,7 +17729,7 @@
     </w:p>
     <w:p>
       <w:r>
-        <w:t>Chaque section narrative a suivi la boucle : rédaction (placeholders) → garde-fou des chiffres → substitution par le code → audit par le juge → régénération si refus (trois tentatives au plus).</w:t>
+        <w:t>Chaque section narrative a suivi la boucle : rédaction (placeholders) → garde-fou des chiffres → substitution par le code → audit par le juge → régénération si refus (deux essais au plus ; sinon texte de repli écrit par le code).</w:t>
       </w:r>
     </w:p>
     <w:tbl>
@@ -17252,19 +17740,20 @@
         <w:tblLook w:firstColumn="1" w:firstRow="1" w:lastColumn="0" w:lastRow="0" w:noHBand="0" w:noVBand="1" w:val="04A0"/>
       </w:tblPr>
       <w:tblGrid>
-        <w:gridCol w:w="1080"/>
-        <w:gridCol w:w="1080"/>
-        <w:gridCol w:w="1080"/>
-        <w:gridCol w:w="1080"/>
-        <w:gridCol w:w="1080"/>
-        <w:gridCol w:w="1080"/>
-        <w:gridCol w:w="1080"/>
-        <w:gridCol w:w="1080"/>
+        <w:gridCol w:w="960"/>
+        <w:gridCol w:w="960"/>
+        <w:gridCol w:w="960"/>
+        <w:gridCol w:w="960"/>
+        <w:gridCol w:w="960"/>
+        <w:gridCol w:w="960"/>
+        <w:gridCol w:w="960"/>
+        <w:gridCol w:w="960"/>
+        <w:gridCol w:w="960"/>
       </w:tblGrid>
       <w:tr>
         <w:tc>
           <w:tcPr>
-            <w:tcW w:type="dxa" w:w="1080"/>
+            <w:tcW w:type="dxa" w:w="960"/>
           </w:tcPr>
           <w:p>
             <w:r>
@@ -17284,7 +17773,7 @@
         </w:tc>
         <w:tc>
           <w:tcPr>
-            <w:tcW w:type="dxa" w:w="1080"/>
+            <w:tcW w:type="dxa" w:w="960"/>
           </w:tcPr>
           <w:p>
             <w:r>
@@ -17304,7 +17793,7 @@
         </w:tc>
         <w:tc>
           <w:tcPr>
-            <w:tcW w:type="dxa" w:w="1080"/>
+            <w:tcW w:type="dxa" w:w="960"/>
           </w:tcPr>
           <w:p>
             <w:r>
@@ -17324,7 +17813,7 @@
         </w:tc>
         <w:tc>
           <w:tcPr>
-            <w:tcW w:type="dxa" w:w="1080"/>
+            <w:tcW w:type="dxa" w:w="960"/>
           </w:tcPr>
           <w:p>
             <w:r>
@@ -17344,7 +17833,7 @@
         </w:tc>
         <w:tc>
           <w:tcPr>
-            <w:tcW w:type="dxa" w:w="1080"/>
+            <w:tcW w:type="dxa" w:w="960"/>
           </w:tcPr>
           <w:p>
             <w:r>
@@ -17364,7 +17853,7 @@
         </w:tc>
         <w:tc>
           <w:tcPr>
-            <w:tcW w:type="dxa" w:w="1080"/>
+            <w:tcW w:type="dxa" w:w="960"/>
           </w:tcPr>
           <w:p>
             <w:r>
@@ -17384,7 +17873,7 @@
         </w:tc>
         <w:tc>
           <w:tcPr>
-            <w:tcW w:type="dxa" w:w="1080"/>
+            <w:tcW w:type="dxa" w:w="960"/>
           </w:tcPr>
           <w:p>
             <w:r>
@@ -17398,13 +17887,33 @@
                 <w:b/>
                 <w:sz w:val="17"/>
               </w:rPr>
-              <w:t>Couverture GRI</w:t>
-            </w:r>
-          </w:p>
-        </w:tc>
-        <w:tc>
-          <w:tcPr>
-            <w:tcW w:type="dxa" w:w="1080"/>
+              <w:t>Codes GRI cités dans le texte</w:t>
+            </w:r>
+          </w:p>
+        </w:tc>
+        <w:tc>
+          <w:tcPr>
+            <w:tcW w:type="dxa" w:w="960"/>
+          </w:tcPr>
+          <w:p>
+            <w:r>
+              <w:rPr>
+                <w:b/>
+                <w:sz w:val="17"/>
+              </w:rPr>
+            </w:r>
+            <w:r>
+              <w:rPr>
+                <w:b/>
+                <w:sz w:val="17"/>
+              </w:rPr>
+              <w:t>Publications GRI avec données (index)</w:t>
+            </w:r>
+          </w:p>
+        </w:tc>
+        <w:tc>
+          <w:tcPr>
+            <w:tcW w:type="dxa" w:w="960"/>
           </w:tcPr>
           <w:p>
             <w:r>
@@ -17426,7 +17935,7 @@
       <w:tr>
         <w:tc>
           <w:tcPr>
-            <w:tcW w:type="dxa" w:w="1080"/>
+            <w:tcW w:type="dxa" w:w="960"/>
           </w:tcPr>
           <w:p>
             <w:r>
@@ -17444,7 +17953,7 @@
         </w:tc>
         <w:tc>
           <w:tcPr>
-            <w:tcW w:type="dxa" w:w="1080"/>
+            <w:tcW w:type="dxa" w:w="960"/>
           </w:tcPr>
           <w:p>
             <w:r>
@@ -17462,7 +17971,7 @@
         </w:tc>
         <w:tc>
           <w:tcPr>
-            <w:tcW w:type="dxa" w:w="1080"/>
+            <w:tcW w:type="dxa" w:w="960"/>
           </w:tcPr>
           <w:p>
             <w:r>
@@ -17480,7 +17989,7 @@
         </w:tc>
         <w:tc>
           <w:tcPr>
-            <w:tcW w:type="dxa" w:w="1080"/>
+            <w:tcW w:type="dxa" w:w="960"/>
           </w:tcPr>
           <w:p>
             <w:r>
@@ -17498,7 +18007,7 @@
         </w:tc>
         <w:tc>
           <w:tcPr>
-            <w:tcW w:type="dxa" w:w="1080"/>
+            <w:tcW w:type="dxa" w:w="960"/>
           </w:tcPr>
           <w:p>
             <w:r>
@@ -17516,7 +18025,7 @@
         </w:tc>
         <w:tc>
           <w:tcPr>
-            <w:tcW w:type="dxa" w:w="1080"/>
+            <w:tcW w:type="dxa" w:w="960"/>
           </w:tcPr>
           <w:p>
             <w:r>
@@ -17534,7 +18043,7 @@
         </w:tc>
         <w:tc>
           <w:tcPr>
-            <w:tcW w:type="dxa" w:w="1080"/>
+            <w:tcW w:type="dxa" w:w="960"/>
           </w:tcPr>
           <w:p>
             <w:r>
@@ -17552,7 +18061,25 @@
         </w:tc>
         <w:tc>
           <w:tcPr>
-            <w:tcW w:type="dxa" w:w="1080"/>
+            <w:tcW w:type="dxa" w:w="960"/>
+          </w:tcPr>
+          <w:p>
+            <w:r>
+              <w:rPr>
+                <w:sz w:val="17"/>
+              </w:rPr>
+            </w:r>
+            <w:r>
+              <w:rPr>
+                <w:sz w:val="17"/>
+              </w:rPr>
+              <w:t>5 sur 8</w:t>
+            </w:r>
+          </w:p>
+        </w:tc>
+        <w:tc>
+          <w:tcPr>
+            <w:tcW w:type="dxa" w:w="960"/>
           </w:tcPr>
           <w:p>
             <w:r>
@@ -17572,7 +18099,7 @@
       <w:tr>
         <w:tc>
           <w:tcPr>
-            <w:tcW w:type="dxa" w:w="1080"/>
+            <w:tcW w:type="dxa" w:w="960"/>
           </w:tcPr>
           <w:p>
             <w:r>
@@ -17590,7 +18117,7 @@
         </w:tc>
         <w:tc>
           <w:tcPr>
-            <w:tcW w:type="dxa" w:w="1080"/>
+            <w:tcW w:type="dxa" w:w="960"/>
           </w:tcPr>
           <w:p>
             <w:r>
@@ -17608,7 +18135,7 @@
         </w:tc>
         <w:tc>
           <w:tcPr>
-            <w:tcW w:type="dxa" w:w="1080"/>
+            <w:tcW w:type="dxa" w:w="960"/>
           </w:tcPr>
           <w:p>
             <w:r>
@@ -17626,7 +18153,7 @@
         </w:tc>
         <w:tc>
           <w:tcPr>
-            <w:tcW w:type="dxa" w:w="1080"/>
+            <w:tcW w:type="dxa" w:w="960"/>
           </w:tcPr>
           <w:p>
             <w:r>
@@ -17644,7 +18171,7 @@
         </w:tc>
         <w:tc>
           <w:tcPr>
-            <w:tcW w:type="dxa" w:w="1080"/>
+            <w:tcW w:type="dxa" w:w="960"/>
           </w:tcPr>
           <w:p>
             <w:r>
@@ -17662,7 +18189,7 @@
         </w:tc>
         <w:tc>
           <w:tcPr>
-            <w:tcW w:type="dxa" w:w="1080"/>
+            <w:tcW w:type="dxa" w:w="960"/>
           </w:tcPr>
           <w:p>
             <w:r>
@@ -17680,7 +18207,7 @@
         </w:tc>
         <w:tc>
           <w:tcPr>
-            <w:tcW w:type="dxa" w:w="1080"/>
+            <w:tcW w:type="dxa" w:w="960"/>
           </w:tcPr>
           <w:p>
             <w:r>
@@ -17698,7 +18225,25 @@
         </w:tc>
         <w:tc>
           <w:tcPr>
-            <w:tcW w:type="dxa" w:w="1080"/>
+            <w:tcW w:type="dxa" w:w="960"/>
+          </w:tcPr>
+          <w:p>
+            <w:r>
+              <w:rPr>
+                <w:sz w:val="17"/>
+              </w:rPr>
+            </w:r>
+            <w:r>
+              <w:rPr>
+                <w:sz w:val="17"/>
+              </w:rPr>
+              <w:t>2 sur 3</w:t>
+            </w:r>
+          </w:p>
+        </w:tc>
+        <w:tc>
+          <w:tcPr>
+            <w:tcW w:type="dxa" w:w="960"/>
           </w:tcPr>
           <w:p>
             <w:r>
@@ -17718,7 +18263,7 @@
       <w:tr>
         <w:tc>
           <w:tcPr>
-            <w:tcW w:type="dxa" w:w="1080"/>
+            <w:tcW w:type="dxa" w:w="960"/>
           </w:tcPr>
           <w:p>
             <w:r>
@@ -17736,7 +18281,7 @@
         </w:tc>
         <w:tc>
           <w:tcPr>
-            <w:tcW w:type="dxa" w:w="1080"/>
+            <w:tcW w:type="dxa" w:w="960"/>
           </w:tcPr>
           <w:p>
             <w:r>
@@ -17754,7 +18299,7 @@
         </w:tc>
         <w:tc>
           <w:tcPr>
-            <w:tcW w:type="dxa" w:w="1080"/>
+            <w:tcW w:type="dxa" w:w="960"/>
           </w:tcPr>
           <w:p>
             <w:r>
@@ -17772,7 +18317,7 @@
         </w:tc>
         <w:tc>
           <w:tcPr>
-            <w:tcW w:type="dxa" w:w="1080"/>
+            <w:tcW w:type="dxa" w:w="960"/>
           </w:tcPr>
           <w:p>
             <w:r>
@@ -17790,7 +18335,7 @@
         </w:tc>
         <w:tc>
           <w:tcPr>
-            <w:tcW w:type="dxa" w:w="1080"/>
+            <w:tcW w:type="dxa" w:w="960"/>
           </w:tcPr>
           <w:p>
             <w:r>
@@ -17808,7 +18353,7 @@
         </w:tc>
         <w:tc>
           <w:tcPr>
-            <w:tcW w:type="dxa" w:w="1080"/>
+            <w:tcW w:type="dxa" w:w="960"/>
           </w:tcPr>
           <w:p>
             <w:r>
@@ -17826,7 +18371,7 @@
         </w:tc>
         <w:tc>
           <w:tcPr>
-            <w:tcW w:type="dxa" w:w="1080"/>
+            <w:tcW w:type="dxa" w:w="960"/>
           </w:tcPr>
           <w:p>
             <w:r>
@@ -17844,7 +18389,25 @@
         </w:tc>
         <w:tc>
           <w:tcPr>
-            <w:tcW w:type="dxa" w:w="1080"/>
+            <w:tcW w:type="dxa" w:w="960"/>
+          </w:tcPr>
+          <w:p>
+            <w:r>
+              <w:rPr>
+                <w:sz w:val="17"/>
+              </w:rPr>
+            </w:r>
+            <w:r>
+              <w:rPr>
+                <w:sz w:val="17"/>
+              </w:rPr>
+              <w:t>3 sur 13</w:t>
+            </w:r>
+          </w:p>
+        </w:tc>
+        <w:tc>
+          <w:tcPr>
+            <w:tcW w:type="dxa" w:w="960"/>
           </w:tcPr>
           <w:p>
             <w:r>
@@ -17864,7 +18427,7 @@
       <w:tr>
         <w:tc>
           <w:tcPr>
-            <w:tcW w:type="dxa" w:w="1080"/>
+            <w:tcW w:type="dxa" w:w="960"/>
           </w:tcPr>
           <w:p>
             <w:r>
@@ -17882,7 +18445,7 @@
         </w:tc>
         <w:tc>
           <w:tcPr>
-            <w:tcW w:type="dxa" w:w="1080"/>
+            <w:tcW w:type="dxa" w:w="960"/>
           </w:tcPr>
           <w:p>
             <w:r>
@@ -17900,7 +18463,7 @@
         </w:tc>
         <w:tc>
           <w:tcPr>
-            <w:tcW w:type="dxa" w:w="1080"/>
+            <w:tcW w:type="dxa" w:w="960"/>
           </w:tcPr>
           <w:p>
             <w:r>
@@ -17918,7 +18481,7 @@
         </w:tc>
         <w:tc>
           <w:tcPr>
-            <w:tcW w:type="dxa" w:w="1080"/>
+            <w:tcW w:type="dxa" w:w="960"/>
           </w:tcPr>
           <w:p>
             <w:r>
@@ -17936,7 +18499,7 @@
         </w:tc>
         <w:tc>
           <w:tcPr>
-            <w:tcW w:type="dxa" w:w="1080"/>
+            <w:tcW w:type="dxa" w:w="960"/>
           </w:tcPr>
           <w:p>
             <w:r>
@@ -17954,7 +18517,7 @@
         </w:tc>
         <w:tc>
           <w:tcPr>
-            <w:tcW w:type="dxa" w:w="1080"/>
+            <w:tcW w:type="dxa" w:w="960"/>
           </w:tcPr>
           <w:p>
             <w:r>
@@ -17972,7 +18535,7 @@
         </w:tc>
         <w:tc>
           <w:tcPr>
-            <w:tcW w:type="dxa" w:w="1080"/>
+            <w:tcW w:type="dxa" w:w="960"/>
           </w:tcPr>
           <w:p>
             <w:r>
@@ -17990,7 +18553,25 @@
         </w:tc>
         <w:tc>
           <w:tcPr>
-            <w:tcW w:type="dxa" w:w="1080"/>
+            <w:tcW w:type="dxa" w:w="960"/>
+          </w:tcPr>
+          <w:p>
+            <w:r>
+              <w:rPr>
+                <w:sz w:val="17"/>
+              </w:rPr>
+            </w:r>
+            <w:r>
+              <w:rPr>
+                <w:sz w:val="17"/>
+              </w:rPr>
+              <w:t>6 sur 7</w:t>
+            </w:r>
+          </w:p>
+        </w:tc>
+        <w:tc>
+          <w:tcPr>
+            <w:tcW w:type="dxa" w:w="960"/>
           </w:tcPr>
           <w:p>
             <w:r>
@@ -18010,7 +18591,7 @@
       <w:tr>
         <w:tc>
           <w:tcPr>
-            <w:tcW w:type="dxa" w:w="1080"/>
+            <w:tcW w:type="dxa" w:w="960"/>
           </w:tcPr>
           <w:p>
             <w:r>
@@ -18028,7 +18609,7 @@
         </w:tc>
         <w:tc>
           <w:tcPr>
-            <w:tcW w:type="dxa" w:w="1080"/>
+            <w:tcW w:type="dxa" w:w="960"/>
           </w:tcPr>
           <w:p>
             <w:r>
@@ -18046,7 +18627,7 @@
         </w:tc>
         <w:tc>
           <w:tcPr>
-            <w:tcW w:type="dxa" w:w="1080"/>
+            <w:tcW w:type="dxa" w:w="960"/>
           </w:tcPr>
           <w:p>
             <w:r>
@@ -18064,7 +18645,7 @@
         </w:tc>
         <w:tc>
           <w:tcPr>
-            <w:tcW w:type="dxa" w:w="1080"/>
+            <w:tcW w:type="dxa" w:w="960"/>
           </w:tcPr>
           <w:p>
             <w:r>
@@ -18082,7 +18663,7 @@
         </w:tc>
         <w:tc>
           <w:tcPr>
-            <w:tcW w:type="dxa" w:w="1080"/>
+            <w:tcW w:type="dxa" w:w="960"/>
           </w:tcPr>
           <w:p>
             <w:r>
@@ -18100,7 +18681,7 @@
         </w:tc>
         <w:tc>
           <w:tcPr>
-            <w:tcW w:type="dxa" w:w="1080"/>
+            <w:tcW w:type="dxa" w:w="960"/>
           </w:tcPr>
           <w:p>
             <w:r>
@@ -18118,7 +18699,7 @@
         </w:tc>
         <w:tc>
           <w:tcPr>
-            <w:tcW w:type="dxa" w:w="1080"/>
+            <w:tcW w:type="dxa" w:w="960"/>
           </w:tcPr>
           <w:p>
             <w:r>
@@ -18136,7 +18717,25 @@
         </w:tc>
         <w:tc>
           <w:tcPr>
-            <w:tcW w:type="dxa" w:w="1080"/>
+            <w:tcW w:type="dxa" w:w="960"/>
+          </w:tcPr>
+          <w:p>
+            <w:r>
+              <w:rPr>
+                <w:sz w:val="17"/>
+              </w:rPr>
+            </w:r>
+            <w:r>
+              <w:rPr>
+                <w:sz w:val="17"/>
+              </w:rPr>
+              <w:t>1 sur 2</w:t>
+            </w:r>
+          </w:p>
+        </w:tc>
+        <w:tc>
+          <w:tcPr>
+            <w:tcW w:type="dxa" w:w="960"/>
           </w:tcPr>
           <w:p>
             <w:r>
@@ -18156,7 +18755,7 @@
       <w:tr>
         <w:tc>
           <w:tcPr>
-            <w:tcW w:type="dxa" w:w="1080"/>
+            <w:tcW w:type="dxa" w:w="960"/>
           </w:tcPr>
           <w:p>
             <w:r>
@@ -18174,7 +18773,7 @@
         </w:tc>
         <w:tc>
           <w:tcPr>
-            <w:tcW w:type="dxa" w:w="1080"/>
+            <w:tcW w:type="dxa" w:w="960"/>
           </w:tcPr>
           <w:p>
             <w:r>
@@ -18192,7 +18791,7 @@
         </w:tc>
         <w:tc>
           <w:tcPr>
-            <w:tcW w:type="dxa" w:w="1080"/>
+            <w:tcW w:type="dxa" w:w="960"/>
           </w:tcPr>
           <w:p>
             <w:r>
@@ -18210,7 +18809,7 @@
         </w:tc>
         <w:tc>
           <w:tcPr>
-            <w:tcW w:type="dxa" w:w="1080"/>
+            <w:tcW w:type="dxa" w:w="960"/>
           </w:tcPr>
           <w:p>
             <w:r>
@@ -18228,7 +18827,7 @@
         </w:tc>
         <w:tc>
           <w:tcPr>
-            <w:tcW w:type="dxa" w:w="1080"/>
+            <w:tcW w:type="dxa" w:w="960"/>
           </w:tcPr>
           <w:p>
             <w:r>
@@ -18246,7 +18845,7 @@
         </w:tc>
         <w:tc>
           <w:tcPr>
-            <w:tcW w:type="dxa" w:w="1080"/>
+            <w:tcW w:type="dxa" w:w="960"/>
           </w:tcPr>
           <w:p>
             <w:r>
@@ -18264,7 +18863,7 @@
         </w:tc>
         <w:tc>
           <w:tcPr>
-            <w:tcW w:type="dxa" w:w="1080"/>
+            <w:tcW w:type="dxa" w:w="960"/>
           </w:tcPr>
           <w:p>
             <w:r>
@@ -18282,7 +18881,25 @@
         </w:tc>
         <w:tc>
           <w:tcPr>
-            <w:tcW w:type="dxa" w:w="1080"/>
+            <w:tcW w:type="dxa" w:w="960"/>
+          </w:tcPr>
+          <w:p>
+            <w:r>
+              <w:rPr>
+                <w:sz w:val="17"/>
+              </w:rPr>
+            </w:r>
+            <w:r>
+              <w:rPr>
+                <w:sz w:val="17"/>
+              </w:rPr>
+              <w:t>6 sur 35</w:t>
+            </w:r>
+          </w:p>
+        </w:tc>
+        <w:tc>
+          <w:tcPr>
+            <w:tcW w:type="dxa" w:w="960"/>
           </w:tcPr>
           <w:p>
             <w:r>
@@ -18302,7 +18919,7 @@
       <w:tr>
         <w:tc>
           <w:tcPr>
-            <w:tcW w:type="dxa" w:w="1080"/>
+            <w:tcW w:type="dxa" w:w="960"/>
           </w:tcPr>
           <w:p>
             <w:r>
@@ -18320,7 +18937,7 @@
         </w:tc>
         <w:tc>
           <w:tcPr>
-            <w:tcW w:type="dxa" w:w="1080"/>
+            <w:tcW w:type="dxa" w:w="960"/>
           </w:tcPr>
           <w:p>
             <w:r>
@@ -18338,7 +18955,7 @@
         </w:tc>
         <w:tc>
           <w:tcPr>
-            <w:tcW w:type="dxa" w:w="1080"/>
+            <w:tcW w:type="dxa" w:w="960"/>
           </w:tcPr>
           <w:p>
             <w:r>
@@ -18356,7 +18973,7 @@
         </w:tc>
         <w:tc>
           <w:tcPr>
-            <w:tcW w:type="dxa" w:w="1080"/>
+            <w:tcW w:type="dxa" w:w="960"/>
           </w:tcPr>
           <w:p>
             <w:r>
@@ -18374,7 +18991,7 @@
         </w:tc>
         <w:tc>
           <w:tcPr>
-            <w:tcW w:type="dxa" w:w="1080"/>
+            <w:tcW w:type="dxa" w:w="960"/>
           </w:tcPr>
           <w:p>
             <w:r>
@@ -18392,7 +19009,7 @@
         </w:tc>
         <w:tc>
           <w:tcPr>
-            <w:tcW w:type="dxa" w:w="1080"/>
+            <w:tcW w:type="dxa" w:w="960"/>
           </w:tcPr>
           <w:p>
             <w:r>
@@ -18410,7 +19027,7 @@
         </w:tc>
         <w:tc>
           <w:tcPr>
-            <w:tcW w:type="dxa" w:w="1080"/>
+            <w:tcW w:type="dxa" w:w="960"/>
           </w:tcPr>
           <w:p>
             <w:r>
@@ -18428,7 +19045,25 @@
         </w:tc>
         <w:tc>
           <w:tcPr>
-            <w:tcW w:type="dxa" w:w="1080"/>
+            <w:tcW w:type="dxa" w:w="960"/>
+          </w:tcPr>
+          <w:p>
+            <w:r>
+              <w:rPr>
+                <w:sz w:val="17"/>
+              </w:rPr>
+            </w:r>
+            <w:r>
+              <w:rPr>
+                <w:sz w:val="17"/>
+              </w:rPr>
+              <w:t>6 sur 18</w:t>
+            </w:r>
+          </w:p>
+        </w:tc>
+        <w:tc>
+          <w:tcPr>
+            <w:tcW w:type="dxa" w:w="960"/>
           </w:tcPr>
           <w:p>
             <w:r>
@@ -18448,7 +19083,7 @@
       <w:tr>
         <w:tc>
           <w:tcPr>
-            <w:tcW w:type="dxa" w:w="1080"/>
+            <w:tcW w:type="dxa" w:w="960"/>
           </w:tcPr>
           <w:p>
             <w:r>
@@ -18466,7 +19101,7 @@
         </w:tc>
         <w:tc>
           <w:tcPr>
-            <w:tcW w:type="dxa" w:w="1080"/>
+            <w:tcW w:type="dxa" w:w="960"/>
           </w:tcPr>
           <w:p>
             <w:r>
@@ -18484,7 +19119,7 @@
         </w:tc>
         <w:tc>
           <w:tcPr>
-            <w:tcW w:type="dxa" w:w="1080"/>
+            <w:tcW w:type="dxa" w:w="960"/>
           </w:tcPr>
           <w:p>
             <w:r>
@@ -18502,7 +19137,7 @@
         </w:tc>
         <w:tc>
           <w:tcPr>
-            <w:tcW w:type="dxa" w:w="1080"/>
+            <w:tcW w:type="dxa" w:w="960"/>
           </w:tcPr>
           <w:p>
             <w:r>
@@ -18520,7 +19155,7 @@
         </w:tc>
         <w:tc>
           <w:tcPr>
-            <w:tcW w:type="dxa" w:w="1080"/>
+            <w:tcW w:type="dxa" w:w="960"/>
           </w:tcPr>
           <w:p>
             <w:r>
@@ -18538,7 +19173,7 @@
         </w:tc>
         <w:tc>
           <w:tcPr>
-            <w:tcW w:type="dxa" w:w="1080"/>
+            <w:tcW w:type="dxa" w:w="960"/>
           </w:tcPr>
           <w:p>
             <w:r>
@@ -18556,25 +19191,43 @@
         </w:tc>
         <w:tc>
           <w:tcPr>
-            <w:tcW w:type="dxa" w:w="1080"/>
-          </w:tcPr>
-          <w:p>
-            <w:r>
-              <w:rPr>
-                <w:sz w:val="17"/>
-              </w:rPr>
-            </w:r>
-            <w:r>
-              <w:rPr>
-                <w:sz w:val="17"/>
-              </w:rPr>
-              <w:t>100%</w:t>
-            </w:r>
-          </w:p>
-        </w:tc>
-        <w:tc>
-          <w:tcPr>
-            <w:tcW w:type="dxa" w:w="1080"/>
+            <w:tcW w:type="dxa" w:w="960"/>
+          </w:tcPr>
+          <w:p>
+            <w:r>
+              <w:rPr>
+                <w:sz w:val="17"/>
+              </w:rPr>
+            </w:r>
+            <w:r>
+              <w:rPr>
+                <w:sz w:val="17"/>
+              </w:rPr>
+              <w:t>—</w:t>
+            </w:r>
+          </w:p>
+        </w:tc>
+        <w:tc>
+          <w:tcPr>
+            <w:tcW w:type="dxa" w:w="960"/>
+          </w:tcPr>
+          <w:p>
+            <w:r>
+              <w:rPr>
+                <w:sz w:val="17"/>
+              </w:rPr>
+            </w:r>
+            <w:r>
+              <w:rPr>
+                <w:sz w:val="17"/>
+              </w:rPr>
+              <w:t>—</w:t>
+            </w:r>
+          </w:p>
+        </w:tc>
+        <w:tc>
+          <w:tcPr>
+            <w:tcW w:type="dxa" w:w="960"/>
           </w:tcPr>
           <w:p>
             <w:r>
@@ -18593,6 +19246,14 @@
       </w:tr>
     </w:tbl>
     <w:p/>
+    <w:p>
+      <w:r>
+        <w:rPr>
+          <w:i/>
+        </w:rPr>
+        <w:t>« Codes GRI cités dans le texte » : part des publications GRI de la section dont le code (par exemple GRI 305-1) est cité dans le texte rédigé ; c'est une mesure de citation, pas de couverture des données. « Publications GRI avec données » : publications de la section rapportées ou partiellement rapportées dans l'index de contenu GRI, sur le total de la section.</w:t>
+      </w:r>
+    </w:p>
     <w:p>
       <w:r>
         <w:rPr>

</xml_diff>

<commit_message>
New generation of the three reports (7 October): reviews and old/new comparisons
- Regenerated Cork, Berkeley and TU Dublin with the quality changes (two passes;
  TU Dublin teaching section stayed in fallback after both passes).
- New reviews in relecture/<univ>.yaml (98 corrections, each with its STARS line);
  the previous reviews remain in the history (commit 8d65bfd).
- comparaison/comparaison_<univ>.md: old and new text section by section, with
  judge, faithfulness, extracts and number of corrections.
- Chat: a typo on the leading verb ("genenre le rapport de dublin") renders the
  report from the cache, never Ollama.
- Tests made independent of the regenerated text (they check the defect, not an
  exact sentence); the "no new number" review test now covers every section.
- All reports re-rendered without the LLM.
</commit_message>
<xml_diff>
--- a/outputs/berkeley/rapport_berkeley.docx
+++ b/outputs/berkeley/rapport_berkeley.docx
@@ -783,27 +783,12 @@
     </w:p>
     <w:p>
       <w:r>
-        <w:t>University of California, Berkeley (UC Berkeley) est une institution universitaire située dans la ville de Berkeley, en Californie. Elle fait partie du système de l'Université de Californie, dont le conseil des régents (Board of Regents) gouverne l'ensemble des campus.</w:t>
+        <w:t>L'Office de la durabilité de University of California, Berkeley (UC Berkeley), a mené le processus de collecte de données pour le rapport STARS, en utilisant divers outils et plateformes internes et externes pour recueillir et analyser les données. Des représentants de plusieurs services du campus, dont Facilities Services et Residential Life, y ont participé dès la planification ; l'Office de la durabilité a ensuite regroupé les données dans une base centrale et les a recoupées entre services.</w:t>
       </w:r>
     </w:p>
     <w:p>
       <w:r>
-        <w:t>UC Berkeley a déclaré que son périmètre d'activité est celui pour lequel elle conserve le contrôle opérationnel.</w:t>
-      </w:r>
-    </w:p>
-    <w:p>
-      <w:r>
-        <w:t>(GRI 2-1)</w:t>
-      </w:r>
-    </w:p>
-    <w:p>
-      <w:r>
-        <w:t>UC Berkeley a déclaré que son périmètre d'activité comprend les entités suivantes : le campus principal, le Hill campus, le Richmond Field Station et les réserves opérées par l'université.</w:t>
-      </w:r>
-    </w:p>
-    <w:p>
-      <w:r>
-        <w:t>(GRI 2-2)</w:t>
+        <w:t>Le périmètre du rapport couvre les sites sur lesquels le campus exerce le contrôle opérationnel : le campus principal, le Hill campus voisin, la Richmond Field Station et d'autres stations et réserves gérées par le campus, ainsi que des bâtiments qu'il possède en divers lieux (GRI 2-2).</w:t>
       </w:r>
     </w:p>
     <w:p>
@@ -819,42 +804,7 @@
     </w:p>
     <w:p>
       <w:r>
-        <w:t>Ce rapport ne peut pas établir les détails sur la dénomination légale, le siège et les pays d'activité de UC Berkeley, car ces informations ne sont pas collectées par STARS.</w:t>
-      </w:r>
-    </w:p>
-    <w:p>
-      <w:r>
-        <w:t>(GRI 2-1)</w:t>
-      </w:r>
-    </w:p>
-    <w:p>
-      <w:r>
-        <w:t>Ce rapport ne peut pas établir la période de reporting, la fréquence et le point de contact de UC Berkeley, car ces informations ne sont pas collectées par STARS.</w:t>
-      </w:r>
-    </w:p>
-    <w:p>
-      <w:r>
-        <w:t>(GRI 2-3)</w:t>
-      </w:r>
-    </w:p>
-    <w:p>
-      <w:r>
-        <w:t>Ce rapport ne peut pas établir la vérification externe de UC Berkeley, car les informations sur la norme d'assurance, le niveau d'assurance et la relation avec le vérificateur ne sont pas collectées par STARS.</w:t>
-      </w:r>
-    </w:p>
-    <w:p>
-      <w:r>
-        <w:t>(GRI 2-5)</w:t>
-      </w:r>
-    </w:p>
-    <w:p>
-      <w:r>
-        <w:t>Ce rapport ne peut pas établir les activités, la chaîne de valeur et les relations d'affaires de UC Berkeley, car ces informations ne sont pas collectées par STARS.</w:t>
-      </w:r>
-    </w:p>
-    <w:p>
-      <w:r>
-        <w:t>(GRI 2-6)</w:t>
+        <w:t>Ce rapport ne peut pas établir la dénomination légale, le siège ou les pays d'activité de l'université, ni la période de reporting, la fréquence ou le point de contact. Les données STARS sont autodéclarées et non vérifiées par l'AASHE.</w:t>
       </w:r>
     </w:p>
     <w:p>
@@ -1075,6 +1025,11 @@
       </w:r>
     </w:p>
     <w:p>
+      <w:r>
+        <w:t>L'université a publié un plan de durabilité (Sustainability Plan) qui fixe des objectifs pour l'énergie, l'eau, la réduction des déchets, l'alimentation durable et la biodiversité ; il est aligné sur les politiques de durabilité du système de l'université de Californie, avec des objectifs et un calendrier propres au campus. Son volet climat et résilience vise une transition juste et équitable vers un campus résilient, à énergie propre et zéro carbone. Le centre étudiant SERC a aussi adopté un plan stratégique (2017-2022) avec des objectifs mesurables, comme élargir l'accès aux activités d'apprentissage co-curriculaires.</w:t>
+      </w:r>
+    </w:p>
+    <w:p>
       <w:pPr>
         <w:pStyle w:val="Heading2"/>
       </w:pPr>
@@ -1082,17 +1037,12 @@
         <w:rPr>
           <w:color w:val="2F6F5E"/>
         </w:rPr>
-        <w:t>Gestion des thèmes matériels</w:t>
+        <w:t>Limites et omissions</w:t>
       </w:r>
     </w:p>
     <w:p>
       <w:r>
-        <w:t>Le Student Environmental Resource Center (SERC) de l'université a adopté un plan stratégique 2017-2022 qui inclut des objectifs mesurables, tels que l'expansion de l'accès et des opportunités de formation co-curriculaires et le développement de voies institutionnelles pour les clubs et les groupes étudiants pour accroître leur engagement intersectionnel avec le Centre de ressources environnementales (SERC). Le plan stratégique comprend également des objectifs stratégiques sous le but de renforcer les programmes et les ressources pour approfondir l'engagement dans la communauté de la durabilité.</w:t>
-      </w:r>
-    </w:p>
-    <w:p>
-      <w:r>
-        <w:t>L'université a aussi publié un plan de durabilité (Sustainability Plan), avec des objectifs pour l'énergie, l'eau, les déchets, l'alimentation durable et la biodiversité, et un plan d'action climat (Climate Action Plan). Elle suit la politique de pratiques durables (Sustainable Practices Policy) du système UC, qui demande à tous les sites UC de réduire toutes leurs émissions d'au moins 90 % d'ici 2045 et d'éliminer les émissions restantes par des crédits de captage et de stockage du carbone.</w:t>
+        <w:t>Ce rapport ne peut pas établir les impacts environnementaux de la stratégie de durabilité de l'université, ni les enseignements tirés de ses activités de durabilité.</w:t>
       </w:r>
     </w:p>
     <w:p>
@@ -1477,27 +1427,22 @@
     </w:p>
     <w:p>
       <w:r>
-        <w:t>University of California, Berkeley (UC Berkeley) a plusieurs responsables de la durabilité (Sustainability Officers) au Bureau de la durabilité, à Haas et au SERC. UC Berkeley inclut des représentants étudiants dans son organe de décision le plus élevé, le conseil des régents de l'université de Californie. Bien que le conseil des régents gouverne l'ensemble du système de l'université de Californie et non seulement le campus de Berkeley, il exerce l'autorité ultime sur les politiques, les finances et la planification stratégique de l'université de Californie, y compris le campus de Berkeley.</w:t>
+        <w:t>L'université obtient 3,5 points STARS sur 4 au crédit PA-3, niveau élevé.</w:t>
       </w:r>
     </w:p>
     <w:p>
       <w:r>
-        <w:t>UC Berkeley a plusieurs organes permanents qui permettent au personnel académique de participer à la gouvernance de l'institution. Le principal est la division de Berkeley du Sénat académique, qui fait partie du Sénat académique de l'ensemble du système de l'université de Californie. Ce Sénat fournit aux membres du personnel académique un moyen structuré et démocratique de participer à la gouvernance du campus et à la prise de décision.</w:t>
+        <w:t>L'Office de la durabilité (Office of Sustainability) fournit une direction du campus en fixant des objectifs de durabilité ambitieux et des stratégies, et en accélérant la réalisation de ces objectifs grâce à la mise en œuvre de projets, à la planification, aux partenariats et à la participation de la communauté. (GRI 2-9)</w:t>
       </w:r>
     </w:p>
     <w:p>
       <w:r>
-        <w:t>UC Berkeley obtient 3,5 points STARS sur 4 au crédit PA-3, niveau élevé.</w:t>
+        <w:t>Les enseignants-chercheurs réunis au sein du Sénat académique (Academic Senate) exercent les responsabilités de gouvernance partagée fixées par les Régents : le conseil des Régents (Board of Regents) confie au Sénat le contrôle direct des questions académiques essentielles (politique académique, conditions d'admission et de délivrance des diplômes, cours et programmes) et un rôle de conseil sur les nominations, les promotions et les budgets. (GRI 2-9)</w:t>
       </w:r>
     </w:p>
     <w:p>
       <w:r>
-        <w:t>UC Berkeley obtient 4 points STARS sur 4 au crédit PA-4, niveau maximal.</w:t>
-      </w:r>
-    </w:p>
-    <w:p>
-      <w:r>
-        <w:t>UC Berkeley obtient 2,51 points STARS sur 6 au crédit PA-5, niveau intermédiaire.</w:t>
+        <w:t>Le conseil des Régents, plus haute instance de décision, comprend des représentants étudiants ; il gouverne l'ensemble du système de l'université de Californie, et pas seulement le campus de Berkeley, et exerce l'autorité ultime sur les politiques, les finances et la planification stratégique de tous les campus. (GRI 2-9)</w:t>
       </w:r>
     </w:p>
     <w:p>
@@ -1513,7 +1458,7 @@
     </w:p>
     <w:p>
       <w:r>
-        <w:t>Ce rapport ne peut pas établir la composition détaillée de l'organe de gouvernance (GRI 2-9), ni les publications GRI 2-10 à GRI 2-21, que STARS ne couvre pas ou seulement en partie (GRI 2-13 et GRI 2-14).</w:t>
+        <w:t>Ce rapport ne peut pas établir si l'université a défini des critères pour l'indépendance des membres de son organe de gouvernance, ou si elle a mis en place des procédures pour garantir la représentation de la diversité de genre au sein de son organe de gouvernance.</w:t>
       </w:r>
     </w:p>
     <w:p>
@@ -1954,27 +1899,27 @@
     </w:p>
     <w:p>
       <w:r>
-        <w:t>University of California, Berkeley (UC Berkeley) a publié un plan de durabilité (Sustainability Plan) et un plan d'action climat (Climate Action Plan). Son centre étudiant, le Student Environmental Resource Center (SERC), a adopté un plan stratégique qui vise à renforcer les programmes et les ressources pour approfondir l'engagement dans la communauté de la durabilité, et qui inclut des objectifs mesurables tels que l'expansion des opportunités de formation co-curriculaire et le développement de voies institutionnelles pour les clubs et les groupes étudiants pour accroître l'engagement intersectionnel avec le SERC.</w:t>
+        <w:t>L'université a publié un plan de durabilité (Sustainability Plan), aligné sur les politiques de durabilité du système de l'université de Californie. Elle est aussi signataire des Climate Leadership Commitments de Second Nature, qui comprennent le Carbon Commitment, un engagement de réduction des émissions de carbone.</w:t>
       </w:r>
     </w:p>
     <w:p>
       <w:r>
-        <w:t>UC Berkeley est signataire du Climate Leadership Commitments de Second Nature, qui inclut le Carbon Commitment. Cette déclaration externe renforce l'engagement de l'université à réduire les émissions de carbone et à renforcer la résilience face au changement climatique.</w:t>
+        <w:t>L'Office de la Durabilité de University of California, Berkeley (UC Berkeley), est dirigé par une équipe dédiée qui travaille à l'avancement des objectifs de durabilité de l'université et à la réalisation des engagements climatiques. L'équipe, dirigée par le responsable de la durabilité et des solutions au carbone, collabore avec les départements et les parties prenantes de l'université pour développer des stratégies et des plans de mise en œuvre.</w:t>
       </w:r>
     </w:p>
     <w:p>
       <w:r>
-        <w:t>L'Office de la durabilité de UC Berkeley est dirigé par une équipe dédiée qui se consacre à avancer les objectifs de durabilité de l'université et à satisfaire ses engagements climatiques. Cette équipe, dirigée par le responsable de la durabilité et des solutions au carbone, collabore avec les départements et les parties prenantes de UC Berkeley pour développer des stratégies qui réduisent les émissions de gaz à effet de serre, améliorent l'achat durable et favorisent la responsabilité environnementale dans les opérations quotidiennes.</w:t>
+        <w:t>UC Berkeley a également adopté une politique de durabilité dans ses procédures d'achat, qui oblige 100 % des demandes de propositions ou de qualifications à respecter les exigences de durabilité. L'université utilise EcoVadis pour évaluer les caractéristiques de durabilité de ses fournisseurs et ses lignes directrices de durabilité pour identifier les produits verts, qui incluent les certifications de durabilité requises et préférées.</w:t>
       </w:r>
     </w:p>
     <w:p>
       <w:r>
-        <w:t>UC Berkeley a une section dédiée sur son site web des ressources humaines qui expose les politiques liées aux droits des salariés, notamment le traitement équitable, les procédures de réclamation et l'équilibre vie professionnelle. Ces politiques couvrent des domaines tels que la lutte contre les discriminations, la protection des lanceurs d'alerte et les avantages pour les salariés, offrant ainsi une vue transparente des droits et du soutien offerts aux salariés.</w:t>
+        <w:t>UC Berkeley a également mis en place un programme de formation du personnel sur la durabilité, qui comprend des modules complémentaires conçus pour permettre aux employés de travailler et de se former à leur propre rythme.</w:t>
       </w:r>
     </w:p>
     <w:p>
       <w:r>
-        <w:t>L'université de Californie a également établi un Code des valeurs et des normes de conduite éthique qui s'applique à tous les campus de l'université, y compris Berkeley. Ce code met en avant l'engagement de l'université envers l'intégrité, le respect et la responsabilité dans ses relations avec les salariés.</w:t>
+        <w:t>(GRI 2-22, GRI 2-23, GRI 2-24, GRI 2-25, GRI 2-26, GRI 2-28)</w:t>
       </w:r>
     </w:p>
     <w:p>
@@ -1990,12 +1935,7 @@
     </w:p>
     <w:p>
       <w:r>
-        <w:t>Ce rapport ne peut pas établir les engagements politiques de UC Berkeley en ce qui concerne les droits humains et le devoir de vigilance, car STARS ne couvre pas ces aspects. De plus, STARS ne collecte pas les informations sur les mécanismes de demande de conseil et de signalement pour les personnes en relation d'affaires, ce qui constitue également un domaine non couvert par le rapport.</w:t>
-      </w:r>
-    </w:p>
-    <w:p>
-      <w:r>
-        <w:t>(GRI 2-22, GRI 2-23, GRI 2-26)</w:t>
+        <w:t>Ce rapport ne peut pas établir les engagements politiques de UC Berkeley, en matière de droits humains et de devoir de vigilance, car STARS ne couvre pas ces aspects. De plus, le rapport ne peut pas établir l'intégration des engagements politiques dans les procédures de l'université, car STARS ne fournit pas d'informations sur ces aspects. Enfin, le rapport ne peut pas établir les mécanismes de demande de conseil et de signalement pour les parties prenantes affectées, car STARS ne couvre que les salariés.</w:t>
       </w:r>
     </w:p>
     <w:p>
@@ -2380,27 +2320,27 @@
     </w:p>
     <w:p>
       <w:r>
-        <w:t>Le rapport STARS indique que l'université a mis en place des comités consultatifs pour l'engagement communautaire, qui impliquent des membres de la communauté locale, notamment dans les domaines de la santé publique, de la durabilité et de la justice sociale.</w:t>
+        <w:t>Plusieurs groupes de parties prenantes participent à la gouvernance de l'université : les étudiants, les enseignants-chercheurs, par le Sénat académique, et des membres de la communauté locale, par des comités consultatifs sur la santé publique, la durabilité et la justice sociale (GRI 2-29).</w:t>
       </w:r>
     </w:p>
     <w:p>
       <w:r>
-        <w:t>Ces instances donnent aux organisations communautaires un forum pour donner leur avis sur les politiques et les initiatives de l'université qui touchent la population locale. Les étudiants sont représentés au CACS, où plusieurs organisations étudiantes et services ont chacun un siège et une voix, et le personnel non académique participe à la gouvernance par des comités consultatifs comme le Chancellor's Staff Advisory Committee (CSAC).</w:t>
+        <w:t>L'université obtient 3,5 points STARS sur 4 au crédit PA-3, niveau élevé. L'université a plusieurs organes en place qui permettent aux étudiants de participer de manière démocratique à la gouvernance de l'établissement. Ces organes permettent aux étudiants d'avoir une voix dans les processus de décision, en particulier autour des politiques et des initiatives qui impactent la vie sur le campus, la durabilité et d'autres domaines d'intérêt pour les étudiants.</w:t>
       </w:r>
     </w:p>
     <w:p>
       <w:r>
-        <w:t>L'université a également mis en place des partenariats avec la communauté, tels que le programme College Corps, partenariat de l'État de Californie financé par California Volunteers, par lequel le Public Service Center a placé des étudiants de premier cycle dans des partenariats de justice climatique ou alimentaire avec des organisations locales.</w:t>
+        <w:t>L'université obtient 8 points STARS sur 8 au crédit EN-5, niveau maximal. L'université a des programmes conçus pour soutenir le service communautaire des employés. L'une des principales initiatives est le Cal Civic Engagement Program, qui encourage les enseignants et le personnel à contribuer à la communauté par le bénévolat et l'engagement civique, conformément à la mission de responsabilité sociale de l'université.</w:t>
       </w:r>
     </w:p>
     <w:p>
       <w:r>
-        <w:t>Enfin, l'université a mis en place des politiques pour protéger les droits des salariés, notamment en matière de traitement équitable, de procédures de réclamation et d'équilibre vie professionnelle/vie personnelle.</w:t>
+        <w:t>L'université obtient 9 points STARS sur 9 au crédit EN-6, niveau maximal. L'université a mis en place le Fonds de partenariats communautaires du chancelier (CCPF), qui emploie une approche structurée pour évaluer et améliorer les partenariats avec la communauté, en garantissant la réciprocité et le bénéfice mutuel.</w:t>
       </w:r>
     </w:p>
     <w:p>
       <w:r>
-        <w:t>(GRI 2-29)</w:t>
+        <w:t>L'université obtient 2,5 points STARS sur 3 au crédit PA-12, niveau élevé. L'université a une section dédiée sur son site web des ressources humaines qui expose les politiques liées aux droits des salariés, notamment le traitement équitable, les procédures de réclamation et l'équilibre vie professionnelle et vie personnelle. Les politiques couvrent des domaines tels que la lutte contre les discriminations, la protection des lanceurs d'alerte et les avantages sociaux.</w:t>
       </w:r>
     </w:p>
     <w:p>
@@ -2416,7 +2356,7 @@
     </w:p>
     <w:p>
       <w:r>
-        <w:t>Ce rapport ne peut pas établir les informations sur les fournisseurs de l'université, les groupes vulnérables ou la méthode d'identification des parties prenantes.</w:t>
+        <w:t>Ce rapport ne peut pas établir si l'université a identifié les groupes vulnérables ou si elle a mis en place une méthode d'identification des parties prenantes.</w:t>
       </w:r>
     </w:p>
     <w:p>
@@ -3360,211 +3300,49 @@
       </w:r>
     </w:p>
     <w:p>
+      <w:r>
+        <w:t>Le système énergétique du campus repose sur une centrale de cogénération au gaz, construite en 1987, principale source d'électricité et de chauffage des bâtiments ; elle produit de l'électricité et de la vapeur. Une partie de l'électricité vient du programme UC Clean Power, dont la part solaire est déclarée comme électricité renouvelable hors site certifiée (GRI 302-1).</w:t>
+      </w:r>
+    </w:p>
+    <w:p>
+      <w:r>
+        <w:t>Dans le cadre du programme de plafonnement et d'échange (Cap and Trade), l'université de Californie répartit chaque année des crédits de compensation entre ses campus selon leurs émissions ; cette année, les instruments de conformité retirés proviennent de projets forestiers aux États-Unis (GRI 305-1).</w:t>
+      </w:r>
+    </w:p>
+    <w:p>
+      <w:r>
+        <w:t>Le système de récupération d'eau de pluie et la noue végétalisée du Hearst Field Annex ont été créés comme projet de recherche, et Chou Hall, à la Haas School of Business, récupère et réutilise aussi l'eau de pluie (GRI 303-1).</w:t>
+      </w:r>
+    </w:p>
+    <w:p>
+      <w:r>
+        <w:t>Le compostage est intégré à tous les circuits de collecte du campus, avec envoi vers une installation de compostage industriel. La vaisselle réutilisable est en place dans tous les restaurants universitaires et la plupart des points de vente, et l'université travaille à remplacer les plastiques à usage unique et compostables des repas à emporter par de la fibre ou du réutilisable (GRI 306-2).</w:t>
+      </w:r>
+    </w:p>
+    <w:p>
+      <w:r>
+        <w:t>Ses lignes directrices d'achats durables imposent des exigences de durabilité à 100 % des appels d'offres, et l'université évalue les caractéristiques de durabilité de ses fournisseurs avec EcoVadis (GRI 308-1).</w:t>
+      </w:r>
+    </w:p>
+    <w:p>
+      <w:r>
+        <w:t>Plus de 35 % de la flotte du campus est considérée comme verte (OP-13). De nombreux bâtiments respectent la norme LEED-EBOM pour l'exploitation et la maintenance (OP-2). Tout le campus est entretenu sans engrais, fongicides ni pesticides inorganiques, sauf moins de 5 % des terrains (GRI 101-2). Le projet de rapport d'impact environnemental du plan de gestion de la végétation combustible dresse la liste des espèces menacées et vulnérables aux abords du Hill campus (GRI 101-5).</w:t>
+      </w:r>
+    </w:p>
+    <w:p>
       <w:pPr>
-        <w:pStyle w:val="Heading3"/>
+        <w:pStyle w:val="Heading2"/>
       </w:pPr>
       <w:r>
         <w:rPr>
           <w:color w:val="2F6F5E"/>
         </w:rPr>
-        <w:t>Énergie</w:t>
+        <w:t>Limites et omissions</w:t>
       </w:r>
     </w:p>
     <w:p>
       <w:r>
-        <w:t>L'université obtient 6,87 points STARS sur 10 au crédit OP-5, niveau intermédiaire. Une partie de l'électricité du campus provient du programme UC Clean Power : sa part solaire est déclarée comme électricité renouvelable hors site certifiée, et sa part de grande hydraulique comme électricité renouvelable hors site non certifiée.</w:t>
-      </w:r>
-    </w:p>
-    <w:p>
-      <w:pPr>
-        <w:pStyle w:val="Heading3"/>
-      </w:pPr>
-      <w:r>
-        <w:rPr>
-          <w:color w:val="2F6F5E"/>
-        </w:rPr>
-        <w:t>Émissions de gaz à effet de serre</w:t>
-      </w:r>
-    </w:p>
-    <w:p>
-      <w:r>
-        <w:t>L'université obtient 8,01 points STARS sur 16 au crédit OP-6, niveau intermédiaire. Dans le cadre du programme Cap and Trade, des crédits de compensation sont répartis chaque année entre les campus selon leurs émissions ; cette année, les instruments de conformité retirés proviennent de projets forestiers aux États-Unis.</w:t>
-      </w:r>
-    </w:p>
-    <w:p>
-      <w:pPr>
-        <w:pStyle w:val="Heading3"/>
-      </w:pPr>
-      <w:r>
-        <w:rPr>
-          <w:color w:val="2F6F5E"/>
-        </w:rPr>
-        <w:t>Eau</w:t>
-      </w:r>
-    </w:p>
-    <w:p>
-      <w:r>
-        <w:t>L'université obtient 2,43 points STARS sur 7 au crédit OP-3, niveau faible. Le campus a mis en place un système de récupération d'eau de pluie, notamment au sein de la Haas School of Business.</w:t>
-      </w:r>
-    </w:p>
-    <w:p>
-      <w:pPr>
-        <w:pStyle w:val="Heading3"/>
-      </w:pPr>
-      <w:r>
-        <w:rPr>
-          <w:color w:val="2F6F5E"/>
-        </w:rPr>
-        <w:t>Déchets</w:t>
-      </w:r>
-    </w:p>
-    <w:p>
-      <w:r>
-        <w:t>L'université obtient 3,27 points STARS sur 5 au crédit OP-12, niveau intermédiaire.</w:t>
-      </w:r>
-    </w:p>
-    <w:p>
-      <w:pPr>
-        <w:pStyle w:val="Heading3"/>
-      </w:pPr>
-      <w:r>
-        <w:rPr>
-          <w:color w:val="2F6F5E"/>
-        </w:rPr>
-        <w:t>Matériaux</w:t>
-      </w:r>
-    </w:p>
-    <w:p>
-      <w:r>
-        <w:t>L'université obtient 3,75 points STARS sur 4 au crédit OP-11, niveau élevé. Le compostage est intégré à tous les circuits de collecte du campus, et les déchets compostables sont envoyés vers une installation de compostage industriel.</w:t>
-      </w:r>
-    </w:p>
-    <w:p>
-      <w:pPr>
-        <w:pStyle w:val="Heading3"/>
-      </w:pPr>
-      <w:r>
-        <w:rPr>
-          <w:color w:val="2F6F5E"/>
-        </w:rPr>
-        <w:t>Système d'achats durables</w:t>
-      </w:r>
-    </w:p>
-    <w:p>
-      <w:r>
-        <w:t>L'université obtient 7 points STARS sur 7 au crédit OP-9, niveau maximal. Tous les appels d'offres intègrent des critères de durabilité ; l'université évalue ses fournisseurs avec EcoVadis, et ses lignes directrices d'achats durables visent notamment à réduire les émissions et les impacts carbone de la chaîne d'approvisionnement.</w:t>
-      </w:r>
-    </w:p>
-    <w:p>
-      <w:pPr>
-        <w:pStyle w:val="Heading3"/>
-      </w:pPr>
-      <w:r>
-        <w:rPr>
-          <w:color w:val="2F6F5E"/>
-        </w:rPr>
-        <w:t>Conception et construction des bâtiments</w:t>
-      </w:r>
-    </w:p>
-    <w:p>
-      <w:r>
-        <w:t>L'université obtient 2,91 points STARS sur 3 au crédit OP-1, niveau élevé.</w:t>
-      </w:r>
-    </w:p>
-    <w:p>
-      <w:pPr>
-        <w:pStyle w:val="Heading3"/>
-      </w:pPr>
-      <w:r>
-        <w:rPr>
-          <w:color w:val="2F6F5E"/>
-        </w:rPr>
-        <w:t>Exploitation et maintenance des bâtiments</w:t>
-      </w:r>
-    </w:p>
-    <w:p>
-      <w:r>
-        <w:t>L'université obtient 4 points STARS sur 5 au crédit OP-2, niveau élevé. De nombreux bâtiments du campus respectent la norme LEED-EBOM (exploitation et maintenance des bâtiments existants), qui met l'accent sur le nettoyage écologique, les matériaux durables, la qualité de l'air et la réduction des déchets.</w:t>
-      </w:r>
-    </w:p>
-    <w:p>
-      <w:pPr>
-        <w:pStyle w:val="Heading3"/>
-      </w:pPr>
-      <w:r>
-        <w:rPr>
-          <w:color w:val="2F6F5E"/>
-        </w:rPr>
-        <w:t>Flotte de véhicules</w:t>
-      </w:r>
-    </w:p>
-    <w:p>
-      <w:r>
-        <w:t>L'université obtient 0,28 point STARS sur 2 au crédit OP-13, niveau faible. Plus de 35 % de la flotte du campus est considérée comme verte, véhicules à carburant modulable compris ; les voiturettes électriques non immatriculées ne sont pas comptées dans la flotte.</w:t>
-      </w:r>
-    </w:p>
-    <w:p>
-      <w:pPr>
-        <w:pStyle w:val="Heading3"/>
-      </w:pPr>
-      <w:r>
-        <w:rPr>
-          <w:color w:val="2F6F5E"/>
-        </w:rPr>
-        <w:t>Modes de déplacement domicile-campus</w:t>
-      </w:r>
-    </w:p>
-    <w:p>
-      <w:r>
-        <w:t>L'université obtient 4,89 points STARS sur 6 au crédit OP-14, niveau élevé. La répartition des modes de déplacement provient d'une enquête annuelle sur les transports, diffusée par courriel à tout le campus ou à un échantillon représentatif.</w:t>
-      </w:r>
-    </w:p>
-    <w:p>
-      <w:pPr>
-        <w:pStyle w:val="Heading3"/>
-      </w:pPr>
-      <w:r>
-        <w:rPr>
-          <w:color w:val="2F6F5E"/>
-        </w:rPr>
-        <w:t>Voyages en avion</w:t>
-      </w:r>
-    </w:p>
-    <w:p>
-      <w:r>
-        <w:t>L'université obtient 2 points STARS sur 2 au crédit OP-15, niveau maximal. Le campus a mis en place des mesures pour réduire les émissions de gaz à effet de serre liées aux voyages en avion.</w:t>
-      </w:r>
-    </w:p>
-    <w:p>
-      <w:pPr>
-        <w:pStyle w:val="Heading3"/>
-      </w:pPr>
-      <w:r>
-        <w:rPr>
-          <w:color w:val="2F6F5E"/>
-        </w:rPr>
-        <w:t>Gestion écologique des espaces verts</w:t>
-      </w:r>
-    </w:p>
-    <w:p>
-      <w:r>
-        <w:t>L'université obtient 5 points STARS sur 5 au crédit OP-4, niveau maximal. Le campus a mis en place des espaces verts gérés de manière écologique.</w:t>
-      </w:r>
-    </w:p>
-    <w:p>
-      <w:pPr>
-        <w:pStyle w:val="Heading3"/>
-      </w:pPr>
-      <w:r>
-        <w:rPr>
-          <w:color w:val="2F6F5E"/>
-        </w:rPr>
-        <w:t>Évaluation de la biodiversité</w:t>
-      </w:r>
-    </w:p>
-    <w:p>
-      <w:r>
-        <w:t>L'université obtient 1 point STARS sur 1 au crédit IL-24, niveau maximal. Le projet de rapport d'impact environnemental (Draft EIR) du plan de gestion de la végétation combustible des espaces naturels (Wildland Vegetative Fuel Management Plan) décrit les zones importantes pour la biodiversité.</w:t>
+        <w:t>Ce rapport ne peut pas établir les émissions indirectes liées à l'énergie (GRI 305-2) ni les autres émissions indirectes, dont celles de la chaîne d'approvisionnement (GRI 305-3) : les valeurs détaillées de STARS n'ont pas été extraites.</w:t>
       </w:r>
     </w:p>
     <w:p>
@@ -3639,6 +3417,14 @@
         <w:t>Performance sociale et économique</w:t>
       </w:r>
     </w:p>
+    <w:p>
+      <w:r>
+        <w:rPr>
+          <w:i/>
+        </w:rPr>
+        <w:t>Section à relire : le juge automatique n'a pas pu la valider entièrement (voir l'annexe « Validation du rapport »).</w:t>
+      </w:r>
+    </w:p>
     <w:tbl>
       <w:tblPr>
         <w:tblStyle w:val="TableGrid"/>
@@ -4172,43 +3958,24 @@
       </w:r>
     </w:p>
     <w:p>
+      <w:pPr>
+        <w:pStyle w:val="Heading2"/>
+      </w:pPr>
       <w:r>
-        <w:t>University of California, Berkeley (UC Berkeley) a obtenu 4,34 points STARS sur 5 au crédit PA-13, niveau élevé, pour sa politique de salaire décent. Le salaire décent de référence est calculé avec le calculateur du Massachusetts Institute of Technology (MIT) ; le seuil horaire retenu pour le personnel tient compte du taux composite des avantages sociaux (CBR), actuellement de 42,8 %.</w:t>
+        <w:rPr>
+          <w:color w:val="2F6F5E"/>
+        </w:rPr>
+        <w:t>Équité salariale et salaire décent</w:t>
       </w:r>
     </w:p>
     <w:p>
       <w:r>
-        <w:t>L'université a également obtenu 2,5 points STARS sur 3 au crédit PA-12, niveau élevé, pour ses droits des salariés. Les employés doivent remplir les conditions de la politique de congé familial et médical (Family and Medical Leave Policy). Le site web des ressources humaines de l'université présente des politiques sur les droits des employés, notamment le traitement équitable, les procédures de réclamation et l'équilibre travail-vie.</w:t>
+        <w:t>L'université obtient 4,34 points STARS sur 5 au crédit PA-13, niveau élevé. Le salaire décent de référence est calculé avec le calculateur du Massachusetts Institute of Technology (MIT) ; le seuil horaire retenu pour le personnel tient compte du taux composite des avantages sociaux, actuellement de 42,8 %. La dernière analyse d'équité salariale, menée en 2023 sur le personnel de carrière et contractuel (PPSM), compare les rémunérations selon l'origine ethnique, l'identité de genre, l'orientation sexuelle, l'âge et le handicap.</w:t>
       </w:r>
     </w:p>
     <w:p>
       <w:r>
-        <w:t>L'université a obtenu 3 points STARS sur 3 au crédit PA-11, niveau maximal, pour sa santé, sécurité et bien-être. Le campus propose des ateliers de bien-être (série Mind-Body-Spirit) et applique une politique de campus sans fumée ni tabac, mise à jour par les services de santé universitaires (University Health Services).</w:t>
-      </w:r>
-    </w:p>
-    <w:p>
-      <w:r>
-        <w:t>L'université a obtenu 1,67 point STARS sur 2 au crédit PA-8, niveau élevé, pour la parité femmes-hommes.</w:t>
-      </w:r>
-    </w:p>
-    <w:p>
-      <w:r>
-        <w:t>L'université a obtenu 1,59 point STARS sur 3 au crédit PA-7, niveau intermédiaire, pour la représentation ethnique et raciale.</w:t>
-      </w:r>
-    </w:p>
-    <w:p>
-      <w:r>
-        <w:t>L'université a obtenu 2,5 points STARS sur 3 au crédit PA-9, niveau élevé, pour l'accès et l'accessibilité financière. Les données viennent de l'IPEDS : part des étudiants de premier cycle bénéficiant d'une bourse Pell, pour l'année universitaire débutant en 2021 (la plus récente disponible).</w:t>
-      </w:r>
-    </w:p>
-    <w:p>
-      <w:r>
-        <w:t>L'université a obtenu 3 points STARS sur 3 au crédit PA-6, niveau maximal, pour le climat institutionnel. Les organisations basées sur la race et l'ethnicité des employés comprennent Alianza, Asian Pacific American Systemwide Alliance, Black Staff &amp; Faculty Organization, MENASA et Native &amp; Indigenous Council.</w:t>
-      </w:r>
-    </w:p>
-    <w:p>
-      <w:r>
-        <w:t>L'université a obtenu 2,8 points STARS sur 3 au crédit PA-10, niveau élevé, pour la réussite étudiante.</w:t>
+        <w:t>(GRI 202-1)</w:t>
       </w:r>
     </w:p>
     <w:p>
@@ -4219,12 +3986,128 @@
         <w:rPr>
           <w:color w:val="2F6F5E"/>
         </w:rPr>
-        <w:t>Limites et omissions</w:t>
+        <w:t>Droits des salariés</w:t>
       </w:r>
     </w:p>
     <w:p>
       <w:r>
-        <w:t>Ce rapport ne peut pas établir le ratio entre le salaire d'entrée et le salaire minimum local par genre. Le salaire minimum figure dans un crédit sur l'emploi étudiant.</w:t>
+        <w:t>Le site des ressources humaines de l'université présente les politiques relatives aux droits des salariés : traitement équitable, procédures de réclamation, équilibre entre vie professionnelle et vie personnelle, lutte contre les discriminations, protection des lanceurs d'alerte et avantages sociaux. Pour bénéficier d'un congé familial ou médical, les salariés doivent remplir les conditions de la politique Family and Medical Leave.</w:t>
+      </w:r>
+    </w:p>
+    <w:p>
+      <w:r>
+        <w:t>(GRI 401-2)</w:t>
+      </w:r>
+    </w:p>
+    <w:p>
+      <w:pPr>
+        <w:pStyle w:val="Heading2"/>
+      </w:pPr>
+      <w:r>
+        <w:rPr>
+          <w:color w:val="2F6F5E"/>
+        </w:rPr>
+        <w:t>Santé, sécurité et bien-être</w:t>
+      </w:r>
+    </w:p>
+    <w:p>
+      <w:r>
+        <w:t>L'université propose une série d'ateliers de bien-être (Mind-Body-Spirit Wellness Workshop Series) consacrés à la santé globale : yoga, pleine conscience, écriture et exercices de respiration ; on peut y participer sans suivre toutes les séances.</w:t>
+      </w:r>
+    </w:p>
+    <w:p>
+      <w:r>
+        <w:t>(GRI 403-1)</w:t>
+      </w:r>
+    </w:p>
+    <w:p>
+      <w:pPr>
+        <w:pStyle w:val="Heading2"/>
+      </w:pPr>
+      <w:r>
+        <w:rPr>
+          <w:color w:val="2F6F5E"/>
+        </w:rPr>
+        <w:t>Parité femmes-hommes</w:t>
+      </w:r>
+    </w:p>
+    <w:p>
+      <w:r>
+        <w:t>Parmi les programmes de soutien aux femmes figurent le Gender Equity Resource Center (GenEq), le programme Empowering Womxn in STEAM (WiSE) et le programme de mentorat AWE.</w:t>
+      </w:r>
+    </w:p>
+    <w:p>
+      <w:r>
+        <w:t>(GRI 405-1)</w:t>
+      </w:r>
+    </w:p>
+    <w:p>
+      <w:pPr>
+        <w:pStyle w:val="Heading2"/>
+      </w:pPr>
+      <w:r>
+        <w:rPr>
+          <w:color w:val="2F6F5E"/>
+        </w:rPr>
+        <w:t>Représentation ethnique et raciale</w:t>
+      </w:r>
+    </w:p>
+    <w:p>
+      <w:r>
+        <w:t>La représentation est comparée à la population de l'État de Californie, d'après les données du US Census Bureau (County Population by Characteristics, 2023) ; les données sont produites par l'équipe Equity Data Initiatives du service Equity &amp; Inclusion.</w:t>
+      </w:r>
+    </w:p>
+    <w:p>
+      <w:r>
+        <w:t>(GRI 405-1)</w:t>
+      </w:r>
+    </w:p>
+    <w:p>
+      <w:pPr>
+        <w:pStyle w:val="Heading2"/>
+      </w:pPr>
+      <w:r>
+        <w:rPr>
+          <w:color w:val="2F6F5E"/>
+        </w:rPr>
+        <w:t>Accessibilité financière et accès</w:t>
+      </w:r>
+    </w:p>
+    <w:p>
+      <w:r>
+        <w:t>Le crédit s'appuie notamment sur la part des étudiants de premier cycle bénéficiant d'une bourse fédérale Pell, d'après l'IPEDS, pour l'année universitaire commençant en 2021 (la plus récente disponible).</w:t>
+      </w:r>
+    </w:p>
+    <w:p>
+      <w:pPr>
+        <w:pStyle w:val="Heading2"/>
+      </w:pPr>
+      <w:r>
+        <w:rPr>
+          <w:color w:val="2F6F5E"/>
+        </w:rPr>
+        <w:t>Climat institutionnel (inclusion)</w:t>
+      </w:r>
+    </w:p>
+    <w:p>
+      <w:r>
+        <w:t>Le personnel peut rejoindre des organisations fondées sur l'origine ethnique, comme Alianza, Asian Pacific American Systemwide Alliance, Black Staff &amp; Faculty Organization, MENASA et Native &amp; Indigenous Council.</w:t>
+      </w:r>
+    </w:p>
+    <w:p>
+      <w:pPr>
+        <w:pStyle w:val="Heading2"/>
+      </w:pPr>
+      <w:r>
+        <w:rPr>
+          <w:color w:val="2F6F5E"/>
+        </w:rPr>
+        <w:t>Réussite étudiante</w:t>
+      </w:r>
+    </w:p>
+    <w:p>
+      <w:r>
+        <w:t>Ce rapport ne peut pas établir les actions de l'université pour la réussite étudiante : les extraits STARS de ce crédit ne donnent que la source des données (Office of Planning and Analysis).</w:t>
       </w:r>
     </w:p>
     <w:p>
@@ -4953,58 +4836,146 @@
     </w:p>
     <w:p>
       <w:pPr>
-        <w:pStyle w:val="Heading2"/>
+        <w:pStyle w:val="Heading3"/>
       </w:pPr>
       <w:r>
         <w:rPr>
           <w:color w:val="2F6F5E"/>
         </w:rPr>
-        <w:t>Enseignement, recherche et engagement</w:t>
+        <w:t>Offre de cours en durabilité</w:t>
       </w:r>
     </w:p>
     <w:p>
       <w:r>
-        <w:t>L'université obtient 13,01 points STARS sur 14 au crédit AC-1, niveau élevé. L'information pour les offres de cours en durabilité a été collectée via un inventaire des cours de University of California, Berkeley (UC Berkeley) de 2021 à 2024, en filtrant les éléments qui se qualifient comme des cours axés sur la durabilité ou liés à la durabilité. Les cours qui se qualifient ont été comptabilisés comme des offres de cours en durabilité.</w:t>
+        <w:t>L'offre de cours en durabilité a été recensée à partir de l'inventaire des cours de 2021 à 2024 : le bureau Planning &amp; Analysis a recherché les mots-clés de durabilité de l'AASHE dans les descriptions du catalogue, puis des étudiants du Bureau de la durabilité ont classé les cours comme axés sur la durabilité ou liés à la durabilité.</w:t>
+      </w:r>
+    </w:p>
+    <w:p>
+      <w:pPr>
+        <w:pStyle w:val="Heading3"/>
+      </w:pPr>
+      <w:r>
+        <w:rPr>
+          <w:color w:val="2F6F5E"/>
+        </w:rPr>
+        <w:t>Programmes de premier cycle</w:t>
       </w:r>
     </w:p>
     <w:p>
       <w:r>
-        <w:t>L'université obtient 10,22 points STARS sur 15 au crédit AC-2, niveau intermédiaire. Une partie des programmes de premier cycle comporte l'obligation de suivre au moins un cours axé sur la durabilité (liste fournie dans le rapport STARS).</w:t>
+        <w:t>Les diplômes de premier cycle axés sur la durabilité, et ceux qui exigent au moins un cours axé sur la durabilité, sont listés dans le document joint au rapport STARS.</w:t>
+      </w:r>
+    </w:p>
+    <w:p>
+      <w:pPr>
+        <w:pStyle w:val="Heading3"/>
+      </w:pPr>
+      <w:r>
+        <w:rPr>
+          <w:color w:val="2F6F5E"/>
+        </w:rPr>
+        <w:t>Programmes de cycles supérieurs</w:t>
       </w:r>
     </w:p>
     <w:p>
       <w:r>
-        <w:t>L'université obtient 8 points STARS sur 8 au crédit AC-3, niveau maximal. Une partie des programmes de cycles supérieurs comporte un apprentissage axé sur la durabilité (liste fournie dans le rapport STARS).</w:t>
+        <w:t>Les programmes de cycles supérieurs axés sur la durabilité, et ceux qui comportent un apprentissage axé sur la durabilité, sont aussi listés dans ce document.</w:t>
+      </w:r>
+    </w:p>
+    <w:p>
+      <w:pPr>
+        <w:pStyle w:val="Heading3"/>
+      </w:pPr>
+      <w:r>
+        <w:rPr>
+          <w:color w:val="2F6F5E"/>
+        </w:rPr>
+        <w:t>Recherche en durabilité</w:t>
       </w:r>
     </w:p>
     <w:p>
       <w:r>
-        <w:t>L'université obtient 7,35 points STARS sur 10 au crédit AC-6, niveau intermédiaire. Un étudiant de premier cycle a créé une liste de mots-clés pour identifier la recherche en durabilité. L'étudiant a ensuite calculé le nombre d'employés engagés dans la recherche en durabilité et le nombre de départements universitaires engagés dans la recherche en durabilité.</w:t>
+        <w:t>L'université soutient la recherche interdisciplinaire en durabilité par des partenariats, notamment avec le Lawrence Berkeley National Laboratory ; le Berkeley Climate Change Network, par exemple, met en relation chercheurs et étudiants avec des financements et des collaborations sur la durabilité et la résilience. La recherche en durabilité a été repérée par mots-clés dans l'inventaire de la recherche des exercices 2022 à 2024, puis vérifiée par un étudiant du Bureau de la durabilité.</w:t>
+      </w:r>
+    </w:p>
+    <w:p>
+      <w:pPr>
+        <w:pStyle w:val="Heading3"/>
+      </w:pPr>
+      <w:r>
+        <w:rPr>
+          <w:color w:val="2F6F5E"/>
+        </w:rPr>
+        <w:t>Centre de recherche en durabilité</w:t>
       </w:r>
     </w:p>
     <w:p>
       <w:r>
-        <w:t>L'université obtient 6 points STARS sur 6 au crédit AC-7, niveau maximal. UC Berkeley compte plusieurs centres engagés dans des sujets liés à la durabilité, notamment le Sutardja Center for Entrepreneurship and Technology qui abrite le Alternative Meats X Lab.</w:t>
+        <w:t>Outre le Berkeley Climate Change Network et le centre de recherche CITRUS, plusieurs centres travaillent sur la durabilité, comme le Sutardja Center for Entrepreneurship and Technology, qui abrite l'Alternative Meats X Lab.</w:t>
+      </w:r>
+    </w:p>
+    <w:p>
+      <w:pPr>
+        <w:pStyle w:val="Heading3"/>
+      </w:pPr>
+      <w:r>
+        <w:rPr>
+          <w:color w:val="2F6F5E"/>
+        </w:rPr>
+        <w:t>Communication et sensibilisation</w:t>
       </w:r>
     </w:p>
     <w:p>
       <w:r>
-        <w:t>L'université obtient 5 points STARS sur 5 au crédit EN-1, niveau maximal. Les nouveaux étudiants rencontrent les services liés à la durabilité lors de l'orientation (Golden Bear Orientation), le nouveau personnel reçoit une présentation lors de son accueil, et le campus publie des tableaux de bord (émissions, énergie, eau) et des rapports de durabilité.</w:t>
+        <w:t>Le campus a mené plusieurs campagnes de sensibilisation à la durabilité ces dernières années, sur la protection de l'environnement et la justice sociale, notamment par des lettres d'information et des invitations envoyées sur les listes de diffusion de tout le campus.</w:t>
+      </w:r>
+    </w:p>
+    <w:p>
+      <w:pPr>
+        <w:pStyle w:val="Heading3"/>
+      </w:pPr>
+      <w:r>
+        <w:rPr>
+          <w:color w:val="2F6F5E"/>
+        </w:rPr>
+        <w:t>Activités parascolaires</w:t>
       </w:r>
     </w:p>
     <w:p>
       <w:r>
-        <w:t>L'université obtient 9 points STARS sur 9 au crédit EN-2, niveau maximal. Le centre étudiant de ressources environnementales (SERC) de UC Berkeley organise de nombreux événements axés sur la durabilité sur le campus, notamment la semaine de la justice climatique et la semaine de la Terre, une série de carrières environnementales, des formations à la justice environnementale et des événements d'éducation en plein air.</w:t>
+        <w:t>Le Student Environmental Resource Center (SERC), service du campus consacré aux activités co-curriculaires des étudiants intéressés par l'environnement, organise chaque semestre de nombreux événements, dont la Climate Justice Week et l'Earth Week, ainsi que le SERC Membership program et le Student Leadership Institute for Climate Resilience.</w:t>
+      </w:r>
+    </w:p>
+    <w:p>
+      <w:pPr>
+        <w:pStyle w:val="Heading3"/>
+      </w:pPr>
+      <w:r>
+        <w:rPr>
+          <w:color w:val="2F6F5E"/>
+        </w:rPr>
+        <w:t>Engagement et formation du personnel</w:t>
       </w:r>
     </w:p>
     <w:p>
       <w:r>
-        <w:t>L'université obtient 8 points STARS sur 8 au crédit EN-3, niveau maximal. Le Bureau de la durabilité a créé une formation à la durabilité pour le personnel (UC Berkeley Sustainability Staff Training), composée de modules que chacun suit à son rythme.</w:t>
+        <w:t>Le Bureau de la durabilité a créé une formation à la durabilité pour le personnel (UC Berkeley Sustainability Staff Training), composée de modules que chacun suit à son rythme.</w:t>
+      </w:r>
+    </w:p>
+    <w:p>
+      <w:pPr>
+        <w:pStyle w:val="Heading3"/>
+      </w:pPr>
+      <w:r>
+        <w:rPr>
+          <w:color w:val="2F6F5E"/>
+        </w:rPr>
+        <w:t>Engagement civique</w:t>
       </w:r>
     </w:p>
     <w:p>
       <w:r>
-        <w:t>L'université obtient 8 points STARS sur 8 au crédit EN-5, niveau maximal.</w:t>
+        <w:t>Le Public Service Center réunit étudiants, enseignants et communautés au service de la justice sociale et de l'engagement civique, et le Cal Civic Engagement Program encourage les enseignants et le personnel à s'engager par le bénévolat.</w:t>
       </w:r>
     </w:p>
     <w:p>
@@ -18055,7 +18026,7 @@
               <w:rPr>
                 <w:sz w:val="17"/>
               </w:rPr>
-              <w:t>83%</w:t>
+              <w:t>0%</w:t>
             </w:r>
           </w:p>
         </w:tc>
@@ -18091,7 +18062,7 @@
               <w:rPr>
                 <w:sz w:val="17"/>
               </w:rPr>
-              <w:t>9.0 min</w:t>
+              <w:t>7.5 min</w:t>
             </w:r>
           </w:p>
         </w:tc>
@@ -18201,7 +18172,7 @@
               <w:rPr>
                 <w:sz w:val="17"/>
               </w:rPr>
-              <w:t>100%</w:t>
+              <w:t>83%</w:t>
             </w:r>
           </w:p>
         </w:tc>
@@ -18255,7 +18226,7 @@
               <w:rPr>
                 <w:sz w:val="17"/>
               </w:rPr>
-              <w:t>9.1 min</w:t>
+              <w:t>5.4 min</w:t>
             </w:r>
           </w:p>
         </w:tc>
@@ -18311,7 +18282,7 @@
               <w:rPr>
                 <w:sz w:val="17"/>
               </w:rPr>
-              <w:t>2</w:t>
+              <w:t>1</w:t>
             </w:r>
           </w:p>
         </w:tc>
@@ -18329,7 +18300,7 @@
               <w:rPr>
                 <w:sz w:val="17"/>
               </w:rPr>
-              <w:t>1</w:t>
+              <w:t>0</w:t>
             </w:r>
           </w:p>
         </w:tc>
@@ -18383,7 +18354,7 @@
               <w:rPr>
                 <w:sz w:val="17"/>
               </w:rPr>
-              <w:t>0%</w:t>
+              <w:t>100%</w:t>
             </w:r>
           </w:p>
         </w:tc>
@@ -18419,7 +18390,7 @@
               <w:rPr>
                 <w:sz w:val="17"/>
               </w:rPr>
-              <w:t>12.3 min</w:t>
+              <w:t>8.4 min</w:t>
             </w:r>
           </w:p>
         </w:tc>
@@ -18511,7 +18482,7 @@
               <w:rPr>
                 <w:sz w:val="17"/>
               </w:rPr>
-              <w:t>3/5</w:t>
+              <w:t>4/5</w:t>
             </w:r>
           </w:p>
         </w:tc>
@@ -18547,7 +18518,7 @@
               <w:rPr>
                 <w:sz w:val="17"/>
               </w:rPr>
-              <w:t>50%</w:t>
+              <w:t>100%</w:t>
             </w:r>
           </w:p>
         </w:tc>
@@ -18583,7 +18554,7 @@
               <w:rPr>
                 <w:sz w:val="17"/>
               </w:rPr>
-              <w:t>12.2 min</w:t>
+              <w:t>11.6 min</w:t>
             </w:r>
           </w:p>
         </w:tc>
@@ -18693,7 +18664,7 @@
               <w:rPr>
                 <w:sz w:val="17"/>
               </w:rPr>
-              <w:t>100%</w:t>
+              <w:t>83%</w:t>
             </w:r>
           </w:p>
         </w:tc>
@@ -18711,7 +18682,7 @@
               <w:rPr>
                 <w:sz w:val="17"/>
               </w:rPr>
-              <w:t>100%</w:t>
+              <w:t>0%</w:t>
             </w:r>
           </w:p>
         </w:tc>
@@ -18747,7 +18718,7 @@
               <w:rPr>
                 <w:sz w:val="17"/>
               </w:rPr>
-              <w:t>6.8 min</w:t>
+              <w:t>8.8 min</w:t>
             </w:r>
           </w:p>
         </w:tc>
@@ -18803,7 +18774,7 @@
               <w:rPr>
                 <w:sz w:val="17"/>
               </w:rPr>
-              <w:t>2</w:t>
+              <w:t>1</w:t>
             </w:r>
           </w:p>
         </w:tc>
@@ -18821,7 +18792,7 @@
               <w:rPr>
                 <w:sz w:val="17"/>
               </w:rPr>
-              <w:t>1</w:t>
+              <w:t>0</w:t>
             </w:r>
           </w:p>
         </w:tc>
@@ -18857,7 +18828,7 @@
               <w:rPr>
                 <w:sz w:val="17"/>
               </w:rPr>
-              <w:t>83%</w:t>
+              <w:t>100%</w:t>
             </w:r>
           </w:p>
         </w:tc>
@@ -18875,7 +18846,7 @@
               <w:rPr>
                 <w:sz w:val="17"/>
               </w:rPr>
-              <w:t>0%</w:t>
+              <w:t>100%</w:t>
             </w:r>
           </w:p>
         </w:tc>
@@ -18911,7 +18882,7 @@
               <w:rPr>
                 <w:sz w:val="17"/>
               </w:rPr>
-              <w:t>21.2 min</w:t>
+              <w:t>17.5 min</w:t>
             </w:r>
           </w:p>
         </w:tc>
@@ -18949,7 +18920,7 @@
               <w:rPr>
                 <w:sz w:val="17"/>
               </w:rPr>
-              <w:t>validée</w:t>
+              <w:t>à relire</w:t>
             </w:r>
           </w:p>
         </w:tc>
@@ -18967,6 +18938,24 @@
               <w:rPr>
                 <w:sz w:val="17"/>
               </w:rPr>
+              <w:t>2</w:t>
+            </w:r>
+          </w:p>
+        </w:tc>
+        <w:tc>
+          <w:tcPr>
+            <w:tcW w:type="dxa" w:w="960"/>
+          </w:tcPr>
+          <w:p>
+            <w:r>
+              <w:rPr>
+                <w:sz w:val="17"/>
+              </w:rPr>
+            </w:r>
+            <w:r>
+              <w:rPr>
+                <w:sz w:val="17"/>
+              </w:rPr>
               <w:t>1</w:t>
             </w:r>
           </w:p>
@@ -18985,7 +18974,7 @@
               <w:rPr>
                 <w:sz w:val="17"/>
               </w:rPr>
-              <w:t>0</w:t>
+              <w:t>2/5</w:t>
             </w:r>
           </w:p>
         </w:tc>
@@ -19003,7 +18992,7 @@
               <w:rPr>
                 <w:sz w:val="17"/>
               </w:rPr>
-              <w:t>4/5</w:t>
+              <w:t>67%</w:t>
             </w:r>
           </w:p>
         </w:tc>
@@ -19021,7 +19010,7 @@
               <w:rPr>
                 <w:sz w:val="17"/>
               </w:rPr>
-              <w:t>83%</w:t>
+              <w:t>88%</w:t>
             </w:r>
           </w:p>
         </w:tc>
@@ -19039,7 +19028,7 @@
               <w:rPr>
                 <w:sz w:val="17"/>
               </w:rPr>
-              <w:t>0%</w:t>
+              <w:t>6 sur 18</w:t>
             </w:r>
           </w:p>
         </w:tc>
@@ -19057,25 +19046,7 @@
               <w:rPr>
                 <w:sz w:val="17"/>
               </w:rPr>
-              <w:t>6 sur 18</w:t>
-            </w:r>
-          </w:p>
-        </w:tc>
-        <w:tc>
-          <w:tcPr>
-            <w:tcW w:type="dxa" w:w="960"/>
-          </w:tcPr>
-          <w:p>
-            <w:r>
-              <w:rPr>
-                <w:sz w:val="17"/>
-              </w:rPr>
-            </w:r>
-            <w:r>
-              <w:rPr>
-                <w:sz w:val="17"/>
-              </w:rPr>
-              <w:t>12.9 min</w:t>
+              <w:t>16.4 min</w:t>
             </w:r>
           </w:p>
         </w:tc>
@@ -19131,7 +19102,7 @@
               <w:rPr>
                 <w:sz w:val="17"/>
               </w:rPr>
-              <w:t>2</w:t>
+              <w:t>1</w:t>
             </w:r>
           </w:p>
         </w:tc>
@@ -19149,7 +19120,7 @@
               <w:rPr>
                 <w:sz w:val="17"/>
               </w:rPr>
-              <w:t>1</w:t>
+              <w:t>0</w:t>
             </w:r>
           </w:p>
         </w:tc>
@@ -19185,7 +19156,7 @@
               <w:rPr>
                 <w:sz w:val="17"/>
               </w:rPr>
-              <w:t>83%</w:t>
+              <w:t>100%</w:t>
             </w:r>
           </w:p>
         </w:tc>
@@ -19239,7 +19210,7 @@
               <w:rPr>
                 <w:sz w:val="17"/>
               </w:rPr>
-              <w:t>15.6 min</w:t>
+              <w:t>13.7 min</w:t>
             </w:r>
           </w:p>
         </w:tc>
@@ -19262,12 +19233,12 @@
         <w:t>Bilan :</w:t>
       </w:r>
       <w:r>
-        <w:t xml:space="preserve"> 8 section(s) validée(s) sur 8 ; fidélité moyenne 94% ; 3 version(s) rejetée(s) par le garde-fou avant le juge. Aucun nombre du texte final n'a été écrit par le modèle.</w:t>
+        <w:t xml:space="preserve"> 7 section(s) validée(s) sur 8 ; fidélité moyenne 92% ; 1 version(s) rejetée(s) par le garde-fou avant le juge. Aucun nombre du texte final n'a été écrit par le modèle.</w:t>
       </w:r>
     </w:p>
     <w:p>
       <w:r>
-        <w:t>2 violation(s) signalée(s) par le juge ont été écartées car contredites par le contrôle déterministe (par exemple une « revendication de conformité GRI » absente du texte) : le juge 8B se trompe parfois, le code tranche sur ce qu'il sait vérifier.</w:t>
+        <w:t>4 violation(s) signalée(s) par le juge ont été écartées car contredites par le contrôle déterministe (par exemple une « revendication de conformité GRI » absente du texte) : le juge 8B se trompe parfois, le code tranche sur ce qu'il sait vérifier.</w:t>
       </w:r>
     </w:p>
     <w:p>
@@ -19278,7 +19249,7 @@
         <w:t>Relecture hors pipeline</w:t>
       </w:r>
       <w:r>
-        <w:t xml:space="preserve"> (6 octobre 2026) : 35 correction(s) dans 8 section(s). Phrases supprimées ou reformulées à partir des textes STARS uniquement, sans chiffre tapé à la main. Les corrections ont été proposées par l'assistant Claude Code (IA) à la demande de Wiem Ben Hassine, chacune avec sa source STARS ; elles deviennent une relecture humaine une fois validées par elle. Liste détaillée : </w:t>
+        <w:t xml:space="preserve"> (6 octobre 2026) : 34 correction(s) dans 8 section(s). Phrases supprimées ou reformulées à partir des textes STARS uniquement, sans chiffre tapé à la main. Les corrections ont été proposées par l'assistant Claude Code (IA) à la demande de Wiem Ben Hassine, chacune avec sa source STARS ; elles deviennent une relecture humaine une fois validées par elle. Liste détaillée : </w:t>
       </w:r>
       <w:r>
         <w:rPr>
@@ -19306,6 +19277,45 @@
       </w:r>
       <w:r>
         <w:t>.</w:t>
+      </w:r>
+    </w:p>
+    <w:p>
+      <w:r>
+        <w:rPr>
+          <w:b/>
+        </w:rPr>
+        <w:t>À relire par un humain</w:t>
+      </w:r>
+      <w:r>
+        <w:t xml:space="preserve"> — affirmations que le juge n'a pas trouvées dans les sources :</w:t>
+      </w:r>
+    </w:p>
+    <w:p>
+      <w:pPr>
+        <w:pStyle w:val="ListBullet"/>
+      </w:pPr>
+      <w:r>
+        <w:rPr>
+          <w:i/>
+        </w:rPr>
+        <w:t>Performance sociale et économique</w:t>
+      </w:r>
+      <w:r>
+        <w:t xml:space="preserve"> : « Le salaire minimum local est utilisé pour calculer le salaire décent. »</w:t>
+      </w:r>
+    </w:p>
+    <w:p>
+      <w:pPr>
+        <w:pStyle w:val="ListBullet"/>
+      </w:pPr>
+      <w:r>
+        <w:rPr>
+          <w:i/>
+        </w:rPr>
+        <w:t>Performance sociale et économique</w:t>
+      </w:r>
+      <w:r>
+        <w:t xml:space="preserve"> : « L'université a mis en place des politiques pour protéger les droits des salariés, notamment la lutte contre la discrimination, la protection »</w:t>
       </w:r>
     </w:p>
     <w:p>

</xml_diff>

<commit_message>
Apply Wiem's choice: new Cork report, previous Berkeley and TU Dublin reports
Berkeley and TU Dublin model texts and reviews restored from 8d65bfd; all
reports re-rendered without the LLM. BILAN_TESTS section 11: final choice,
179 tests, no difference on the numbers, validated sections and review
corrections per university.
</commit_message>
<xml_diff>
--- a/outputs/berkeley/rapport_berkeley.docx
+++ b/outputs/berkeley/rapport_berkeley.docx
@@ -783,12 +783,27 @@
     </w:p>
     <w:p>
       <w:r>
-        <w:t>L'Office de la durabilité de University of California, Berkeley (UC Berkeley), a mené le processus de collecte de données pour le rapport STARS, en utilisant divers outils et plateformes internes et externes pour recueillir et analyser les données. Des représentants de plusieurs services du campus, dont Facilities Services et Residential Life, y ont participé dès la planification ; l'Office de la durabilité a ensuite regroupé les données dans une base centrale et les a recoupées entre services.</w:t>
+        <w:t>University of California, Berkeley (UC Berkeley) est une institution universitaire située dans la ville de Berkeley, en Californie. Elle fait partie du système de l'Université de Californie, dont le conseil des régents (Board of Regents) gouverne l'ensemble des campus.</w:t>
       </w:r>
     </w:p>
     <w:p>
       <w:r>
-        <w:t>Le périmètre du rapport couvre les sites sur lesquels le campus exerce le contrôle opérationnel : le campus principal, le Hill campus voisin, la Richmond Field Station et d'autres stations et réserves gérées par le campus, ainsi que des bâtiments qu'il possède en divers lieux (GRI 2-2).</w:t>
+        <w:t>UC Berkeley a déclaré que son périmètre d'activité est celui pour lequel elle conserve le contrôle opérationnel.</w:t>
+      </w:r>
+    </w:p>
+    <w:p>
+      <w:r>
+        <w:t>(GRI 2-1)</w:t>
+      </w:r>
+    </w:p>
+    <w:p>
+      <w:r>
+        <w:t>UC Berkeley a déclaré que son périmètre d'activité comprend les entités suivantes : le campus principal, le Hill campus, le Richmond Field Station et les réserves opérées par l'université.</w:t>
+      </w:r>
+    </w:p>
+    <w:p>
+      <w:r>
+        <w:t>(GRI 2-2)</w:t>
       </w:r>
     </w:p>
     <w:p>
@@ -804,7 +819,42 @@
     </w:p>
     <w:p>
       <w:r>
-        <w:t>Ce rapport ne peut pas établir la dénomination légale, le siège ou les pays d'activité de l'université, ni la période de reporting, la fréquence ou le point de contact. Les données STARS sont autodéclarées et non vérifiées par l'AASHE.</w:t>
+        <w:t>Ce rapport ne peut pas établir les détails sur la dénomination légale, le siège et les pays d'activité de UC Berkeley, car ces informations ne sont pas collectées par STARS.</w:t>
+      </w:r>
+    </w:p>
+    <w:p>
+      <w:r>
+        <w:t>(GRI 2-1)</w:t>
+      </w:r>
+    </w:p>
+    <w:p>
+      <w:r>
+        <w:t>Ce rapport ne peut pas établir la période de reporting, la fréquence et le point de contact de UC Berkeley, car ces informations ne sont pas collectées par STARS.</w:t>
+      </w:r>
+    </w:p>
+    <w:p>
+      <w:r>
+        <w:t>(GRI 2-3)</w:t>
+      </w:r>
+    </w:p>
+    <w:p>
+      <w:r>
+        <w:t>Ce rapport ne peut pas établir la vérification externe de UC Berkeley, car les informations sur la norme d'assurance, le niveau d'assurance et la relation avec le vérificateur ne sont pas collectées par STARS.</w:t>
+      </w:r>
+    </w:p>
+    <w:p>
+      <w:r>
+        <w:t>(GRI 2-5)</w:t>
+      </w:r>
+    </w:p>
+    <w:p>
+      <w:r>
+        <w:t>Ce rapport ne peut pas établir les activités, la chaîne de valeur et les relations d'affaires de UC Berkeley, car ces informations ne sont pas collectées par STARS.</w:t>
+      </w:r>
+    </w:p>
+    <w:p>
+      <w:r>
+        <w:t>(GRI 2-6)</w:t>
       </w:r>
     </w:p>
     <w:p>
@@ -1025,11 +1075,6 @@
       </w:r>
     </w:p>
     <w:p>
-      <w:r>
-        <w:t>L'université a publié un plan de durabilité (Sustainability Plan) qui fixe des objectifs pour l'énergie, l'eau, la réduction des déchets, l'alimentation durable et la biodiversité ; il est aligné sur les politiques de durabilité du système de l'université de Californie, avec des objectifs et un calendrier propres au campus. Son volet climat et résilience vise une transition juste et équitable vers un campus résilient, à énergie propre et zéro carbone. Le centre étudiant SERC a aussi adopté un plan stratégique (2017-2022) avec des objectifs mesurables, comme élargir l'accès aux activités d'apprentissage co-curriculaires.</w:t>
-      </w:r>
-    </w:p>
-    <w:p>
       <w:pPr>
         <w:pStyle w:val="Heading2"/>
       </w:pPr>
@@ -1037,12 +1082,17 @@
         <w:rPr>
           <w:color w:val="2F6F5E"/>
         </w:rPr>
-        <w:t>Limites et omissions</w:t>
+        <w:t>Gestion des thèmes matériels</w:t>
       </w:r>
     </w:p>
     <w:p>
       <w:r>
-        <w:t>Ce rapport ne peut pas établir les impacts environnementaux de la stratégie de durabilité de l'université, ni les enseignements tirés de ses activités de durabilité.</w:t>
+        <w:t>Le Student Environmental Resource Center (SERC) de l'université a adopté un plan stratégique 2017-2022 qui inclut des objectifs mesurables, tels que l'expansion de l'accès et des opportunités de formation co-curriculaires et le développement de voies institutionnelles pour les clubs et les groupes étudiants pour accroître leur engagement intersectionnel avec le Centre de ressources environnementales (SERC). Le plan stratégique comprend également des objectifs stratégiques sous le but de renforcer les programmes et les ressources pour approfondir l'engagement dans la communauté de la durabilité.</w:t>
+      </w:r>
+    </w:p>
+    <w:p>
+      <w:r>
+        <w:t>L'université a aussi publié un plan de durabilité (Sustainability Plan), avec des objectifs pour l'énergie, l'eau, les déchets, l'alimentation durable et la biodiversité, et un plan d'action climat (Climate Action Plan). Elle suit la politique de pratiques durables (Sustainable Practices Policy) du système UC, qui demande à tous les sites UC de réduire toutes leurs émissions d'au moins 90 % d'ici 2045 et d'éliminer les émissions restantes par des crédits de captage et de stockage du carbone.</w:t>
       </w:r>
     </w:p>
     <w:p>
@@ -1427,22 +1477,27 @@
     </w:p>
     <w:p>
       <w:r>
-        <w:t>L'université obtient 3,5 points STARS sur 4 au crédit PA-3, niveau élevé.</w:t>
+        <w:t>University of California, Berkeley (UC Berkeley) a plusieurs responsables de la durabilité (Sustainability Officers) au Bureau de la durabilité, à Haas et au SERC. UC Berkeley inclut des représentants étudiants dans son organe de décision le plus élevé, le conseil des régents de l'université de Californie. Bien que le conseil des régents gouverne l'ensemble du système de l'université de Californie et non seulement le campus de Berkeley, il exerce l'autorité ultime sur les politiques, les finances et la planification stratégique de l'université de Californie, y compris le campus de Berkeley.</w:t>
       </w:r>
     </w:p>
     <w:p>
       <w:r>
-        <w:t>L'Office de la durabilité (Office of Sustainability) fournit une direction du campus en fixant des objectifs de durabilité ambitieux et des stratégies, et en accélérant la réalisation de ces objectifs grâce à la mise en œuvre de projets, à la planification, aux partenariats et à la participation de la communauté. (GRI 2-9)</w:t>
+        <w:t>UC Berkeley a plusieurs organes permanents qui permettent au personnel académique de participer à la gouvernance de l'institution. Le principal est la division de Berkeley du Sénat académique, qui fait partie du Sénat académique de l'ensemble du système de l'université de Californie. Ce Sénat fournit aux membres du personnel académique un moyen structuré et démocratique de participer à la gouvernance du campus et à la prise de décision.</w:t>
       </w:r>
     </w:p>
     <w:p>
       <w:r>
-        <w:t>Les enseignants-chercheurs réunis au sein du Sénat académique (Academic Senate) exercent les responsabilités de gouvernance partagée fixées par les Régents : le conseil des Régents (Board of Regents) confie au Sénat le contrôle direct des questions académiques essentielles (politique académique, conditions d'admission et de délivrance des diplômes, cours et programmes) et un rôle de conseil sur les nominations, les promotions et les budgets. (GRI 2-9)</w:t>
+        <w:t>UC Berkeley obtient 3,5 points STARS sur 4 au crédit PA-3, niveau élevé.</w:t>
       </w:r>
     </w:p>
     <w:p>
       <w:r>
-        <w:t>Le conseil des Régents, plus haute instance de décision, comprend des représentants étudiants ; il gouverne l'ensemble du système de l'université de Californie, et pas seulement le campus de Berkeley, et exerce l'autorité ultime sur les politiques, les finances et la planification stratégique de tous les campus. (GRI 2-9)</w:t>
+        <w:t>UC Berkeley obtient 4 points STARS sur 4 au crédit PA-4, niveau maximal.</w:t>
+      </w:r>
+    </w:p>
+    <w:p>
+      <w:r>
+        <w:t>UC Berkeley obtient 2,51 points STARS sur 6 au crédit PA-5, niveau intermédiaire.</w:t>
       </w:r>
     </w:p>
     <w:p>
@@ -1458,7 +1513,7 @@
     </w:p>
     <w:p>
       <w:r>
-        <w:t>Ce rapport ne peut pas établir si l'université a défini des critères pour l'indépendance des membres de son organe de gouvernance, ou si elle a mis en place des procédures pour garantir la représentation de la diversité de genre au sein de son organe de gouvernance.</w:t>
+        <w:t>Ce rapport ne peut pas établir la composition détaillée de l'organe de gouvernance (GRI 2-9), ni les publications GRI 2-10 à GRI 2-21, que STARS ne couvre pas ou seulement en partie (GRI 2-13 et GRI 2-14).</w:t>
       </w:r>
     </w:p>
     <w:p>
@@ -1899,27 +1954,27 @@
     </w:p>
     <w:p>
       <w:r>
-        <w:t>L'université a publié un plan de durabilité (Sustainability Plan), aligné sur les politiques de durabilité du système de l'université de Californie. Elle est aussi signataire des Climate Leadership Commitments de Second Nature, qui comprennent le Carbon Commitment, un engagement de réduction des émissions de carbone.</w:t>
+        <w:t>University of California, Berkeley (UC Berkeley) a publié un plan de durabilité (Sustainability Plan) et un plan d'action climat (Climate Action Plan). Son centre étudiant, le Student Environmental Resource Center (SERC), a adopté un plan stratégique qui vise à renforcer les programmes et les ressources pour approfondir l'engagement dans la communauté de la durabilité, et qui inclut des objectifs mesurables tels que l'expansion des opportunités de formation co-curriculaire et le développement de voies institutionnelles pour les clubs et les groupes étudiants pour accroître l'engagement intersectionnel avec le SERC.</w:t>
       </w:r>
     </w:p>
     <w:p>
       <w:r>
-        <w:t>L'Office de la Durabilité de University of California, Berkeley (UC Berkeley), est dirigé par une équipe dédiée qui travaille à l'avancement des objectifs de durabilité de l'université et à la réalisation des engagements climatiques. L'équipe, dirigée par le responsable de la durabilité et des solutions au carbone, collabore avec les départements et les parties prenantes de l'université pour développer des stratégies et des plans de mise en œuvre.</w:t>
+        <w:t>UC Berkeley est signataire du Climate Leadership Commitments de Second Nature, qui inclut le Carbon Commitment. Cette déclaration externe renforce l'engagement de l'université à réduire les émissions de carbone et à renforcer la résilience face au changement climatique.</w:t>
       </w:r>
     </w:p>
     <w:p>
       <w:r>
-        <w:t>UC Berkeley a également adopté une politique de durabilité dans ses procédures d'achat, qui oblige 100 % des demandes de propositions ou de qualifications à respecter les exigences de durabilité. L'université utilise EcoVadis pour évaluer les caractéristiques de durabilité de ses fournisseurs et ses lignes directrices de durabilité pour identifier les produits verts, qui incluent les certifications de durabilité requises et préférées.</w:t>
+        <w:t>L'Office de la durabilité de UC Berkeley est dirigé par une équipe dédiée qui se consacre à avancer les objectifs de durabilité de l'université et à satisfaire ses engagements climatiques. Cette équipe, dirigée par le responsable de la durabilité et des solutions au carbone, collabore avec les départements et les parties prenantes de UC Berkeley pour développer des stratégies qui réduisent les émissions de gaz à effet de serre, améliorent l'achat durable et favorisent la responsabilité environnementale dans les opérations quotidiennes.</w:t>
       </w:r>
     </w:p>
     <w:p>
       <w:r>
-        <w:t>UC Berkeley a également mis en place un programme de formation du personnel sur la durabilité, qui comprend des modules complémentaires conçus pour permettre aux employés de travailler et de se former à leur propre rythme.</w:t>
+        <w:t>UC Berkeley a une section dédiée sur son site web des ressources humaines qui expose les politiques liées aux droits des salariés, notamment le traitement équitable, les procédures de réclamation et l'équilibre vie professionnelle. Ces politiques couvrent des domaines tels que la lutte contre les discriminations, la protection des lanceurs d'alerte et les avantages pour les salariés, offrant ainsi une vue transparente des droits et du soutien offerts aux salariés.</w:t>
       </w:r>
     </w:p>
     <w:p>
       <w:r>
-        <w:t>(GRI 2-22, GRI 2-23, GRI 2-24, GRI 2-25, GRI 2-26, GRI 2-28)</w:t>
+        <w:t>L'université de Californie a également établi un Code des valeurs et des normes de conduite éthique qui s'applique à tous les campus de l'université, y compris Berkeley. Ce code met en avant l'engagement de l'université envers l'intégrité, le respect et la responsabilité dans ses relations avec les salariés.</w:t>
       </w:r>
     </w:p>
     <w:p>
@@ -1935,7 +1990,12 @@
     </w:p>
     <w:p>
       <w:r>
-        <w:t>Ce rapport ne peut pas établir les engagements politiques de UC Berkeley, en matière de droits humains et de devoir de vigilance, car STARS ne couvre pas ces aspects. De plus, le rapport ne peut pas établir l'intégration des engagements politiques dans les procédures de l'université, car STARS ne fournit pas d'informations sur ces aspects. Enfin, le rapport ne peut pas établir les mécanismes de demande de conseil et de signalement pour les parties prenantes affectées, car STARS ne couvre que les salariés.</w:t>
+        <w:t>Ce rapport ne peut pas établir les engagements politiques de UC Berkeley en ce qui concerne les droits humains et le devoir de vigilance, car STARS ne couvre pas ces aspects. De plus, STARS ne collecte pas les informations sur les mécanismes de demande de conseil et de signalement pour les personnes en relation d'affaires, ce qui constitue également un domaine non couvert par le rapport.</w:t>
+      </w:r>
+    </w:p>
+    <w:p>
+      <w:r>
+        <w:t>(GRI 2-22, GRI 2-23, GRI 2-26)</w:t>
       </w:r>
     </w:p>
     <w:p>
@@ -2320,27 +2380,27 @@
     </w:p>
     <w:p>
       <w:r>
-        <w:t>Plusieurs groupes de parties prenantes participent à la gouvernance de l'université : les étudiants, les enseignants-chercheurs, par le Sénat académique, et des membres de la communauté locale, par des comités consultatifs sur la santé publique, la durabilité et la justice sociale (GRI 2-29).</w:t>
+        <w:t>Le rapport STARS indique que l'université a mis en place des comités consultatifs pour l'engagement communautaire, qui impliquent des membres de la communauté locale, notamment dans les domaines de la santé publique, de la durabilité et de la justice sociale.</w:t>
       </w:r>
     </w:p>
     <w:p>
       <w:r>
-        <w:t>L'université obtient 3,5 points STARS sur 4 au crédit PA-3, niveau élevé. L'université a plusieurs organes en place qui permettent aux étudiants de participer de manière démocratique à la gouvernance de l'établissement. Ces organes permettent aux étudiants d'avoir une voix dans les processus de décision, en particulier autour des politiques et des initiatives qui impactent la vie sur le campus, la durabilité et d'autres domaines d'intérêt pour les étudiants.</w:t>
+        <w:t>Ces instances donnent aux organisations communautaires un forum pour donner leur avis sur les politiques et les initiatives de l'université qui touchent la population locale. Les étudiants sont représentés au CACS, où plusieurs organisations étudiantes et services ont chacun un siège et une voix, et le personnel non académique participe à la gouvernance par des comités consultatifs comme le Chancellor's Staff Advisory Committee (CSAC).</w:t>
       </w:r>
     </w:p>
     <w:p>
       <w:r>
-        <w:t>L'université obtient 8 points STARS sur 8 au crédit EN-5, niveau maximal. L'université a des programmes conçus pour soutenir le service communautaire des employés. L'une des principales initiatives est le Cal Civic Engagement Program, qui encourage les enseignants et le personnel à contribuer à la communauté par le bénévolat et l'engagement civique, conformément à la mission de responsabilité sociale de l'université.</w:t>
+        <w:t>L'université a également mis en place des partenariats avec la communauté, tels que le programme College Corps, partenariat de l'État de Californie financé par California Volunteers, par lequel le Public Service Center a placé des étudiants de premier cycle dans des partenariats de justice climatique ou alimentaire avec des organisations locales.</w:t>
       </w:r>
     </w:p>
     <w:p>
       <w:r>
-        <w:t>L'université obtient 9 points STARS sur 9 au crédit EN-6, niveau maximal. L'université a mis en place le Fonds de partenariats communautaires du chancelier (CCPF), qui emploie une approche structurée pour évaluer et améliorer les partenariats avec la communauté, en garantissant la réciprocité et le bénéfice mutuel.</w:t>
+        <w:t>Enfin, l'université a mis en place des politiques pour protéger les droits des salariés, notamment en matière de traitement équitable, de procédures de réclamation et d'équilibre vie professionnelle/vie personnelle.</w:t>
       </w:r>
     </w:p>
     <w:p>
       <w:r>
-        <w:t>L'université obtient 2,5 points STARS sur 3 au crédit PA-12, niveau élevé. L'université a une section dédiée sur son site web des ressources humaines qui expose les politiques liées aux droits des salariés, notamment le traitement équitable, les procédures de réclamation et l'équilibre vie professionnelle et vie personnelle. Les politiques couvrent des domaines tels que la lutte contre les discriminations, la protection des lanceurs d'alerte et les avantages sociaux.</w:t>
+        <w:t>(GRI 2-29)</w:t>
       </w:r>
     </w:p>
     <w:p>
@@ -2356,7 +2416,7 @@
     </w:p>
     <w:p>
       <w:r>
-        <w:t>Ce rapport ne peut pas établir si l'université a identifié les groupes vulnérables ou si elle a mis en place une méthode d'identification des parties prenantes.</w:t>
+        <w:t>Ce rapport ne peut pas établir les informations sur les fournisseurs de l'université, les groupes vulnérables ou la méthode d'identification des parties prenantes.</w:t>
       </w:r>
     </w:p>
     <w:p>
@@ -3300,49 +3360,211 @@
       </w:r>
     </w:p>
     <w:p>
-      <w:r>
-        <w:t>Le système énergétique du campus repose sur une centrale de cogénération au gaz, construite en 1987, principale source d'électricité et de chauffage des bâtiments ; elle produit de l'électricité et de la vapeur. Une partie de l'électricité vient du programme UC Clean Power, dont la part solaire est déclarée comme électricité renouvelable hors site certifiée (GRI 302-1).</w:t>
-      </w:r>
-    </w:p>
-    <w:p>
-      <w:r>
-        <w:t>Dans le cadre du programme de plafonnement et d'échange (Cap and Trade), l'université de Californie répartit chaque année des crédits de compensation entre ses campus selon leurs émissions ; cette année, les instruments de conformité retirés proviennent de projets forestiers aux États-Unis (GRI 305-1).</w:t>
-      </w:r>
-    </w:p>
-    <w:p>
-      <w:r>
-        <w:t>Le système de récupération d'eau de pluie et la noue végétalisée du Hearst Field Annex ont été créés comme projet de recherche, et Chou Hall, à la Haas School of Business, récupère et réutilise aussi l'eau de pluie (GRI 303-1).</w:t>
-      </w:r>
-    </w:p>
-    <w:p>
-      <w:r>
-        <w:t>Le compostage est intégré à tous les circuits de collecte du campus, avec envoi vers une installation de compostage industriel. La vaisselle réutilisable est en place dans tous les restaurants universitaires et la plupart des points de vente, et l'université travaille à remplacer les plastiques à usage unique et compostables des repas à emporter par de la fibre ou du réutilisable (GRI 306-2).</w:t>
-      </w:r>
-    </w:p>
-    <w:p>
-      <w:r>
-        <w:t>Ses lignes directrices d'achats durables imposent des exigences de durabilité à 100 % des appels d'offres, et l'université évalue les caractéristiques de durabilité de ses fournisseurs avec EcoVadis (GRI 308-1).</w:t>
-      </w:r>
-    </w:p>
-    <w:p>
-      <w:r>
-        <w:t>Plus de 35 % de la flotte du campus est considérée comme verte (OP-13). De nombreux bâtiments respectent la norme LEED-EBOM pour l'exploitation et la maintenance (OP-2). Tout le campus est entretenu sans engrais, fongicides ni pesticides inorganiques, sauf moins de 5 % des terrains (GRI 101-2). Le projet de rapport d'impact environnemental du plan de gestion de la végétation combustible dresse la liste des espèces menacées et vulnérables aux abords du Hill campus (GRI 101-5).</w:t>
-      </w:r>
-    </w:p>
-    <w:p>
       <w:pPr>
-        <w:pStyle w:val="Heading2"/>
+        <w:pStyle w:val="Heading3"/>
       </w:pPr>
       <w:r>
         <w:rPr>
           <w:color w:val="2F6F5E"/>
         </w:rPr>
-        <w:t>Limites et omissions</w:t>
+        <w:t>Énergie</w:t>
       </w:r>
     </w:p>
     <w:p>
       <w:r>
-        <w:t>Ce rapport ne peut pas établir les émissions indirectes liées à l'énergie (GRI 305-2) ni les autres émissions indirectes, dont celles de la chaîne d'approvisionnement (GRI 305-3) : les valeurs détaillées de STARS n'ont pas été extraites.</w:t>
+        <w:t>L'université obtient 6,87 points STARS sur 10 au crédit OP-5, niveau intermédiaire. Une partie de l'électricité du campus provient du programme UC Clean Power : sa part solaire est déclarée comme électricité renouvelable hors site certifiée, et sa part de grande hydraulique comme électricité renouvelable hors site non certifiée.</w:t>
+      </w:r>
+    </w:p>
+    <w:p>
+      <w:pPr>
+        <w:pStyle w:val="Heading3"/>
+      </w:pPr>
+      <w:r>
+        <w:rPr>
+          <w:color w:val="2F6F5E"/>
+        </w:rPr>
+        <w:t>Émissions de gaz à effet de serre</w:t>
+      </w:r>
+    </w:p>
+    <w:p>
+      <w:r>
+        <w:t>L'université obtient 8,01 points STARS sur 16 au crédit OP-6, niveau intermédiaire. Dans le cadre du programme Cap and Trade, des crédits de compensation sont répartis chaque année entre les campus selon leurs émissions ; cette année, les instruments de conformité retirés proviennent de projets forestiers aux États-Unis.</w:t>
+      </w:r>
+    </w:p>
+    <w:p>
+      <w:pPr>
+        <w:pStyle w:val="Heading3"/>
+      </w:pPr>
+      <w:r>
+        <w:rPr>
+          <w:color w:val="2F6F5E"/>
+        </w:rPr>
+        <w:t>Eau</w:t>
+      </w:r>
+    </w:p>
+    <w:p>
+      <w:r>
+        <w:t>L'université obtient 2,43 points STARS sur 7 au crédit OP-3, niveau faible. Le campus a mis en place un système de récupération d'eau de pluie, notamment au sein de la Haas School of Business.</w:t>
+      </w:r>
+    </w:p>
+    <w:p>
+      <w:pPr>
+        <w:pStyle w:val="Heading3"/>
+      </w:pPr>
+      <w:r>
+        <w:rPr>
+          <w:color w:val="2F6F5E"/>
+        </w:rPr>
+        <w:t>Déchets</w:t>
+      </w:r>
+    </w:p>
+    <w:p>
+      <w:r>
+        <w:t>L'université obtient 3,27 points STARS sur 5 au crédit OP-12, niveau intermédiaire.</w:t>
+      </w:r>
+    </w:p>
+    <w:p>
+      <w:pPr>
+        <w:pStyle w:val="Heading3"/>
+      </w:pPr>
+      <w:r>
+        <w:rPr>
+          <w:color w:val="2F6F5E"/>
+        </w:rPr>
+        <w:t>Matériaux</w:t>
+      </w:r>
+    </w:p>
+    <w:p>
+      <w:r>
+        <w:t>L'université obtient 3,75 points STARS sur 4 au crédit OP-11, niveau élevé. Le compostage est intégré à tous les circuits de collecte du campus, et les déchets compostables sont envoyés vers une installation de compostage industriel.</w:t>
+      </w:r>
+    </w:p>
+    <w:p>
+      <w:pPr>
+        <w:pStyle w:val="Heading3"/>
+      </w:pPr>
+      <w:r>
+        <w:rPr>
+          <w:color w:val="2F6F5E"/>
+        </w:rPr>
+        <w:t>Système d'achats durables</w:t>
+      </w:r>
+    </w:p>
+    <w:p>
+      <w:r>
+        <w:t>L'université obtient 7 points STARS sur 7 au crédit OP-9, niveau maximal. Tous les appels d'offres intègrent des critères de durabilité ; l'université évalue ses fournisseurs avec EcoVadis, et ses lignes directrices d'achats durables visent notamment à réduire les émissions et les impacts carbone de la chaîne d'approvisionnement.</w:t>
+      </w:r>
+    </w:p>
+    <w:p>
+      <w:pPr>
+        <w:pStyle w:val="Heading3"/>
+      </w:pPr>
+      <w:r>
+        <w:rPr>
+          <w:color w:val="2F6F5E"/>
+        </w:rPr>
+        <w:t>Conception et construction des bâtiments</w:t>
+      </w:r>
+    </w:p>
+    <w:p>
+      <w:r>
+        <w:t>L'université obtient 2,91 points STARS sur 3 au crédit OP-1, niveau élevé.</w:t>
+      </w:r>
+    </w:p>
+    <w:p>
+      <w:pPr>
+        <w:pStyle w:val="Heading3"/>
+      </w:pPr>
+      <w:r>
+        <w:rPr>
+          <w:color w:val="2F6F5E"/>
+        </w:rPr>
+        <w:t>Exploitation et maintenance des bâtiments</w:t>
+      </w:r>
+    </w:p>
+    <w:p>
+      <w:r>
+        <w:t>L'université obtient 4 points STARS sur 5 au crédit OP-2, niveau élevé. De nombreux bâtiments du campus respectent la norme LEED-EBOM (exploitation et maintenance des bâtiments existants), qui met l'accent sur le nettoyage écologique, les matériaux durables, la qualité de l'air et la réduction des déchets.</w:t>
+      </w:r>
+    </w:p>
+    <w:p>
+      <w:pPr>
+        <w:pStyle w:val="Heading3"/>
+      </w:pPr>
+      <w:r>
+        <w:rPr>
+          <w:color w:val="2F6F5E"/>
+        </w:rPr>
+        <w:t>Flotte de véhicules</w:t>
+      </w:r>
+    </w:p>
+    <w:p>
+      <w:r>
+        <w:t>L'université obtient 0,28 point STARS sur 2 au crédit OP-13, niveau faible. Plus de 35 % de la flotte du campus est considérée comme verte, véhicules à carburant modulable compris ; les voiturettes électriques non immatriculées ne sont pas comptées dans la flotte.</w:t>
+      </w:r>
+    </w:p>
+    <w:p>
+      <w:pPr>
+        <w:pStyle w:val="Heading3"/>
+      </w:pPr>
+      <w:r>
+        <w:rPr>
+          <w:color w:val="2F6F5E"/>
+        </w:rPr>
+        <w:t>Modes de déplacement domicile-campus</w:t>
+      </w:r>
+    </w:p>
+    <w:p>
+      <w:r>
+        <w:t>L'université obtient 4,89 points STARS sur 6 au crédit OP-14, niveau élevé. La répartition des modes de déplacement provient d'une enquête annuelle sur les transports, diffusée par courriel à tout le campus ou à un échantillon représentatif.</w:t>
+      </w:r>
+    </w:p>
+    <w:p>
+      <w:pPr>
+        <w:pStyle w:val="Heading3"/>
+      </w:pPr>
+      <w:r>
+        <w:rPr>
+          <w:color w:val="2F6F5E"/>
+        </w:rPr>
+        <w:t>Voyages en avion</w:t>
+      </w:r>
+    </w:p>
+    <w:p>
+      <w:r>
+        <w:t>L'université obtient 2 points STARS sur 2 au crédit OP-15, niveau maximal. Le campus a mis en place des mesures pour réduire les émissions de gaz à effet de serre liées aux voyages en avion.</w:t>
+      </w:r>
+    </w:p>
+    <w:p>
+      <w:pPr>
+        <w:pStyle w:val="Heading3"/>
+      </w:pPr>
+      <w:r>
+        <w:rPr>
+          <w:color w:val="2F6F5E"/>
+        </w:rPr>
+        <w:t>Gestion écologique des espaces verts</w:t>
+      </w:r>
+    </w:p>
+    <w:p>
+      <w:r>
+        <w:t>L'université obtient 5 points STARS sur 5 au crédit OP-4, niveau maximal. Le campus a mis en place des espaces verts gérés de manière écologique.</w:t>
+      </w:r>
+    </w:p>
+    <w:p>
+      <w:pPr>
+        <w:pStyle w:val="Heading3"/>
+      </w:pPr>
+      <w:r>
+        <w:rPr>
+          <w:color w:val="2F6F5E"/>
+        </w:rPr>
+        <w:t>Évaluation de la biodiversité</w:t>
+      </w:r>
+    </w:p>
+    <w:p>
+      <w:r>
+        <w:t>L'université obtient 1 point STARS sur 1 au crédit IL-24, niveau maximal. Le projet de rapport d'impact environnemental (Draft EIR) du plan de gestion de la végétation combustible des espaces naturels (Wildland Vegetative Fuel Management Plan) décrit les zones importantes pour la biodiversité.</w:t>
       </w:r>
     </w:p>
     <w:p>
@@ -3417,14 +3639,6 @@
         <w:t>Performance sociale et économique</w:t>
       </w:r>
     </w:p>
-    <w:p>
-      <w:r>
-        <w:rPr>
-          <w:i/>
-        </w:rPr>
-        <w:t>Section à relire : le juge automatique n'a pas pu la valider entièrement (voir l'annexe « Validation du rapport »).</w:t>
-      </w:r>
-    </w:p>
     <w:tbl>
       <w:tblPr>
         <w:tblStyle w:val="TableGrid"/>
@@ -3958,24 +4172,43 @@
       </w:r>
     </w:p>
     <w:p>
-      <w:pPr>
-        <w:pStyle w:val="Heading2"/>
-      </w:pPr>
       <w:r>
-        <w:rPr>
-          <w:color w:val="2F6F5E"/>
-        </w:rPr>
-        <w:t>Équité salariale et salaire décent</w:t>
+        <w:t>University of California, Berkeley (UC Berkeley) a obtenu 4,34 points STARS sur 5 au crédit PA-13, niveau élevé, pour sa politique de salaire décent. Le salaire décent de référence est calculé avec le calculateur du Massachusetts Institute of Technology (MIT) ; le seuil horaire retenu pour le personnel tient compte du taux composite des avantages sociaux (CBR), actuellement de 42,8 %.</w:t>
       </w:r>
     </w:p>
     <w:p>
       <w:r>
-        <w:t>L'université obtient 4,34 points STARS sur 5 au crédit PA-13, niveau élevé. Le salaire décent de référence est calculé avec le calculateur du Massachusetts Institute of Technology (MIT) ; le seuil horaire retenu pour le personnel tient compte du taux composite des avantages sociaux, actuellement de 42,8 %. La dernière analyse d'équité salariale, menée en 2023 sur le personnel de carrière et contractuel (PPSM), compare les rémunérations selon l'origine ethnique, l'identité de genre, l'orientation sexuelle, l'âge et le handicap.</w:t>
+        <w:t>L'université a également obtenu 2,5 points STARS sur 3 au crédit PA-12, niveau élevé, pour ses droits des salariés. Les employés doivent remplir les conditions de la politique de congé familial et médical (Family and Medical Leave Policy). Le site web des ressources humaines de l'université présente des politiques sur les droits des employés, notamment le traitement équitable, les procédures de réclamation et l'équilibre travail-vie.</w:t>
       </w:r>
     </w:p>
     <w:p>
       <w:r>
-        <w:t>(GRI 202-1)</w:t>
+        <w:t>L'université a obtenu 3 points STARS sur 3 au crédit PA-11, niveau maximal, pour sa santé, sécurité et bien-être. Le campus propose des ateliers de bien-être (série Mind-Body-Spirit) et applique une politique de campus sans fumée ni tabac, mise à jour par les services de santé universitaires (University Health Services).</w:t>
+      </w:r>
+    </w:p>
+    <w:p>
+      <w:r>
+        <w:t>L'université a obtenu 1,67 point STARS sur 2 au crédit PA-8, niveau élevé, pour la parité femmes-hommes.</w:t>
+      </w:r>
+    </w:p>
+    <w:p>
+      <w:r>
+        <w:t>L'université a obtenu 1,59 point STARS sur 3 au crédit PA-7, niveau intermédiaire, pour la représentation ethnique et raciale.</w:t>
+      </w:r>
+    </w:p>
+    <w:p>
+      <w:r>
+        <w:t>L'université a obtenu 2,5 points STARS sur 3 au crédit PA-9, niveau élevé, pour l'accès et l'accessibilité financière. Les données viennent de l'IPEDS : part des étudiants de premier cycle bénéficiant d'une bourse Pell, pour l'année universitaire débutant en 2021 (la plus récente disponible).</w:t>
+      </w:r>
+    </w:p>
+    <w:p>
+      <w:r>
+        <w:t>L'université a obtenu 3 points STARS sur 3 au crédit PA-6, niveau maximal, pour le climat institutionnel. Les organisations basées sur la race et l'ethnicité des employés comprennent Alianza, Asian Pacific American Systemwide Alliance, Black Staff &amp; Faculty Organization, MENASA et Native &amp; Indigenous Council.</w:t>
+      </w:r>
+    </w:p>
+    <w:p>
+      <w:r>
+        <w:t>L'université a obtenu 2,8 points STARS sur 3 au crédit PA-10, niveau élevé, pour la réussite étudiante.</w:t>
       </w:r>
     </w:p>
     <w:p>
@@ -3986,128 +4219,12 @@
         <w:rPr>
           <w:color w:val="2F6F5E"/>
         </w:rPr>
-        <w:t>Droits des salariés</w:t>
+        <w:t>Limites et omissions</w:t>
       </w:r>
     </w:p>
     <w:p>
       <w:r>
-        <w:t>Le site des ressources humaines de l'université présente les politiques relatives aux droits des salariés : traitement équitable, procédures de réclamation, équilibre entre vie professionnelle et vie personnelle, lutte contre les discriminations, protection des lanceurs d'alerte et avantages sociaux. Pour bénéficier d'un congé familial ou médical, les salariés doivent remplir les conditions de la politique Family and Medical Leave.</w:t>
-      </w:r>
-    </w:p>
-    <w:p>
-      <w:r>
-        <w:t>(GRI 401-2)</w:t>
-      </w:r>
-    </w:p>
-    <w:p>
-      <w:pPr>
-        <w:pStyle w:val="Heading2"/>
-      </w:pPr>
-      <w:r>
-        <w:rPr>
-          <w:color w:val="2F6F5E"/>
-        </w:rPr>
-        <w:t>Santé, sécurité et bien-être</w:t>
-      </w:r>
-    </w:p>
-    <w:p>
-      <w:r>
-        <w:t>L'université propose une série d'ateliers de bien-être (Mind-Body-Spirit Wellness Workshop Series) consacrés à la santé globale : yoga, pleine conscience, écriture et exercices de respiration ; on peut y participer sans suivre toutes les séances.</w:t>
-      </w:r>
-    </w:p>
-    <w:p>
-      <w:r>
-        <w:t>(GRI 403-1)</w:t>
-      </w:r>
-    </w:p>
-    <w:p>
-      <w:pPr>
-        <w:pStyle w:val="Heading2"/>
-      </w:pPr>
-      <w:r>
-        <w:rPr>
-          <w:color w:val="2F6F5E"/>
-        </w:rPr>
-        <w:t>Parité femmes-hommes</w:t>
-      </w:r>
-    </w:p>
-    <w:p>
-      <w:r>
-        <w:t>Parmi les programmes de soutien aux femmes figurent le Gender Equity Resource Center (GenEq), le programme Empowering Womxn in STEAM (WiSE) et le programme de mentorat AWE.</w:t>
-      </w:r>
-    </w:p>
-    <w:p>
-      <w:r>
-        <w:t>(GRI 405-1)</w:t>
-      </w:r>
-    </w:p>
-    <w:p>
-      <w:pPr>
-        <w:pStyle w:val="Heading2"/>
-      </w:pPr>
-      <w:r>
-        <w:rPr>
-          <w:color w:val="2F6F5E"/>
-        </w:rPr>
-        <w:t>Représentation ethnique et raciale</w:t>
-      </w:r>
-    </w:p>
-    <w:p>
-      <w:r>
-        <w:t>La représentation est comparée à la population de l'État de Californie, d'après les données du US Census Bureau (County Population by Characteristics, 2023) ; les données sont produites par l'équipe Equity Data Initiatives du service Equity &amp; Inclusion.</w:t>
-      </w:r>
-    </w:p>
-    <w:p>
-      <w:r>
-        <w:t>(GRI 405-1)</w:t>
-      </w:r>
-    </w:p>
-    <w:p>
-      <w:pPr>
-        <w:pStyle w:val="Heading2"/>
-      </w:pPr>
-      <w:r>
-        <w:rPr>
-          <w:color w:val="2F6F5E"/>
-        </w:rPr>
-        <w:t>Accessibilité financière et accès</w:t>
-      </w:r>
-    </w:p>
-    <w:p>
-      <w:r>
-        <w:t>Le crédit s'appuie notamment sur la part des étudiants de premier cycle bénéficiant d'une bourse fédérale Pell, d'après l'IPEDS, pour l'année universitaire commençant en 2021 (la plus récente disponible).</w:t>
-      </w:r>
-    </w:p>
-    <w:p>
-      <w:pPr>
-        <w:pStyle w:val="Heading2"/>
-      </w:pPr>
-      <w:r>
-        <w:rPr>
-          <w:color w:val="2F6F5E"/>
-        </w:rPr>
-        <w:t>Climat institutionnel (inclusion)</w:t>
-      </w:r>
-    </w:p>
-    <w:p>
-      <w:r>
-        <w:t>Le personnel peut rejoindre des organisations fondées sur l'origine ethnique, comme Alianza, Asian Pacific American Systemwide Alliance, Black Staff &amp; Faculty Organization, MENASA et Native &amp; Indigenous Council.</w:t>
-      </w:r>
-    </w:p>
-    <w:p>
-      <w:pPr>
-        <w:pStyle w:val="Heading2"/>
-      </w:pPr>
-      <w:r>
-        <w:rPr>
-          <w:color w:val="2F6F5E"/>
-        </w:rPr>
-        <w:t>Réussite étudiante</w:t>
-      </w:r>
-    </w:p>
-    <w:p>
-      <w:r>
-        <w:t>Ce rapport ne peut pas établir les actions de l'université pour la réussite étudiante : les extraits STARS de ce crédit ne donnent que la source des données (Office of Planning and Analysis).</w:t>
+        <w:t>Ce rapport ne peut pas établir le ratio entre le salaire d'entrée et le salaire minimum local par genre. Le salaire minimum figure dans un crédit sur l'emploi étudiant.</w:t>
       </w:r>
     </w:p>
     <w:p>
@@ -4836,146 +4953,58 @@
     </w:p>
     <w:p>
       <w:pPr>
-        <w:pStyle w:val="Heading3"/>
+        <w:pStyle w:val="Heading2"/>
       </w:pPr>
       <w:r>
         <w:rPr>
           <w:color w:val="2F6F5E"/>
         </w:rPr>
-        <w:t>Offre de cours en durabilité</w:t>
+        <w:t>Enseignement, recherche et engagement</w:t>
       </w:r>
     </w:p>
     <w:p>
       <w:r>
-        <w:t>L'offre de cours en durabilité a été recensée à partir de l'inventaire des cours de 2021 à 2024 : le bureau Planning &amp; Analysis a recherché les mots-clés de durabilité de l'AASHE dans les descriptions du catalogue, puis des étudiants du Bureau de la durabilité ont classé les cours comme axés sur la durabilité ou liés à la durabilité.</w:t>
-      </w:r>
-    </w:p>
-    <w:p>
-      <w:pPr>
-        <w:pStyle w:val="Heading3"/>
-      </w:pPr>
-      <w:r>
-        <w:rPr>
-          <w:color w:val="2F6F5E"/>
-        </w:rPr>
-        <w:t>Programmes de premier cycle</w:t>
+        <w:t>L'université obtient 13,01 points STARS sur 14 au crédit AC-1, niveau élevé. L'information pour les offres de cours en durabilité a été collectée via un inventaire des cours de University of California, Berkeley (UC Berkeley) de 2021 à 2024, en filtrant les éléments qui se qualifient comme des cours axés sur la durabilité ou liés à la durabilité. Les cours qui se qualifient ont été comptabilisés comme des offres de cours en durabilité.</w:t>
       </w:r>
     </w:p>
     <w:p>
       <w:r>
-        <w:t>Les diplômes de premier cycle axés sur la durabilité, et ceux qui exigent au moins un cours axé sur la durabilité, sont listés dans le document joint au rapport STARS.</w:t>
-      </w:r>
-    </w:p>
-    <w:p>
-      <w:pPr>
-        <w:pStyle w:val="Heading3"/>
-      </w:pPr>
-      <w:r>
-        <w:rPr>
-          <w:color w:val="2F6F5E"/>
-        </w:rPr>
-        <w:t>Programmes de cycles supérieurs</w:t>
+        <w:t>L'université obtient 10,22 points STARS sur 15 au crédit AC-2, niveau intermédiaire. Une partie des programmes de premier cycle comporte l'obligation de suivre au moins un cours axé sur la durabilité (liste fournie dans le rapport STARS).</w:t>
       </w:r>
     </w:p>
     <w:p>
       <w:r>
-        <w:t>Les programmes de cycles supérieurs axés sur la durabilité, et ceux qui comportent un apprentissage axé sur la durabilité, sont aussi listés dans ce document.</w:t>
-      </w:r>
-    </w:p>
-    <w:p>
-      <w:pPr>
-        <w:pStyle w:val="Heading3"/>
-      </w:pPr>
-      <w:r>
-        <w:rPr>
-          <w:color w:val="2F6F5E"/>
-        </w:rPr>
-        <w:t>Recherche en durabilité</w:t>
+        <w:t>L'université obtient 8 points STARS sur 8 au crédit AC-3, niveau maximal. Une partie des programmes de cycles supérieurs comporte un apprentissage axé sur la durabilité (liste fournie dans le rapport STARS).</w:t>
       </w:r>
     </w:p>
     <w:p>
       <w:r>
-        <w:t>L'université soutient la recherche interdisciplinaire en durabilité par des partenariats, notamment avec le Lawrence Berkeley National Laboratory ; le Berkeley Climate Change Network, par exemple, met en relation chercheurs et étudiants avec des financements et des collaborations sur la durabilité et la résilience. La recherche en durabilité a été repérée par mots-clés dans l'inventaire de la recherche des exercices 2022 à 2024, puis vérifiée par un étudiant du Bureau de la durabilité.</w:t>
-      </w:r>
-    </w:p>
-    <w:p>
-      <w:pPr>
-        <w:pStyle w:val="Heading3"/>
-      </w:pPr>
-      <w:r>
-        <w:rPr>
-          <w:color w:val="2F6F5E"/>
-        </w:rPr>
-        <w:t>Centre de recherche en durabilité</w:t>
+        <w:t>L'université obtient 7,35 points STARS sur 10 au crédit AC-6, niveau intermédiaire. Un étudiant de premier cycle a créé une liste de mots-clés pour identifier la recherche en durabilité. L'étudiant a ensuite calculé le nombre d'employés engagés dans la recherche en durabilité et le nombre de départements universitaires engagés dans la recherche en durabilité.</w:t>
       </w:r>
     </w:p>
     <w:p>
       <w:r>
-        <w:t>Outre le Berkeley Climate Change Network et le centre de recherche CITRUS, plusieurs centres travaillent sur la durabilité, comme le Sutardja Center for Entrepreneurship and Technology, qui abrite l'Alternative Meats X Lab.</w:t>
-      </w:r>
-    </w:p>
-    <w:p>
-      <w:pPr>
-        <w:pStyle w:val="Heading3"/>
-      </w:pPr>
-      <w:r>
-        <w:rPr>
-          <w:color w:val="2F6F5E"/>
-        </w:rPr>
-        <w:t>Communication et sensibilisation</w:t>
+        <w:t>L'université obtient 6 points STARS sur 6 au crédit AC-7, niveau maximal. UC Berkeley compte plusieurs centres engagés dans des sujets liés à la durabilité, notamment le Sutardja Center for Entrepreneurship and Technology qui abrite le Alternative Meats X Lab.</w:t>
       </w:r>
     </w:p>
     <w:p>
       <w:r>
-        <w:t>Le campus a mené plusieurs campagnes de sensibilisation à la durabilité ces dernières années, sur la protection de l'environnement et la justice sociale, notamment par des lettres d'information et des invitations envoyées sur les listes de diffusion de tout le campus.</w:t>
-      </w:r>
-    </w:p>
-    <w:p>
-      <w:pPr>
-        <w:pStyle w:val="Heading3"/>
-      </w:pPr>
-      <w:r>
-        <w:rPr>
-          <w:color w:val="2F6F5E"/>
-        </w:rPr>
-        <w:t>Activités parascolaires</w:t>
+        <w:t>L'université obtient 5 points STARS sur 5 au crédit EN-1, niveau maximal. Les nouveaux étudiants rencontrent les services liés à la durabilité lors de l'orientation (Golden Bear Orientation), le nouveau personnel reçoit une présentation lors de son accueil, et le campus publie des tableaux de bord (émissions, énergie, eau) et des rapports de durabilité.</w:t>
       </w:r>
     </w:p>
     <w:p>
       <w:r>
-        <w:t>Le Student Environmental Resource Center (SERC), service du campus consacré aux activités co-curriculaires des étudiants intéressés par l'environnement, organise chaque semestre de nombreux événements, dont la Climate Justice Week et l'Earth Week, ainsi que le SERC Membership program et le Student Leadership Institute for Climate Resilience.</w:t>
-      </w:r>
-    </w:p>
-    <w:p>
-      <w:pPr>
-        <w:pStyle w:val="Heading3"/>
-      </w:pPr>
-      <w:r>
-        <w:rPr>
-          <w:color w:val="2F6F5E"/>
-        </w:rPr>
-        <w:t>Engagement et formation du personnel</w:t>
+        <w:t>L'université obtient 9 points STARS sur 9 au crédit EN-2, niveau maximal. Le centre étudiant de ressources environnementales (SERC) de UC Berkeley organise de nombreux événements axés sur la durabilité sur le campus, notamment la semaine de la justice climatique et la semaine de la Terre, une série de carrières environnementales, des formations à la justice environnementale et des événements d'éducation en plein air.</w:t>
       </w:r>
     </w:p>
     <w:p>
       <w:r>
-        <w:t>Le Bureau de la durabilité a créé une formation à la durabilité pour le personnel (UC Berkeley Sustainability Staff Training), composée de modules que chacun suit à son rythme.</w:t>
-      </w:r>
-    </w:p>
-    <w:p>
-      <w:pPr>
-        <w:pStyle w:val="Heading3"/>
-      </w:pPr>
-      <w:r>
-        <w:rPr>
-          <w:color w:val="2F6F5E"/>
-        </w:rPr>
-        <w:t>Engagement civique</w:t>
+        <w:t>L'université obtient 8 points STARS sur 8 au crédit EN-3, niveau maximal. Le Bureau de la durabilité a créé une formation à la durabilité pour le personnel (UC Berkeley Sustainability Staff Training), composée de modules que chacun suit à son rythme.</w:t>
       </w:r>
     </w:p>
     <w:p>
       <w:r>
-        <w:t>Le Public Service Center réunit étudiants, enseignants et communautés au service de la justice sociale et de l'engagement civique, et le Cal Civic Engagement Program encourage les enseignants et le personnel à s'engager par le bénévolat.</w:t>
+        <w:t>L'université obtient 8 points STARS sur 8 au crédit EN-5, niveau maximal.</w:t>
       </w:r>
     </w:p>
     <w:p>
@@ -18026,7 +18055,7 @@
               <w:rPr>
                 <w:sz w:val="17"/>
               </w:rPr>
-              <w:t>0%</w:t>
+              <w:t>83%</w:t>
             </w:r>
           </w:p>
         </w:tc>
@@ -18062,7 +18091,7 @@
               <w:rPr>
                 <w:sz w:val="17"/>
               </w:rPr>
-              <w:t>7.5 min</w:t>
+              <w:t>9.0 min</w:t>
             </w:r>
           </w:p>
         </w:tc>
@@ -18172,7 +18201,7 @@
               <w:rPr>
                 <w:sz w:val="17"/>
               </w:rPr>
-              <w:t>83%</w:t>
+              <w:t>100%</w:t>
             </w:r>
           </w:p>
         </w:tc>
@@ -18226,7 +18255,7 @@
               <w:rPr>
                 <w:sz w:val="17"/>
               </w:rPr>
-              <w:t>5.4 min</w:t>
+              <w:t>9.1 min</w:t>
             </w:r>
           </w:p>
         </w:tc>
@@ -18282,6 +18311,24 @@
               <w:rPr>
                 <w:sz w:val="17"/>
               </w:rPr>
+              <w:t>2</w:t>
+            </w:r>
+          </w:p>
+        </w:tc>
+        <w:tc>
+          <w:tcPr>
+            <w:tcW w:type="dxa" w:w="960"/>
+          </w:tcPr>
+          <w:p>
+            <w:r>
+              <w:rPr>
+                <w:sz w:val="17"/>
+              </w:rPr>
+            </w:r>
+            <w:r>
+              <w:rPr>
+                <w:sz w:val="17"/>
+              </w:rPr>
               <w:t>1</w:t>
             </w:r>
           </w:p>
@@ -18300,7 +18347,7 @@
               <w:rPr>
                 <w:sz w:val="17"/>
               </w:rPr>
-              <w:t>0</w:t>
+              <w:t>4/5</w:t>
             </w:r>
           </w:p>
         </w:tc>
@@ -18318,7 +18365,7 @@
               <w:rPr>
                 <w:sz w:val="17"/>
               </w:rPr>
-              <w:t>4/5</w:t>
+              <w:t>100%</w:t>
             </w:r>
           </w:p>
         </w:tc>
@@ -18336,7 +18383,7 @@
               <w:rPr>
                 <w:sz w:val="17"/>
               </w:rPr>
-              <w:t>100%</w:t>
+              <w:t>0%</w:t>
             </w:r>
           </w:p>
         </w:tc>
@@ -18354,7 +18401,7 @@
               <w:rPr>
                 <w:sz w:val="17"/>
               </w:rPr>
-              <w:t>100%</w:t>
+              <w:t>3 sur 13</w:t>
             </w:r>
           </w:p>
         </w:tc>
@@ -18372,25 +18419,7 @@
               <w:rPr>
                 <w:sz w:val="17"/>
               </w:rPr>
-              <w:t>3 sur 13</w:t>
-            </w:r>
-          </w:p>
-        </w:tc>
-        <w:tc>
-          <w:tcPr>
-            <w:tcW w:type="dxa" w:w="960"/>
-          </w:tcPr>
-          <w:p>
-            <w:r>
-              <w:rPr>
-                <w:sz w:val="17"/>
-              </w:rPr>
-            </w:r>
-            <w:r>
-              <w:rPr>
-                <w:sz w:val="17"/>
-              </w:rPr>
-              <w:t>8.4 min</w:t>
+              <w:t>12.3 min</w:t>
             </w:r>
           </w:p>
         </w:tc>
@@ -18482,7 +18511,7 @@
               <w:rPr>
                 <w:sz w:val="17"/>
               </w:rPr>
-              <w:t>4/5</w:t>
+              <w:t>3/5</w:t>
             </w:r>
           </w:p>
         </w:tc>
@@ -18518,7 +18547,7 @@
               <w:rPr>
                 <w:sz w:val="17"/>
               </w:rPr>
-              <w:t>100%</w:t>
+              <w:t>50%</w:t>
             </w:r>
           </w:p>
         </w:tc>
@@ -18554,7 +18583,7 @@
               <w:rPr>
                 <w:sz w:val="17"/>
               </w:rPr>
-              <w:t>11.6 min</w:t>
+              <w:t>12.2 min</w:t>
             </w:r>
           </w:p>
         </w:tc>
@@ -18664,7 +18693,7 @@
               <w:rPr>
                 <w:sz w:val="17"/>
               </w:rPr>
-              <w:t>83%</w:t>
+              <w:t>100%</w:t>
             </w:r>
           </w:p>
         </w:tc>
@@ -18682,7 +18711,7 @@
               <w:rPr>
                 <w:sz w:val="17"/>
               </w:rPr>
-              <w:t>0%</w:t>
+              <w:t>100%</w:t>
             </w:r>
           </w:p>
         </w:tc>
@@ -18718,7 +18747,7 @@
               <w:rPr>
                 <w:sz w:val="17"/>
               </w:rPr>
-              <w:t>8.8 min</w:t>
+              <w:t>6.8 min</w:t>
             </w:r>
           </w:p>
         </w:tc>
@@ -18774,6 +18803,24 @@
               <w:rPr>
                 <w:sz w:val="17"/>
               </w:rPr>
+              <w:t>2</w:t>
+            </w:r>
+          </w:p>
+        </w:tc>
+        <w:tc>
+          <w:tcPr>
+            <w:tcW w:type="dxa" w:w="960"/>
+          </w:tcPr>
+          <w:p>
+            <w:r>
+              <w:rPr>
+                <w:sz w:val="17"/>
+              </w:rPr>
+            </w:r>
+            <w:r>
+              <w:rPr>
+                <w:sz w:val="17"/>
+              </w:rPr>
               <w:t>1</w:t>
             </w:r>
           </w:p>
@@ -18792,7 +18839,7 @@
               <w:rPr>
                 <w:sz w:val="17"/>
               </w:rPr>
-              <w:t>0</w:t>
+              <w:t>4/5</w:t>
             </w:r>
           </w:p>
         </w:tc>
@@ -18810,7 +18857,7 @@
               <w:rPr>
                 <w:sz w:val="17"/>
               </w:rPr>
-              <w:t>4/5</w:t>
+              <w:t>83%</w:t>
             </w:r>
           </w:p>
         </w:tc>
@@ -18828,7 +18875,7 @@
               <w:rPr>
                 <w:sz w:val="17"/>
               </w:rPr>
-              <w:t>100%</w:t>
+              <w:t>0%</w:t>
             </w:r>
           </w:p>
         </w:tc>
@@ -18846,7 +18893,7 @@
               <w:rPr>
                 <w:sz w:val="17"/>
               </w:rPr>
-              <w:t>100%</w:t>
+              <w:t>6 sur 35</w:t>
             </w:r>
           </w:p>
         </w:tc>
@@ -18864,25 +18911,7 @@
               <w:rPr>
                 <w:sz w:val="17"/>
               </w:rPr>
-              <w:t>6 sur 35</w:t>
-            </w:r>
-          </w:p>
-        </w:tc>
-        <w:tc>
-          <w:tcPr>
-            <w:tcW w:type="dxa" w:w="960"/>
-          </w:tcPr>
-          <w:p>
-            <w:r>
-              <w:rPr>
-                <w:sz w:val="17"/>
-              </w:rPr>
-            </w:r>
-            <w:r>
-              <w:rPr>
-                <w:sz w:val="17"/>
-              </w:rPr>
-              <w:t>17.5 min</w:t>
+              <w:t>21.2 min</w:t>
             </w:r>
           </w:p>
         </w:tc>
@@ -18920,7 +18949,7 @@
               <w:rPr>
                 <w:sz w:val="17"/>
               </w:rPr>
-              <w:t>à relire</w:t>
+              <w:t>validée</w:t>
             </w:r>
           </w:p>
         </w:tc>
@@ -18938,7 +18967,7 @@
               <w:rPr>
                 <w:sz w:val="17"/>
               </w:rPr>
-              <w:t>2</w:t>
+              <w:t>1</w:t>
             </w:r>
           </w:p>
         </w:tc>
@@ -18956,7 +18985,7 @@
               <w:rPr>
                 <w:sz w:val="17"/>
               </w:rPr>
-              <w:t>1</w:t>
+              <w:t>0</w:t>
             </w:r>
           </w:p>
         </w:tc>
@@ -18974,7 +19003,7 @@
               <w:rPr>
                 <w:sz w:val="17"/>
               </w:rPr>
-              <w:t>2/5</w:t>
+              <w:t>4/5</w:t>
             </w:r>
           </w:p>
         </w:tc>
@@ -18992,7 +19021,7 @@
               <w:rPr>
                 <w:sz w:val="17"/>
               </w:rPr>
-              <w:t>67%</w:t>
+              <w:t>83%</w:t>
             </w:r>
           </w:p>
         </w:tc>
@@ -19010,7 +19039,7 @@
               <w:rPr>
                 <w:sz w:val="17"/>
               </w:rPr>
-              <w:t>88%</w:t>
+              <w:t>0%</w:t>
             </w:r>
           </w:p>
         </w:tc>
@@ -19046,7 +19075,7 @@
               <w:rPr>
                 <w:sz w:val="17"/>
               </w:rPr>
-              <w:t>16.4 min</w:t>
+              <w:t>12.9 min</w:t>
             </w:r>
           </w:p>
         </w:tc>
@@ -19102,6 +19131,24 @@
               <w:rPr>
                 <w:sz w:val="17"/>
               </w:rPr>
+              <w:t>2</w:t>
+            </w:r>
+          </w:p>
+        </w:tc>
+        <w:tc>
+          <w:tcPr>
+            <w:tcW w:type="dxa" w:w="960"/>
+          </w:tcPr>
+          <w:p>
+            <w:r>
+              <w:rPr>
+                <w:sz w:val="17"/>
+              </w:rPr>
+            </w:r>
+            <w:r>
+              <w:rPr>
+                <w:sz w:val="17"/>
+              </w:rPr>
               <w:t>1</w:t>
             </w:r>
           </w:p>
@@ -19120,7 +19167,7 @@
               <w:rPr>
                 <w:sz w:val="17"/>
               </w:rPr>
-              <w:t>0</w:t>
+              <w:t>4/5</w:t>
             </w:r>
           </w:p>
         </w:tc>
@@ -19138,7 +19185,7 @@
               <w:rPr>
                 <w:sz w:val="17"/>
               </w:rPr>
-              <w:t>4/5</w:t>
+              <w:t>83%</w:t>
             </w:r>
           </w:p>
         </w:tc>
@@ -19156,7 +19203,7 @@
               <w:rPr>
                 <w:sz w:val="17"/>
               </w:rPr>
-              <w:t>100%</w:t>
+              <w:t>—</w:t>
             </w:r>
           </w:p>
         </w:tc>
@@ -19192,25 +19239,7 @@
               <w:rPr>
                 <w:sz w:val="17"/>
               </w:rPr>
-              <w:t>—</w:t>
-            </w:r>
-          </w:p>
-        </w:tc>
-        <w:tc>
-          <w:tcPr>
-            <w:tcW w:type="dxa" w:w="960"/>
-          </w:tcPr>
-          <w:p>
-            <w:r>
-              <w:rPr>
-                <w:sz w:val="17"/>
-              </w:rPr>
-            </w:r>
-            <w:r>
-              <w:rPr>
-                <w:sz w:val="17"/>
-              </w:rPr>
-              <w:t>13.7 min</w:t>
+              <w:t>15.6 min</w:t>
             </w:r>
           </w:p>
         </w:tc>
@@ -19233,12 +19262,12 @@
         <w:t>Bilan :</w:t>
       </w:r>
       <w:r>
-        <w:t xml:space="preserve"> 7 section(s) validée(s) sur 8 ; fidélité moyenne 92% ; 1 version(s) rejetée(s) par le garde-fou avant le juge. Aucun nombre du texte final n'a été écrit par le modèle.</w:t>
+        <w:t xml:space="preserve"> 8 section(s) validée(s) sur 8 ; fidélité moyenne 94% ; 3 version(s) rejetée(s) par le garde-fou avant le juge. Aucun nombre du texte final n'a été écrit par le modèle.</w:t>
       </w:r>
     </w:p>
     <w:p>
       <w:r>
-        <w:t>4 violation(s) signalée(s) par le juge ont été écartées car contredites par le contrôle déterministe (par exemple une « revendication de conformité GRI » absente du texte) : le juge 8B se trompe parfois, le code tranche sur ce qu'il sait vérifier.</w:t>
+        <w:t>2 violation(s) signalée(s) par le juge ont été écartées car contredites par le contrôle déterministe (par exemple une « revendication de conformité GRI » absente du texte) : le juge 8B se trompe parfois, le code tranche sur ce qu'il sait vérifier.</w:t>
       </w:r>
     </w:p>
     <w:p>
@@ -19249,7 +19278,7 @@
         <w:t>Relecture hors pipeline</w:t>
       </w:r>
       <w:r>
-        <w:t xml:space="preserve"> (6 octobre 2026) : 34 correction(s) dans 8 section(s). Phrases supprimées ou reformulées à partir des textes STARS uniquement, sans chiffre tapé à la main. Les corrections ont été proposées par l'assistant Claude Code (IA) à la demande de Wiem Ben Hassine, chacune avec sa source STARS ; elles deviennent une relecture humaine une fois validées par elle. Liste détaillée : </w:t>
+        <w:t xml:space="preserve"> (6 octobre 2026) : 35 correction(s) dans 8 section(s). Phrases supprimées ou reformulées à partir des textes STARS uniquement, sans chiffre tapé à la main. Les corrections ont été proposées par l'assistant Claude Code (IA) à la demande de Wiem Ben Hassine, chacune avec sa source STARS ; elles deviennent une relecture humaine une fois validées par elle. Liste détaillée : </w:t>
       </w:r>
       <w:r>
         <w:rPr>
@@ -19277,45 +19306,6 @@
       </w:r>
       <w:r>
         <w:t>.</w:t>
-      </w:r>
-    </w:p>
-    <w:p>
-      <w:r>
-        <w:rPr>
-          <w:b/>
-        </w:rPr>
-        <w:t>À relire par un humain</w:t>
-      </w:r>
-      <w:r>
-        <w:t xml:space="preserve"> — affirmations que le juge n'a pas trouvées dans les sources :</w:t>
-      </w:r>
-    </w:p>
-    <w:p>
-      <w:pPr>
-        <w:pStyle w:val="ListBullet"/>
-      </w:pPr>
-      <w:r>
-        <w:rPr>
-          <w:i/>
-        </w:rPr>
-        <w:t>Performance sociale et économique</w:t>
-      </w:r>
-      <w:r>
-        <w:t xml:space="preserve"> : « Le salaire minimum local est utilisé pour calculer le salaire décent. »</w:t>
-      </w:r>
-    </w:p>
-    <w:p>
-      <w:pPr>
-        <w:pStyle w:val="ListBullet"/>
-      </w:pPr>
-      <w:r>
-        <w:rPr>
-          <w:i/>
-        </w:rPr>
-        <w:t>Performance sociale et économique</w:t>
-      </w:r>
-      <w:r>
-        <w:t xml:space="preserve"> : « L'université a mis en place des politiques pour protéger les droits des salariés, notamment la lutte contre la discrimination, la protection »</w:t>
       </w:r>
     </w:p>
     <w:p>

</xml_diff>